<commit_message>
fix(paper): render LaTeX math expressions as native Word subscripts and italics instead of raw text
</commit_message>
<xml_diff>
--- a/experiment/papers/paper.docx
+++ b/experiment/papers/paper.docx
@@ -142,9 +142,7 @@
       </w:r>
       <w:r>
         <w:rPr>
-          <w:rFonts w:ascii="Cambria Math" w:hAnsi="Cambria Math"/>
-          <w:i/>
-          <w:color w:val="1A1A1A"/>
+          <w:rFonts w:ascii="Times New Roman" w:hAnsi="Times New Roman"/>
           <w:sz w:val="22"/>
         </w:rPr>
         <w:t>C=1</w:t>
@@ -161,9 +159,7 @@
       </w:r>
       <w:r>
         <w:rPr>
-          <w:rFonts w:ascii="Cambria Math" w:hAnsi="Cambria Math"/>
-          <w:i/>
-          <w:color w:val="1A1A1A"/>
+          <w:rFonts w:ascii="Times New Roman" w:hAnsi="Times New Roman"/>
           <w:sz w:val="22"/>
         </w:rPr>
         <w:t>20</w:t>
@@ -180,9 +176,7 @@
       </w:r>
       <w:r>
         <w:rPr>
-          <w:rFonts w:ascii="Cambria Math" w:hAnsi="Cambria Math"/>
-          <w:i/>
-          <w:color w:val="1A1A1A"/>
+          <w:rFonts w:ascii="Times New Roman" w:hAnsi="Times New Roman"/>
           <w:sz w:val="22"/>
         </w:rPr>
         <w:t>C=1</w:t>
@@ -199,9 +193,7 @@
       </w:r>
       <w:r>
         <w:rPr>
-          <w:rFonts w:ascii="Cambria Math" w:hAnsi="Cambria Math"/>
-          <w:i/>
-          <w:color w:val="1A1A1A"/>
+          <w:rFonts w:ascii="Times New Roman" w:hAnsi="Times New Roman"/>
           <w:sz w:val="22"/>
         </w:rPr>
         <w:t>C=20</w:t>
@@ -218,12 +210,17 @@
       </w:r>
       <w:r>
         <w:rPr>
-          <w:rFonts w:ascii="Cambria Math" w:hAnsi="Cambria Math"/>
-          <w:i/>
-          <w:color w:val="1A1A1A"/>
-          <w:sz w:val="22"/>
-        </w:rPr>
-        <w:t>\le 3.56\text{ s}</w:t>
+          <w:rFonts w:ascii="Times New Roman" w:hAnsi="Times New Roman"/>
+          <w:sz w:val="22"/>
+        </w:rPr>
+        <w:t>≤ 3.56</w:t>
+      </w:r>
+      <w:r>
+        <w:rPr>
+          <w:rFonts w:ascii="Times New Roman" w:hAnsi="Times New Roman"/>
+          <w:sz w:val="22"/>
+        </w:rPr>
+        <w:t xml:space="preserve"> s</w:t>
       </w:r>
       <w:r>
         <w:rPr>
@@ -237,12 +234,10 @@
       </w:r>
       <w:r>
         <w:rPr>
-          <w:rFonts w:ascii="Cambria Math" w:hAnsi="Cambria Math"/>
-          <w:i/>
-          <w:color w:val="1A1A1A"/>
-          <w:sz w:val="22"/>
-        </w:rPr>
-        <w:t>C \le 5</w:t>
+          <w:rFonts w:ascii="Times New Roman" w:hAnsi="Times New Roman"/>
+          <w:sz w:val="22"/>
+        </w:rPr>
+        <w:t>C ≤ 5</w:t>
       </w:r>
       <w:r>
         <w:rPr>
@@ -924,12 +919,19 @@
       </w:r>
       <w:r>
         <w:rPr>
-          <w:rFonts w:ascii="Cambria Math" w:hAnsi="Cambria Math"/>
+          <w:rFonts w:ascii="Times New Roman" w:hAnsi="Times New Roman"/>
           <w:i/>
-          <w:color w:val="1A1A1A"/>
-          <w:sz w:val="22"/>
-        </w:rPr>
-        <w:t>d_i</w:t>
+          <w:sz w:val="22"/>
+        </w:rPr>
+        <w:t>d</w:t>
+      </w:r>
+      <w:r>
+        <w:rPr>
+          <w:rFonts w:ascii="Times New Roman" w:hAnsi="Times New Roman"/>
+          <w:sz w:val="22"/>
+          <w:vertAlign w:val="subscript"/>
+        </w:rPr>
+        <w:t>i</w:t>
       </w:r>
       <w:r>
         <w:rPr>
@@ -943,12 +945,19 @@
       </w:r>
       <w:r>
         <w:rPr>
-          <w:rFonts w:ascii="Cambria Math" w:hAnsi="Cambria Math"/>
+          <w:rFonts w:ascii="Times New Roman" w:hAnsi="Times New Roman"/>
           <w:i/>
-          <w:color w:val="1A1A1A"/>
-          <w:sz w:val="22"/>
-        </w:rPr>
-        <w:t>h_i</w:t>
+          <w:sz w:val="22"/>
+        </w:rPr>
+        <w:t>h</w:t>
+      </w:r>
+      <w:r>
+        <w:rPr>
+          <w:rFonts w:ascii="Times New Roman" w:hAnsi="Times New Roman"/>
+          <w:sz w:val="22"/>
+          <w:vertAlign w:val="subscript"/>
+        </w:rPr>
+        <w:t>i</w:t>
       </w:r>
       <w:r>
         <w:rPr>
@@ -992,12 +1001,157 @@
       </w:r>
       <w:r>
         <w:rPr>
-          <w:rFonts w:ascii="Cambria Math" w:hAnsi="Cambria Math"/>
+          <w:rFonts w:ascii="Times New Roman" w:hAnsi="Times New Roman"/>
           <w:i/>
-          <w:color w:val="1A1A1A"/>
-          <w:sz w:val="22"/>
-        </w:rPr>
-        <w:t>T_{KB} = T_{extract} + T_{chunk} + T_{hash} + T_{lookup} + T_{embed}(changed) + T_{index}</w:t>
+          <w:sz w:val="22"/>
+        </w:rPr>
+        <w:t>T</w:t>
+      </w:r>
+      <w:r>
+        <w:rPr>
+          <w:rFonts w:ascii="Times New Roman" w:hAnsi="Times New Roman"/>
+          <w:sz w:val="22"/>
+          <w:vertAlign w:val="subscript"/>
+        </w:rPr>
+        <w:t>KB</w:t>
+      </w:r>
+      <w:r>
+        <w:rPr>
+          <w:rFonts w:ascii="Times New Roman" w:hAnsi="Times New Roman"/>
+          <w:sz w:val="22"/>
+        </w:rPr>
+        <w:t xml:space="preserve"> = </w:t>
+      </w:r>
+      <w:r>
+        <w:rPr>
+          <w:rFonts w:ascii="Times New Roman" w:hAnsi="Times New Roman"/>
+          <w:i/>
+          <w:sz w:val="22"/>
+        </w:rPr>
+        <w:t>T</w:t>
+      </w:r>
+      <w:r>
+        <w:rPr>
+          <w:rFonts w:ascii="Times New Roman" w:hAnsi="Times New Roman"/>
+          <w:sz w:val="22"/>
+          <w:vertAlign w:val="subscript"/>
+        </w:rPr>
+        <w:t>extract</w:t>
+      </w:r>
+      <w:r>
+        <w:rPr>
+          <w:rFonts w:ascii="Times New Roman" w:hAnsi="Times New Roman"/>
+          <w:sz w:val="22"/>
+        </w:rPr>
+        <w:t xml:space="preserve"> + </w:t>
+      </w:r>
+      <w:r>
+        <w:rPr>
+          <w:rFonts w:ascii="Times New Roman" w:hAnsi="Times New Roman"/>
+          <w:i/>
+          <w:sz w:val="22"/>
+        </w:rPr>
+        <w:t>T</w:t>
+      </w:r>
+      <w:r>
+        <w:rPr>
+          <w:rFonts w:ascii="Times New Roman" w:hAnsi="Times New Roman"/>
+          <w:sz w:val="22"/>
+          <w:vertAlign w:val="subscript"/>
+        </w:rPr>
+        <w:t>chunk</w:t>
+      </w:r>
+      <w:r>
+        <w:rPr>
+          <w:rFonts w:ascii="Times New Roman" w:hAnsi="Times New Roman"/>
+          <w:sz w:val="22"/>
+        </w:rPr>
+        <w:t xml:space="preserve"> + </w:t>
+      </w:r>
+      <w:r>
+        <w:rPr>
+          <w:rFonts w:ascii="Times New Roman" w:hAnsi="Times New Roman"/>
+          <w:i/>
+          <w:sz w:val="22"/>
+        </w:rPr>
+        <w:t>T</w:t>
+      </w:r>
+      <w:r>
+        <w:rPr>
+          <w:rFonts w:ascii="Times New Roman" w:hAnsi="Times New Roman"/>
+          <w:sz w:val="22"/>
+          <w:vertAlign w:val="subscript"/>
+        </w:rPr>
+        <w:t>hash</w:t>
+      </w:r>
+      <w:r>
+        <w:rPr>
+          <w:rFonts w:ascii="Times New Roman" w:hAnsi="Times New Roman"/>
+          <w:sz w:val="22"/>
+        </w:rPr>
+        <w:t xml:space="preserve"> + </w:t>
+      </w:r>
+      <w:r>
+        <w:rPr>
+          <w:rFonts w:ascii="Times New Roman" w:hAnsi="Times New Roman"/>
+          <w:i/>
+          <w:sz w:val="22"/>
+        </w:rPr>
+        <w:t>T</w:t>
+      </w:r>
+      <w:r>
+        <w:rPr>
+          <w:rFonts w:ascii="Times New Roman" w:hAnsi="Times New Roman"/>
+          <w:sz w:val="22"/>
+          <w:vertAlign w:val="subscript"/>
+        </w:rPr>
+        <w:t>lookup</w:t>
+      </w:r>
+      <w:r>
+        <w:rPr>
+          <w:rFonts w:ascii="Times New Roman" w:hAnsi="Times New Roman"/>
+          <w:sz w:val="22"/>
+        </w:rPr>
+        <w:t xml:space="preserve"> + </w:t>
+      </w:r>
+      <w:r>
+        <w:rPr>
+          <w:rFonts w:ascii="Times New Roman" w:hAnsi="Times New Roman"/>
+          <w:i/>
+          <w:sz w:val="22"/>
+        </w:rPr>
+        <w:t>T</w:t>
+      </w:r>
+      <w:r>
+        <w:rPr>
+          <w:rFonts w:ascii="Times New Roman" w:hAnsi="Times New Roman"/>
+          <w:sz w:val="22"/>
+          <w:vertAlign w:val="subscript"/>
+        </w:rPr>
+        <w:t>embed</w:t>
+      </w:r>
+      <w:r>
+        <w:rPr>
+          <w:rFonts w:ascii="Times New Roman" w:hAnsi="Times New Roman"/>
+          <w:sz w:val="22"/>
+        </w:rPr>
+        <w:t xml:space="preserve">(changed) + </w:t>
+      </w:r>
+      <w:r>
+        <w:rPr>
+          <w:rFonts w:ascii="Times New Roman" w:hAnsi="Times New Roman"/>
+          <w:i/>
+          <w:sz w:val="22"/>
+        </w:rPr>
+        <w:t>T</w:t>
+      </w:r>
+      <w:r>
+        <w:rPr>
+          <w:rFonts w:ascii="Times New Roman" w:hAnsi="Times New Roman"/>
+          <w:sz w:val="22"/>
+          <w:vertAlign w:val="subscript"/>
+        </w:rPr>
+        <w:t>index</w:t>
       </w:r>
       <w:r>
         <w:rPr>
@@ -1011,12 +1165,26 @@
       </w:r>
       <w:r>
         <w:rPr>
-          <w:rFonts w:ascii="Cambria Math" w:hAnsi="Cambria Math"/>
+          <w:rFonts w:ascii="Times New Roman" w:hAnsi="Times New Roman"/>
           <w:i/>
-          <w:color w:val="1A1A1A"/>
-          <w:sz w:val="22"/>
-        </w:rPr>
-        <w:t>T_{embed}(all)</w:t>
+          <w:sz w:val="22"/>
+        </w:rPr>
+        <w:t>T</w:t>
+      </w:r>
+      <w:r>
+        <w:rPr>
+          <w:rFonts w:ascii="Times New Roman" w:hAnsi="Times New Roman"/>
+          <w:sz w:val="22"/>
+          <w:vertAlign w:val="subscript"/>
+        </w:rPr>
+        <w:t>embed</w:t>
+      </w:r>
+      <w:r>
+        <w:rPr>
+          <w:rFonts w:ascii="Times New Roman" w:hAnsi="Times New Roman"/>
+          <w:sz w:val="22"/>
+        </w:rPr>
+        <w:t>(all)</w:t>
       </w:r>
       <w:r>
         <w:rPr>
@@ -1030,12 +1198,26 @@
       </w:r>
       <w:r>
         <w:rPr>
-          <w:rFonts w:ascii="Cambria Math" w:hAnsi="Cambria Math"/>
+          <w:rFonts w:ascii="Times New Roman" w:hAnsi="Times New Roman"/>
           <w:i/>
-          <w:color w:val="1A1A1A"/>
-          <w:sz w:val="22"/>
-        </w:rPr>
-        <w:t>T_{embed}(changed)</w:t>
+          <w:sz w:val="22"/>
+        </w:rPr>
+        <w:t>T</w:t>
+      </w:r>
+      <w:r>
+        <w:rPr>
+          <w:rFonts w:ascii="Times New Roman" w:hAnsi="Times New Roman"/>
+          <w:sz w:val="22"/>
+          <w:vertAlign w:val="subscript"/>
+        </w:rPr>
+        <w:t>embed</w:t>
+      </w:r>
+      <w:r>
+        <w:rPr>
+          <w:rFonts w:ascii="Times New Roman" w:hAnsi="Times New Roman"/>
+          <w:sz w:val="22"/>
+        </w:rPr>
+        <w:t>(changed)</w:t>
       </w:r>
       <w:r>
         <w:rPr>
@@ -1064,12 +1246,19 @@
       </w:r>
       <w:r>
         <w:rPr>
-          <w:rFonts w:ascii="Cambria Math" w:hAnsi="Cambria Math"/>
+          <w:rFonts w:ascii="Times New Roman" w:hAnsi="Times New Roman"/>
           <w:i/>
-          <w:color w:val="1A1A1A"/>
-          <w:sz w:val="22"/>
-        </w:rPr>
-        <w:t>T_{KB}</w:t>
+          <w:sz w:val="22"/>
+        </w:rPr>
+        <w:t>T</w:t>
+      </w:r>
+      <w:r>
+        <w:rPr>
+          <w:rFonts w:ascii="Times New Roman" w:hAnsi="Times New Roman"/>
+          <w:sz w:val="22"/>
+          <w:vertAlign w:val="subscript"/>
+        </w:rPr>
+        <w:t>KB</w:t>
       </w:r>
       <w:r>
         <w:rPr>
@@ -1192,11 +1381,107 @@
       </w:pPr>
       <w:r>
         <w:rPr>
-          <w:rFonts w:ascii="Cambria Math" w:hAnsi="Cambria Math"/>
-          <w:i/>
-          <w:sz w:val="22"/>
-        </w:rPr>
-        <w:t>\text{sim}(\mathbf{q}, \mathbf{d}) = \frac{\mathbf{q} \cdot \mathbf{d}}{\|\mathbf{q}\|_2 \|\mathbf{d}\|_2}</w:t>
+          <w:rFonts w:ascii="Times New Roman" w:hAnsi="Times New Roman"/>
+          <w:sz w:val="22"/>
+        </w:rPr>
+        <w:t>sim</w:t>
+      </w:r>
+      <w:r>
+        <w:rPr>
+          <w:rFonts w:ascii="Times New Roman" w:hAnsi="Times New Roman"/>
+          <w:sz w:val="22"/>
+        </w:rPr>
+        <w:t>(</w:t>
+      </w:r>
+      <w:r>
+        <w:rPr>
+          <w:rFonts w:ascii="Times New Roman" w:hAnsi="Times New Roman"/>
+          <w:b/>
+          <w:sz w:val="22"/>
+        </w:rPr>
+        <w:t>q</w:t>
+      </w:r>
+      <w:r>
+        <w:rPr>
+          <w:rFonts w:ascii="Times New Roman" w:hAnsi="Times New Roman"/>
+          <w:sz w:val="22"/>
+        </w:rPr>
+        <w:t xml:space="preserve">, </w:t>
+      </w:r>
+      <w:r>
+        <w:rPr>
+          <w:rFonts w:ascii="Times New Roman" w:hAnsi="Times New Roman"/>
+          <w:b/>
+          <w:sz w:val="22"/>
+        </w:rPr>
+        <w:t>d</w:t>
+      </w:r>
+      <w:r>
+        <w:rPr>
+          <w:rFonts w:ascii="Times New Roman" w:hAnsi="Times New Roman"/>
+          <w:sz w:val="22"/>
+        </w:rPr>
+        <w:t>) = \frac{</w:t>
+      </w:r>
+      <w:r>
+        <w:rPr>
+          <w:rFonts w:ascii="Times New Roman" w:hAnsi="Times New Roman"/>
+          <w:b/>
+          <w:sz w:val="22"/>
+        </w:rPr>
+        <w:t>q</w:t>
+      </w:r>
+      <w:r>
+        <w:rPr>
+          <w:rFonts w:ascii="Times New Roman" w:hAnsi="Times New Roman"/>
+          <w:sz w:val="22"/>
+        </w:rPr>
+        <w:t xml:space="preserve"> · </w:t>
+      </w:r>
+      <w:r>
+        <w:rPr>
+          <w:rFonts w:ascii="Times New Roman" w:hAnsi="Times New Roman"/>
+          <w:b/>
+          <w:sz w:val="22"/>
+        </w:rPr>
+        <w:t>d</w:t>
+      </w:r>
+      <w:r>
+        <w:rPr>
+          <w:rFonts w:ascii="Times New Roman" w:hAnsi="Times New Roman"/>
+          <w:sz w:val="22"/>
+        </w:rPr>
+        <w:t>}{\|</w:t>
+      </w:r>
+      <w:r>
+        <w:rPr>
+          <w:rFonts w:ascii="Times New Roman" w:hAnsi="Times New Roman"/>
+          <w:b/>
+          <w:sz w:val="22"/>
+        </w:rPr>
+        <w:t>q</w:t>
+      </w:r>
+      <w:r>
+        <w:rPr>
+          <w:rFonts w:ascii="Times New Roman" w:hAnsi="Times New Roman"/>
+          <w:sz w:val="22"/>
+        </w:rPr>
+        <w:t>\|_2 \|</w:t>
+      </w:r>
+      <w:r>
+        <w:rPr>
+          <w:rFonts w:ascii="Times New Roman" w:hAnsi="Times New Roman"/>
+          <w:b/>
+          <w:sz w:val="22"/>
+        </w:rPr>
+        <w:t>d</w:t>
+      </w:r>
+      <w:r>
+        <w:rPr>
+          <w:rFonts w:ascii="Times New Roman" w:hAnsi="Times New Roman"/>
+          <w:sz w:val="22"/>
+        </w:rPr>
+        <w:t>\|_2}</w:t>
       </w:r>
     </w:p>
     <w:p>
@@ -1215,12 +1500,17 @@
       </w:r>
       <w:r>
         <w:rPr>
-          <w:rFonts w:ascii="Cambria Math" w:hAnsi="Cambria Math"/>
-          <w:i/>
-          <w:color w:val="1A1A1A"/>
-          <w:sz w:val="22"/>
-        </w:rPr>
-        <w:t>\text{Top-}K = 3</w:t>
+          <w:rFonts w:ascii="Times New Roman" w:hAnsi="Times New Roman"/>
+          <w:sz w:val="22"/>
+        </w:rPr>
+        <w:t>Top-</w:t>
+      </w:r>
+      <w:r>
+        <w:rPr>
+          <w:rFonts w:ascii="Times New Roman" w:hAnsi="Times New Roman"/>
+          <w:sz w:val="22"/>
+        </w:rPr>
+        <w:t>K = 3</w:t>
       </w:r>
       <w:r>
         <w:rPr>
@@ -1249,9 +1539,7 @@
       </w:r>
       <w:r>
         <w:rPr>
-          <w:rFonts w:ascii="Cambria Math" w:hAnsi="Cambria Math"/>
-          <w:i/>
-          <w:color w:val="1A1A1A"/>
+          <w:rFonts w:ascii="Times New Roman" w:hAnsi="Times New Roman"/>
           <w:sz w:val="22"/>
         </w:rPr>
         <w:t>K = 1, 3</w:t>
@@ -1268,9 +1556,7 @@
       </w:r>
       <w:r>
         <w:rPr>
-          <w:rFonts w:ascii="Cambria Math" w:hAnsi="Cambria Math"/>
-          <w:i/>
-          <w:color w:val="1A1A1A"/>
+          <w:rFonts w:ascii="Times New Roman" w:hAnsi="Times New Roman"/>
           <w:sz w:val="22"/>
         </w:rPr>
         <w:t>5</w:t>
@@ -1287,12 +1573,18 @@
       </w:r>
       <w:r>
         <w:rPr>
-          <w:rFonts w:ascii="Cambria Math" w:hAnsi="Cambria Math"/>
+          <w:rFonts w:ascii="Times New Roman" w:hAnsi="Times New Roman"/>
+          <w:sz w:val="22"/>
+        </w:rPr>
+        <w:t>Top-</w:t>
+      </w:r>
+      <w:r>
+        <w:rPr>
+          <w:rFonts w:ascii="Times New Roman" w:hAnsi="Times New Roman"/>
           <w:i/>
-          <w:color w:val="1A1A1A"/>
-          <w:sz w:val="22"/>
-        </w:rPr>
-        <w:t>\text{Top-}K</w:t>
+          <w:sz w:val="22"/>
+        </w:rPr>
+        <w:t>K</w:t>
       </w:r>
       <w:r>
         <w:rPr>
@@ -1352,9 +1644,8 @@
       </w:r>
       <w:r>
         <w:rPr>
-          <w:rFonts w:ascii="Cambria Math" w:hAnsi="Cambria Math"/>
+          <w:rFonts w:ascii="Times New Roman" w:hAnsi="Times New Roman"/>
           <w:i/>
-          <w:color w:val="1A1A1A"/>
           <w:sz w:val="22"/>
         </w:rPr>
         <w:t>K</w:t>
@@ -1425,9 +1716,7 @@
       </w:r>
       <w:r>
         <w:rPr>
-          <w:rFonts w:ascii="Cambria Math" w:hAnsi="Cambria Math"/>
-          <w:i/>
-          <w:color w:val="1A1A1A"/>
+          <w:rFonts w:ascii="Times New Roman" w:hAnsi="Times New Roman"/>
           <w:sz w:val="22"/>
         </w:rPr>
         <w:t>T = 0.2</w:t>
@@ -1444,9 +1733,7 @@
       </w:r>
       <w:r>
         <w:rPr>
-          <w:rFonts w:ascii="Cambria Math" w:hAnsi="Cambria Math"/>
-          <w:i/>
-          <w:color w:val="1A1A1A"/>
+          <w:rFonts w:ascii="Times New Roman" w:hAnsi="Times New Roman"/>
           <w:sz w:val="22"/>
         </w:rPr>
         <w:t>p = 0.9</w:t>
@@ -1463,12 +1750,26 @@
       </w:r>
       <w:r>
         <w:rPr>
-          <w:rFonts w:ascii="Cambria Math" w:hAnsi="Cambria Math"/>
+          <w:rFonts w:ascii="Times New Roman" w:hAnsi="Times New Roman"/>
           <w:i/>
-          <w:color w:val="1A1A1A"/>
-          <w:sz w:val="22"/>
-        </w:rPr>
-        <w:t>N_{\text{ctx}} = 4{,}096</w:t>
+          <w:sz w:val="22"/>
+        </w:rPr>
+        <w:t>N</w:t>
+      </w:r>
+      <w:r>
+        <w:rPr>
+          <w:rFonts w:ascii="Times New Roman" w:hAnsi="Times New Roman"/>
+          <w:sz w:val="22"/>
+          <w:vertAlign w:val="subscript"/>
+        </w:rPr>
+        <w:t>ctx</w:t>
+      </w:r>
+      <w:r>
+        <w:rPr>
+          <w:rFonts w:ascii="Times New Roman" w:hAnsi="Times New Roman"/>
+          <w:sz w:val="22"/>
+        </w:rPr>
+        <w:t xml:space="preserve"> = 4{,}096</w:t>
       </w:r>
       <w:r>
         <w:rPr>
@@ -1482,12 +1783,26 @@
       </w:r>
       <w:r>
         <w:rPr>
-          <w:rFonts w:ascii="Cambria Math" w:hAnsi="Cambria Math"/>
+          <w:rFonts w:ascii="Times New Roman" w:hAnsi="Times New Roman"/>
           <w:i/>
-          <w:color w:val="1A1A1A"/>
-          <w:sz w:val="22"/>
-        </w:rPr>
-        <w:t>N_{\text{out}} = 2{,}048</w:t>
+          <w:sz w:val="22"/>
+        </w:rPr>
+        <w:t>N</w:t>
+      </w:r>
+      <w:r>
+        <w:rPr>
+          <w:rFonts w:ascii="Times New Roman" w:hAnsi="Times New Roman"/>
+          <w:sz w:val="22"/>
+          <w:vertAlign w:val="subscript"/>
+        </w:rPr>
+        <w:t>out</w:t>
+      </w:r>
+      <w:r>
+        <w:rPr>
+          <w:rFonts w:ascii="Times New Roman" w:hAnsi="Times New Roman"/>
+          <w:sz w:val="22"/>
+        </w:rPr>
+        <w:t xml:space="preserve"> = 2{,}048</w:t>
       </w:r>
       <w:r>
         <w:rPr>
@@ -1636,12 +1951,10 @@
       </w:r>
       <w:r>
         <w:rPr>
-          <w:rFonts w:ascii="Cambria Math" w:hAnsi="Cambria Math"/>
-          <w:i/>
-          <w:color w:val="1A1A1A"/>
-          <w:sz w:val="22"/>
-        </w:rPr>
-        <w:t>0 \le i \le 3</w:t>
+          <w:rFonts w:ascii="Times New Roman" w:hAnsi="Times New Roman"/>
+          <w:sz w:val="22"/>
+        </w:rPr>
+        <w:t>0 ≤ i ≤ 3</w:t>
       </w:r>
       <w:r>
         <w:rPr>
@@ -1786,12 +2099,17 @@
       </w:r>
       <w:r>
         <w:rPr>
-          <w:rFonts w:ascii="Cambria Math" w:hAnsi="Cambria Math"/>
-          <w:i/>
-          <w:color w:val="1A1A1A"/>
-          <w:sz w:val="22"/>
-        </w:rPr>
-        <w:t>&lt; 0.1\text{ ms}</w:t>
+          <w:rFonts w:ascii="Times New Roman" w:hAnsi="Times New Roman"/>
+          <w:sz w:val="22"/>
+        </w:rPr>
+        <w:t>&lt; 0.1</w:t>
+      </w:r>
+      <w:r>
+        <w:rPr>
+          <w:rFonts w:ascii="Times New Roman" w:hAnsi="Times New Roman"/>
+          <w:sz w:val="22"/>
+        </w:rPr>
+        <w:t xml:space="preserve"> ms</w:t>
       </w:r>
       <w:r>
         <w:rPr>
@@ -1890,9 +2208,7 @@
       </w:r>
       <w:r>
         <w:rPr>
-          <w:rFonts w:ascii="Cambria Math" w:hAnsi="Cambria Math"/>
-          <w:i/>
-          <w:color w:val="1A1A1A"/>
+          <w:rFonts w:ascii="Times New Roman" w:hAnsi="Times New Roman"/>
           <w:sz w:val="22"/>
         </w:rPr>
         <w:t>M = 3</w:t>
@@ -1927,12 +2243,19 @@
       </w:r>
       <w:r>
         <w:rPr>
-          <w:rFonts w:ascii="Cambria Math" w:hAnsi="Cambria Math"/>
+          <w:rFonts w:ascii="Times New Roman" w:hAnsi="Times New Roman"/>
           <w:i/>
-          <w:color w:val="1A1A1A"/>
-          <w:sz w:val="22"/>
-        </w:rPr>
-        <w:t>T_{\text{retry}}</w:t>
+          <w:sz w:val="22"/>
+        </w:rPr>
+        <w:t>T</w:t>
+      </w:r>
+      <w:r>
+        <w:rPr>
+          <w:rFonts w:ascii="Times New Roman" w:hAnsi="Times New Roman"/>
+          <w:sz w:val="22"/>
+          <w:vertAlign w:val="subscript"/>
+        </w:rPr>
+        <w:t>retry</w:t>
       </w:r>
       <w:r>
         <w:rPr>
@@ -2030,12 +2353,19 @@
       </w:r>
       <w:r>
         <w:rPr>
-          <w:rFonts w:ascii="Cambria Math" w:hAnsi="Cambria Math"/>
+          <w:rFonts w:ascii="Times New Roman" w:hAnsi="Times New Roman"/>
           <w:i/>
-          <w:color w:val="1A1A1A"/>
-          <w:sz w:val="22"/>
-        </w:rPr>
-        <w:t>T_{\text{E2E}}</w:t>
+          <w:sz w:val="22"/>
+        </w:rPr>
+        <w:t>T</w:t>
+      </w:r>
+      <w:r>
+        <w:rPr>
+          <w:rFonts w:ascii="Times New Roman" w:hAnsi="Times New Roman"/>
+          <w:sz w:val="22"/>
+          <w:vertAlign w:val="subscript"/>
+        </w:rPr>
+        <w:t>E2E</w:t>
       </w:r>
       <w:r>
         <w:rPr>
@@ -3000,9 +3330,7 @@
             </w:r>
             <w:r>
               <w:rPr>
-                <w:rFonts w:ascii="Cambria Math" w:hAnsi="Cambria Math"/>
-                <w:i/>
-                <w:color w:val="1A1A1A"/>
+                <w:rFonts w:ascii="Times New Roman" w:hAnsi="Times New Roman"/>
                 <w:sz w:val="18"/>
               </w:rPr>
               <w:t>T=0.1</w:t>
@@ -3037,9 +3365,7 @@
             </w:r>
             <w:r>
               <w:rPr>
-                <w:rFonts w:ascii="Cambria Math" w:hAnsi="Cambria Math"/>
-                <w:i/>
-                <w:color w:val="1A1A1A"/>
+                <w:rFonts w:ascii="Times New Roman" w:hAnsi="Times New Roman"/>
                 <w:sz w:val="18"/>
               </w:rPr>
               <w:t>T=0.1</w:t>
@@ -3236,9 +3562,7 @@
       </w:r>
       <w:r>
         <w:rPr>
-          <w:rFonts w:ascii="Cambria Math" w:hAnsi="Cambria Math"/>
-          <w:i/>
-          <w:color w:val="1A1A1A"/>
+          <w:rFonts w:ascii="Times New Roman" w:hAnsi="Times New Roman"/>
           <w:sz w:val="22"/>
         </w:rPr>
         <w:t>T = 0.1</w:t>
@@ -3335,9 +3659,7 @@
       </w:r>
       <w:r>
         <w:rPr>
-          <w:rFonts w:ascii="Cambria Math" w:hAnsi="Cambria Math"/>
-          <w:i/>
-          <w:color w:val="1A1A1A"/>
+          <w:rFonts w:ascii="Times New Roman" w:hAnsi="Times New Roman"/>
           <w:sz w:val="22"/>
         </w:rPr>
         <w:t>T = 0.1</w:t>
@@ -3766,12 +4088,10 @@
       </w:r>
       <w:r>
         <w:rPr>
-          <w:rFonts w:ascii="Cambria Math" w:hAnsi="Cambria Math"/>
-          <w:i/>
-          <w:color w:val="1A1A1A"/>
-          <w:sz w:val="22"/>
-        </w:rPr>
-        <w:t>\kappa</w:t>
+          <w:rFonts w:ascii="Times New Roman" w:hAnsi="Times New Roman"/>
+          <w:sz w:val="22"/>
+        </w:rPr>
+        <w:t>κ</w:t>
       </w:r>
       <w:r>
         <w:rPr>
@@ -3785,12 +4105,17 @@
       </w:r>
       <w:r>
         <w:rPr>
-          <w:rFonts w:ascii="Cambria Math" w:hAnsi="Cambria Math"/>
-          <w:i/>
-          <w:color w:val="1A1A1A"/>
-          <w:sz w:val="22"/>
-        </w:rPr>
-        <w:t>\text{ICC}(2,k)</w:t>
+          <w:rFonts w:ascii="Times New Roman" w:hAnsi="Times New Roman"/>
+          <w:sz w:val="22"/>
+        </w:rPr>
+        <w:t>ICC</w:t>
+      </w:r>
+      <w:r>
+        <w:rPr>
+          <w:rFonts w:ascii="Times New Roman" w:hAnsi="Times New Roman"/>
+          <w:sz w:val="22"/>
+        </w:rPr>
+        <w:t>(2,k)</w:t>
       </w:r>
       <w:r>
         <w:rPr>
@@ -4247,9 +4572,7 @@
             </w:r>
             <w:r>
               <w:rPr>
-                <w:rFonts w:ascii="Cambria Math" w:hAnsi="Cambria Math"/>
-                <w:i/>
-                <w:color w:val="1A1A1A"/>
+                <w:rFonts w:ascii="Times New Roman" w:hAnsi="Times New Roman"/>
                 <w:sz w:val="18"/>
               </w:rPr>
               <w:t>K=3</w:t>
@@ -4656,12 +4979,171 @@
       </w:r>
       <w:r>
         <w:rPr>
-          <w:rFonts w:ascii="Cambria Math" w:hAnsi="Cambria Math"/>
+          <w:rFonts w:ascii="Times New Roman" w:hAnsi="Times New Roman"/>
           <w:i/>
-          <w:color w:val="1A1A1A"/>
-          <w:sz w:val="22"/>
-        </w:rPr>
-        <w:t>T_{\text{KB}} = T_{\text{extract}} + T_{\text{chunk}} + T_{\text{hash}} + T_{\text{lookup}} + T_{\text{embed}}(\text{changed}) + T_{\text{index}}</w:t>
+          <w:sz w:val="22"/>
+        </w:rPr>
+        <w:t>T</w:t>
+      </w:r>
+      <w:r>
+        <w:rPr>
+          <w:rFonts w:ascii="Times New Roman" w:hAnsi="Times New Roman"/>
+          <w:sz w:val="22"/>
+          <w:vertAlign w:val="subscript"/>
+        </w:rPr>
+        <w:t>KB</w:t>
+      </w:r>
+      <w:r>
+        <w:rPr>
+          <w:rFonts w:ascii="Times New Roman" w:hAnsi="Times New Roman"/>
+          <w:sz w:val="22"/>
+        </w:rPr>
+        <w:t xml:space="preserve"> = </w:t>
+      </w:r>
+      <w:r>
+        <w:rPr>
+          <w:rFonts w:ascii="Times New Roman" w:hAnsi="Times New Roman"/>
+          <w:i/>
+          <w:sz w:val="22"/>
+        </w:rPr>
+        <w:t>T</w:t>
+      </w:r>
+      <w:r>
+        <w:rPr>
+          <w:rFonts w:ascii="Times New Roman" w:hAnsi="Times New Roman"/>
+          <w:sz w:val="22"/>
+          <w:vertAlign w:val="subscript"/>
+        </w:rPr>
+        <w:t>extract</w:t>
+      </w:r>
+      <w:r>
+        <w:rPr>
+          <w:rFonts w:ascii="Times New Roman" w:hAnsi="Times New Roman"/>
+          <w:sz w:val="22"/>
+        </w:rPr>
+        <w:t xml:space="preserve"> + </w:t>
+      </w:r>
+      <w:r>
+        <w:rPr>
+          <w:rFonts w:ascii="Times New Roman" w:hAnsi="Times New Roman"/>
+          <w:i/>
+          <w:sz w:val="22"/>
+        </w:rPr>
+        <w:t>T</w:t>
+      </w:r>
+      <w:r>
+        <w:rPr>
+          <w:rFonts w:ascii="Times New Roman" w:hAnsi="Times New Roman"/>
+          <w:sz w:val="22"/>
+          <w:vertAlign w:val="subscript"/>
+        </w:rPr>
+        <w:t>chunk</w:t>
+      </w:r>
+      <w:r>
+        <w:rPr>
+          <w:rFonts w:ascii="Times New Roman" w:hAnsi="Times New Roman"/>
+          <w:sz w:val="22"/>
+        </w:rPr>
+        <w:t xml:space="preserve"> + </w:t>
+      </w:r>
+      <w:r>
+        <w:rPr>
+          <w:rFonts w:ascii="Times New Roman" w:hAnsi="Times New Roman"/>
+          <w:i/>
+          <w:sz w:val="22"/>
+        </w:rPr>
+        <w:t>T</w:t>
+      </w:r>
+      <w:r>
+        <w:rPr>
+          <w:rFonts w:ascii="Times New Roman" w:hAnsi="Times New Roman"/>
+          <w:sz w:val="22"/>
+          <w:vertAlign w:val="subscript"/>
+        </w:rPr>
+        <w:t>hash</w:t>
+      </w:r>
+      <w:r>
+        <w:rPr>
+          <w:rFonts w:ascii="Times New Roman" w:hAnsi="Times New Roman"/>
+          <w:sz w:val="22"/>
+        </w:rPr>
+        <w:t xml:space="preserve"> + </w:t>
+      </w:r>
+      <w:r>
+        <w:rPr>
+          <w:rFonts w:ascii="Times New Roman" w:hAnsi="Times New Roman"/>
+          <w:i/>
+          <w:sz w:val="22"/>
+        </w:rPr>
+        <w:t>T</w:t>
+      </w:r>
+      <w:r>
+        <w:rPr>
+          <w:rFonts w:ascii="Times New Roman" w:hAnsi="Times New Roman"/>
+          <w:sz w:val="22"/>
+          <w:vertAlign w:val="subscript"/>
+        </w:rPr>
+        <w:t>lookup</w:t>
+      </w:r>
+      <w:r>
+        <w:rPr>
+          <w:rFonts w:ascii="Times New Roman" w:hAnsi="Times New Roman"/>
+          <w:sz w:val="22"/>
+        </w:rPr>
+        <w:t xml:space="preserve"> + </w:t>
+      </w:r>
+      <w:r>
+        <w:rPr>
+          <w:rFonts w:ascii="Times New Roman" w:hAnsi="Times New Roman"/>
+          <w:i/>
+          <w:sz w:val="22"/>
+        </w:rPr>
+        <w:t>T</w:t>
+      </w:r>
+      <w:r>
+        <w:rPr>
+          <w:rFonts w:ascii="Times New Roman" w:hAnsi="Times New Roman"/>
+          <w:sz w:val="22"/>
+          <w:vertAlign w:val="subscript"/>
+        </w:rPr>
+        <w:t>embed</w:t>
+      </w:r>
+      <w:r>
+        <w:rPr>
+          <w:rFonts w:ascii="Times New Roman" w:hAnsi="Times New Roman"/>
+          <w:sz w:val="22"/>
+        </w:rPr>
+        <w:t>(</w:t>
+      </w:r>
+      <w:r>
+        <w:rPr>
+          <w:rFonts w:ascii="Times New Roman" w:hAnsi="Times New Roman"/>
+          <w:sz w:val="22"/>
+        </w:rPr>
+        <w:t>changed</w:t>
+      </w:r>
+      <w:r>
+        <w:rPr>
+          <w:rFonts w:ascii="Times New Roman" w:hAnsi="Times New Roman"/>
+          <w:sz w:val="22"/>
+        </w:rPr>
+        <w:t xml:space="preserve">) + </w:t>
+      </w:r>
+      <w:r>
+        <w:rPr>
+          <w:rFonts w:ascii="Times New Roman" w:hAnsi="Times New Roman"/>
+          <w:i/>
+          <w:sz w:val="22"/>
+        </w:rPr>
+        <w:t>T</w:t>
+      </w:r>
+      <w:r>
+        <w:rPr>
+          <w:rFonts w:ascii="Times New Roman" w:hAnsi="Times New Roman"/>
+          <w:sz w:val="22"/>
+          <w:vertAlign w:val="subscript"/>
+        </w:rPr>
+        <w:t>index</w:t>
       </w:r>
       <w:r>
         <w:rPr>
@@ -4675,12 +5157,157 @@
       </w:r>
       <w:r>
         <w:rPr>
-          <w:rFonts w:ascii="Cambria Math" w:hAnsi="Cambria Math"/>
+          <w:rFonts w:ascii="Times New Roman" w:hAnsi="Times New Roman"/>
           <w:i/>
-          <w:color w:val="1A1A1A"/>
-          <w:sz w:val="22"/>
-        </w:rPr>
-        <w:t>T_{\text{GEN}} = T_{\text{retrieval}} + T_{\text{prompt}} + T_{\text{LLM}} + T_{\text{validation}} + T_{\text{retry}} + T_{\text{insert}}</w:t>
+          <w:sz w:val="22"/>
+        </w:rPr>
+        <w:t>T</w:t>
+      </w:r>
+      <w:r>
+        <w:rPr>
+          <w:rFonts w:ascii="Times New Roman" w:hAnsi="Times New Roman"/>
+          <w:sz w:val="22"/>
+          <w:vertAlign w:val="subscript"/>
+        </w:rPr>
+        <w:t>GEN</w:t>
+      </w:r>
+      <w:r>
+        <w:rPr>
+          <w:rFonts w:ascii="Times New Roman" w:hAnsi="Times New Roman"/>
+          <w:sz w:val="22"/>
+        </w:rPr>
+        <w:t xml:space="preserve"> = </w:t>
+      </w:r>
+      <w:r>
+        <w:rPr>
+          <w:rFonts w:ascii="Times New Roman" w:hAnsi="Times New Roman"/>
+          <w:i/>
+          <w:sz w:val="22"/>
+        </w:rPr>
+        <w:t>T</w:t>
+      </w:r>
+      <w:r>
+        <w:rPr>
+          <w:rFonts w:ascii="Times New Roman" w:hAnsi="Times New Roman"/>
+          <w:sz w:val="22"/>
+          <w:vertAlign w:val="subscript"/>
+        </w:rPr>
+        <w:t>retrieval</w:t>
+      </w:r>
+      <w:r>
+        <w:rPr>
+          <w:rFonts w:ascii="Times New Roman" w:hAnsi="Times New Roman"/>
+          <w:sz w:val="22"/>
+        </w:rPr>
+        <w:t xml:space="preserve"> + </w:t>
+      </w:r>
+      <w:r>
+        <w:rPr>
+          <w:rFonts w:ascii="Times New Roman" w:hAnsi="Times New Roman"/>
+          <w:i/>
+          <w:sz w:val="22"/>
+        </w:rPr>
+        <w:t>T</w:t>
+      </w:r>
+      <w:r>
+        <w:rPr>
+          <w:rFonts w:ascii="Times New Roman" w:hAnsi="Times New Roman"/>
+          <w:sz w:val="22"/>
+          <w:vertAlign w:val="subscript"/>
+        </w:rPr>
+        <w:t>prompt</w:t>
+      </w:r>
+      <w:r>
+        <w:rPr>
+          <w:rFonts w:ascii="Times New Roman" w:hAnsi="Times New Roman"/>
+          <w:sz w:val="22"/>
+        </w:rPr>
+        <w:t xml:space="preserve"> + </w:t>
+      </w:r>
+      <w:r>
+        <w:rPr>
+          <w:rFonts w:ascii="Times New Roman" w:hAnsi="Times New Roman"/>
+          <w:i/>
+          <w:sz w:val="22"/>
+        </w:rPr>
+        <w:t>T</w:t>
+      </w:r>
+      <w:r>
+        <w:rPr>
+          <w:rFonts w:ascii="Times New Roman" w:hAnsi="Times New Roman"/>
+          <w:sz w:val="22"/>
+          <w:vertAlign w:val="subscript"/>
+        </w:rPr>
+        <w:t>LLM</w:t>
+      </w:r>
+      <w:r>
+        <w:rPr>
+          <w:rFonts w:ascii="Times New Roman" w:hAnsi="Times New Roman"/>
+          <w:sz w:val="22"/>
+        </w:rPr>
+        <w:t xml:space="preserve"> + </w:t>
+      </w:r>
+      <w:r>
+        <w:rPr>
+          <w:rFonts w:ascii="Times New Roman" w:hAnsi="Times New Roman"/>
+          <w:i/>
+          <w:sz w:val="22"/>
+        </w:rPr>
+        <w:t>T</w:t>
+      </w:r>
+      <w:r>
+        <w:rPr>
+          <w:rFonts w:ascii="Times New Roman" w:hAnsi="Times New Roman"/>
+          <w:sz w:val="22"/>
+          <w:vertAlign w:val="subscript"/>
+        </w:rPr>
+        <w:t>validation</w:t>
+      </w:r>
+      <w:r>
+        <w:rPr>
+          <w:rFonts w:ascii="Times New Roman" w:hAnsi="Times New Roman"/>
+          <w:sz w:val="22"/>
+        </w:rPr>
+        <w:t xml:space="preserve"> + </w:t>
+      </w:r>
+      <w:r>
+        <w:rPr>
+          <w:rFonts w:ascii="Times New Roman" w:hAnsi="Times New Roman"/>
+          <w:i/>
+          <w:sz w:val="22"/>
+        </w:rPr>
+        <w:t>T</w:t>
+      </w:r>
+      <w:r>
+        <w:rPr>
+          <w:rFonts w:ascii="Times New Roman" w:hAnsi="Times New Roman"/>
+          <w:sz w:val="22"/>
+          <w:vertAlign w:val="subscript"/>
+        </w:rPr>
+        <w:t>retry</w:t>
+      </w:r>
+      <w:r>
+        <w:rPr>
+          <w:rFonts w:ascii="Times New Roman" w:hAnsi="Times New Roman"/>
+          <w:sz w:val="22"/>
+        </w:rPr>
+        <w:t xml:space="preserve"> + </w:t>
+      </w:r>
+      <w:r>
+        <w:rPr>
+          <w:rFonts w:ascii="Times New Roman" w:hAnsi="Times New Roman"/>
+          <w:i/>
+          <w:sz w:val="22"/>
+        </w:rPr>
+        <w:t>T</w:t>
+      </w:r>
+      <w:r>
+        <w:rPr>
+          <w:rFonts w:ascii="Times New Roman" w:hAnsi="Times New Roman"/>
+          <w:sz w:val="22"/>
+          <w:vertAlign w:val="subscript"/>
+        </w:rPr>
+        <w:t>insert</w:t>
       </w:r>
       <w:r>
         <w:rPr>
@@ -4694,12 +5321,19 @@
       </w:r>
       <w:r>
         <w:rPr>
-          <w:rFonts w:ascii="Cambria Math" w:hAnsi="Cambria Math"/>
+          <w:rFonts w:ascii="Times New Roman" w:hAnsi="Times New Roman"/>
           <w:i/>
-          <w:color w:val="1A1A1A"/>
-          <w:sz w:val="22"/>
-        </w:rPr>
-        <w:t>T_{\text{insert}}</w:t>
+          <w:sz w:val="22"/>
+        </w:rPr>
+        <w:t>T</w:t>
+      </w:r>
+      <w:r>
+        <w:rPr>
+          <w:rFonts w:ascii="Times New Roman" w:hAnsi="Times New Roman"/>
+          <w:sz w:val="22"/>
+          <w:vertAlign w:val="subscript"/>
+        </w:rPr>
+        <w:t>insert</w:t>
       </w:r>
       <w:r>
         <w:rPr>
@@ -4713,12 +5347,65 @@
       </w:r>
       <w:r>
         <w:rPr>
-          <w:rFonts w:ascii="Cambria Math" w:hAnsi="Cambria Math"/>
+          <w:rFonts w:ascii="Times New Roman" w:hAnsi="Times New Roman"/>
           <w:i/>
-          <w:color w:val="1A1A1A"/>
-          <w:sz w:val="22"/>
-        </w:rPr>
-        <w:t>T_{\text{E2E}} = T_{\text{KB}} + T_{\text{GEN}}</w:t>
+          <w:sz w:val="22"/>
+        </w:rPr>
+        <w:t>T</w:t>
+      </w:r>
+      <w:r>
+        <w:rPr>
+          <w:rFonts w:ascii="Times New Roman" w:hAnsi="Times New Roman"/>
+          <w:sz w:val="22"/>
+          <w:vertAlign w:val="subscript"/>
+        </w:rPr>
+        <w:t>E2E</w:t>
+      </w:r>
+      <w:r>
+        <w:rPr>
+          <w:rFonts w:ascii="Times New Roman" w:hAnsi="Times New Roman"/>
+          <w:sz w:val="22"/>
+        </w:rPr>
+        <w:t xml:space="preserve"> = </w:t>
+      </w:r>
+      <w:r>
+        <w:rPr>
+          <w:rFonts w:ascii="Times New Roman" w:hAnsi="Times New Roman"/>
+          <w:i/>
+          <w:sz w:val="22"/>
+        </w:rPr>
+        <w:t>T</w:t>
+      </w:r>
+      <w:r>
+        <w:rPr>
+          <w:rFonts w:ascii="Times New Roman" w:hAnsi="Times New Roman"/>
+          <w:sz w:val="22"/>
+          <w:vertAlign w:val="subscript"/>
+        </w:rPr>
+        <w:t>KB</w:t>
+      </w:r>
+      <w:r>
+        <w:rPr>
+          <w:rFonts w:ascii="Times New Roman" w:hAnsi="Times New Roman"/>
+          <w:sz w:val="22"/>
+        </w:rPr>
+        <w:t xml:space="preserve"> + </w:t>
+      </w:r>
+      <w:r>
+        <w:rPr>
+          <w:rFonts w:ascii="Times New Roman" w:hAnsi="Times New Roman"/>
+          <w:i/>
+          <w:sz w:val="22"/>
+        </w:rPr>
+        <w:t>T</w:t>
+      </w:r>
+      <w:r>
+        <w:rPr>
+          <w:rFonts w:ascii="Times New Roman" w:hAnsi="Times New Roman"/>
+          <w:sz w:val="22"/>
+          <w:vertAlign w:val="subscript"/>
+        </w:rPr>
+        <w:t>GEN</w:t>
       </w:r>
       <w:r>
         <w:rPr>
@@ -4747,9 +5434,8 @@
       </w:r>
       <w:r>
         <w:rPr>
-          <w:rFonts w:ascii="Cambria Math" w:hAnsi="Cambria Math"/>
+          <w:rFonts w:ascii="Times New Roman" w:hAnsi="Times New Roman"/>
           <w:i/>
-          <w:color w:val="1A1A1A"/>
           <w:sz w:val="22"/>
         </w:rPr>
         <w:t>N</w:t>
@@ -4766,12 +5452,26 @@
       </w:r>
       <w:r>
         <w:rPr>
-          <w:rFonts w:ascii="Cambria Math" w:hAnsi="Cambria Math"/>
+          <w:rFonts w:ascii="Times New Roman" w:hAnsi="Times New Roman"/>
           <w:i/>
-          <w:color w:val="1A1A1A"/>
-          <w:sz w:val="22"/>
-        </w:rPr>
-        <w:t>T_{\text{job}}/N</w:t>
+          <w:sz w:val="22"/>
+        </w:rPr>
+        <w:t>T</w:t>
+      </w:r>
+      <w:r>
+        <w:rPr>
+          <w:rFonts w:ascii="Times New Roman" w:hAnsi="Times New Roman"/>
+          <w:sz w:val="22"/>
+          <w:vertAlign w:val="subscript"/>
+        </w:rPr>
+        <w:t>job</w:t>
+      </w:r>
+      <w:r>
+        <w:rPr>
+          <w:rFonts w:ascii="Times New Roman" w:hAnsi="Times New Roman"/>
+          <w:sz w:val="22"/>
+        </w:rPr>
+        <w:t>/N</w:t>
       </w:r>
       <w:r>
         <w:rPr>
@@ -4967,11 +5667,19 @@
               <w:rPr>
                 <w:rFonts w:ascii="Times New Roman" w:hAnsi="Times New Roman"/>
                 <w:b/>
-                <w:i w:val="0"/>
-                <w:color w:val="1A1A1A"/>
+                <w:i/>
                 <w:sz w:val="18"/>
               </w:rPr>
-              <w:t>$U_0$</w:t>
+              <w:t>U</w:t>
+            </w:r>
+            <w:r>
+              <w:rPr>
+                <w:rFonts w:ascii="Times New Roman" w:hAnsi="Times New Roman"/>
+                <w:b/>
+                <w:sz w:val="18"/>
+                <w:vertAlign w:val="subscript"/>
+              </w:rPr>
+              <w:t>0</w:t>
             </w:r>
           </w:p>
         </w:tc>
@@ -5085,11 +5793,19 @@
               <w:rPr>
                 <w:rFonts w:ascii="Times New Roman" w:hAnsi="Times New Roman"/>
                 <w:b/>
-                <w:i w:val="0"/>
-                <w:color w:val="1A1A1A"/>
+                <w:i/>
                 <w:sz w:val="18"/>
               </w:rPr>
-              <w:t>$U_{10}$</w:t>
+              <w:t>U</w:t>
+            </w:r>
+            <w:r>
+              <w:rPr>
+                <w:rFonts w:ascii="Times New Roman" w:hAnsi="Times New Roman"/>
+                <w:b/>
+                <w:sz w:val="18"/>
+                <w:vertAlign w:val="subscript"/>
+              </w:rPr>
+              <w:t>10</w:t>
             </w:r>
           </w:p>
         </w:tc>
@@ -5203,11 +5919,19 @@
               <w:rPr>
                 <w:rFonts w:ascii="Times New Roman" w:hAnsi="Times New Roman"/>
                 <w:b/>
-                <w:i w:val="0"/>
-                <w:color w:val="1A1A1A"/>
+                <w:i/>
                 <w:sz w:val="18"/>
               </w:rPr>
-              <w:t>$U_{25}$</w:t>
+              <w:t>U</w:t>
+            </w:r>
+            <w:r>
+              <w:rPr>
+                <w:rFonts w:ascii="Times New Roman" w:hAnsi="Times New Roman"/>
+                <w:b/>
+                <w:sz w:val="18"/>
+                <w:vertAlign w:val="subscript"/>
+              </w:rPr>
+              <w:t>25</w:t>
             </w:r>
           </w:p>
         </w:tc>
@@ -5321,11 +6045,19 @@
               <w:rPr>
                 <w:rFonts w:ascii="Times New Roman" w:hAnsi="Times New Roman"/>
                 <w:b/>
-                <w:i w:val="0"/>
-                <w:color w:val="1A1A1A"/>
+                <w:i/>
                 <w:sz w:val="18"/>
               </w:rPr>
-              <w:t>$U_{50}$</w:t>
+              <w:t>U</w:t>
+            </w:r>
+            <w:r>
+              <w:rPr>
+                <w:rFonts w:ascii="Times New Roman" w:hAnsi="Times New Roman"/>
+                <w:b/>
+                <w:sz w:val="18"/>
+                <w:vertAlign w:val="subscript"/>
+              </w:rPr>
+              <w:t>50</w:t>
             </w:r>
           </w:p>
         </w:tc>
@@ -5439,11 +6171,19 @@
               <w:rPr>
                 <w:rFonts w:ascii="Times New Roman" w:hAnsi="Times New Roman"/>
                 <w:b/>
-                <w:i w:val="0"/>
-                <w:color w:val="1A1A1A"/>
+                <w:i/>
                 <w:sz w:val="18"/>
               </w:rPr>
-              <w:t>$U_{100}$</w:t>
+              <w:t>U</w:t>
+            </w:r>
+            <w:r>
+              <w:rPr>
+                <w:rFonts w:ascii="Times New Roman" w:hAnsi="Times New Roman"/>
+                <w:b/>
+                <w:sz w:val="18"/>
+                <w:vertAlign w:val="subscript"/>
+              </w:rPr>
+              <w:t>100</w:t>
             </w:r>
           </w:p>
         </w:tc>
@@ -5557,12 +6297,10 @@
       </w:r>
       <w:r>
         <w:rPr>
-          <w:rFonts w:ascii="Cambria Math" w:hAnsi="Cambria Math"/>
-          <w:i/>
-          <w:color w:val="1A1A1A"/>
-          <w:sz w:val="22"/>
-        </w:rPr>
-        <w:t>\times</w:t>
+          <w:rFonts w:ascii="Times New Roman" w:hAnsi="Times New Roman"/>
+          <w:sz w:val="22"/>
+        </w:rPr>
+        <w:t>×</w:t>
       </w:r>
       <w:r>
         <w:rPr>
@@ -5582,11 +6320,105 @@
       </w:pPr>
       <w:r>
         <w:rPr>
-          <w:rFonts w:ascii="Cambria Math" w:hAnsi="Cambria Math"/>
+          <w:rFonts w:ascii="Times New Roman" w:hAnsi="Times New Roman"/>
+          <w:sz w:val="22"/>
+        </w:rPr>
+        <w:t>CacheHitRate</w:t>
+      </w:r>
+      <w:r>
+        <w:rPr>
+          <w:rFonts w:ascii="Times New Roman" w:hAnsi="Times New Roman"/>
+          <w:sz w:val="22"/>
+        </w:rPr>
+        <w:t xml:space="preserve"> = ≤ft(\frac{</w:t>
+      </w:r>
+      <w:r>
+        <w:rPr>
+          <w:rFonts w:ascii="Times New Roman" w:hAnsi="Times New Roman"/>
+          <w:sz w:val="22"/>
+        </w:rPr>
+        <w:t>ReusedChunks</w:t>
+      </w:r>
+      <w:r>
+        <w:rPr>
+          <w:rFonts w:ascii="Times New Roman" w:hAnsi="Times New Roman"/>
+          <w:sz w:val="22"/>
+        </w:rPr>
+        <w:t>}{</w:t>
+      </w:r>
+      <w:r>
+        <w:rPr>
+          <w:rFonts w:ascii="Times New Roman" w:hAnsi="Times New Roman"/>
+          <w:sz w:val="22"/>
+        </w:rPr>
+        <w:t>EligibleChunks</w:t>
+      </w:r>
+      <w:r>
+        <w:rPr>
+          <w:rFonts w:ascii="Times New Roman" w:hAnsi="Times New Roman"/>
+          <w:sz w:val="22"/>
+        </w:rPr>
+        <w:t xml:space="preserve">}) × 100%,     </w:t>
+      </w:r>
+      <w:r>
+        <w:rPr>
+          <w:rFonts w:ascii="Times New Roman" w:hAnsi="Times New Roman"/>
+          <w:sz w:val="22"/>
+        </w:rPr>
+        <w:t>Speedup</w:t>
+      </w:r>
+      <w:r>
+        <w:rPr>
+          <w:rFonts w:ascii="Times New Roman" w:hAnsi="Times New Roman"/>
+          <w:sz w:val="22"/>
+        </w:rPr>
+        <w:t xml:space="preserve"> = \frac{</w:t>
+      </w:r>
+      <w:r>
+        <w:rPr>
+          <w:rFonts w:ascii="Times New Roman" w:hAnsi="Times New Roman"/>
           <w:i/>
           <w:sz w:val="22"/>
         </w:rPr>
-        <w:t>\text{CacheHitRate} = \left(\frac{\text{ReusedChunks}}{\text{EligibleChunks}}\right) \times 100\%, \quad \text{Speedup} = \frac{T_{\text{full}}}{T_{\text{incremental}}}</w:t>
+        <w:t>T</w:t>
+      </w:r>
+      <w:r>
+        <w:rPr>
+          <w:rFonts w:ascii="Times New Roman" w:hAnsi="Times New Roman"/>
+          <w:sz w:val="22"/>
+          <w:vertAlign w:val="subscript"/>
+        </w:rPr>
+        <w:t>full</w:t>
+      </w:r>
+      <w:r>
+        <w:rPr>
+          <w:rFonts w:ascii="Times New Roman" w:hAnsi="Times New Roman"/>
+          <w:sz w:val="22"/>
+        </w:rPr>
+        <w:t>}{</w:t>
+      </w:r>
+      <w:r>
+        <w:rPr>
+          <w:rFonts w:ascii="Times New Roman" w:hAnsi="Times New Roman"/>
+          <w:i/>
+          <w:sz w:val="22"/>
+        </w:rPr>
+        <w:t>T</w:t>
+      </w:r>
+      <w:r>
+        <w:rPr>
+          <w:rFonts w:ascii="Times New Roman" w:hAnsi="Times New Roman"/>
+          <w:sz w:val="22"/>
+          <w:vertAlign w:val="subscript"/>
+        </w:rPr>
+        <w:t>incremental</w:t>
+      </w:r>
+      <w:r>
+        <w:rPr>
+          <w:rFonts w:ascii="Times New Roman" w:hAnsi="Times New Roman"/>
+          <w:sz w:val="22"/>
+        </w:rPr>
+        <w:t>}</w:t>
       </w:r>
     </w:p>
     <w:p>
@@ -5674,12 +6506,33 @@
       </w:r>
       <w:r>
         <w:rPr>
-          <w:rFonts w:ascii="Cambria Math" w:hAnsi="Cambria Math"/>
+          <w:rFonts w:ascii="Times New Roman" w:hAnsi="Times New Roman"/>
           <w:i/>
-          <w:color w:val="1A1A1A"/>
-          <w:sz w:val="22"/>
-        </w:rPr>
-        <w:t>T_{\text{embed}} \approx 11.2\text{ ms}</w:t>
+          <w:sz w:val="22"/>
+        </w:rPr>
+        <w:t>T</w:t>
+      </w:r>
+      <w:r>
+        <w:rPr>
+          <w:rFonts w:ascii="Times New Roman" w:hAnsi="Times New Roman"/>
+          <w:sz w:val="22"/>
+          <w:vertAlign w:val="subscript"/>
+        </w:rPr>
+        <w:t>embed</w:t>
+      </w:r>
+      <w:r>
+        <w:rPr>
+          <w:rFonts w:ascii="Times New Roman" w:hAnsi="Times New Roman"/>
+          <w:sz w:val="22"/>
+        </w:rPr>
+        <w:t xml:space="preserve"> ≈ 11.2</w:t>
+      </w:r>
+      <w:r>
+        <w:rPr>
+          <w:rFonts w:ascii="Times New Roman" w:hAnsi="Times New Roman"/>
+          <w:sz w:val="22"/>
+        </w:rPr>
+        <w:t xml:space="preserve"> ms</w:t>
       </w:r>
       <w:r>
         <w:rPr>
@@ -5723,12 +6576,10 @@
       </w:r>
       <w:r>
         <w:rPr>
-          <w:rFonts w:ascii="Cambria Math" w:hAnsi="Cambria Math"/>
-          <w:i/>
-          <w:color w:val="1A1A1A"/>
-          <w:sz w:val="22"/>
-        </w:rPr>
-        <w:t>C \in \{1, 2, 5, 10\}</w:t>
+          <w:rFonts w:ascii="Times New Roman" w:hAnsi="Times New Roman"/>
+          <w:sz w:val="22"/>
+        </w:rPr>
+        <w:t>C ∈ {1, 2, 5, 10}</w:t>
       </w:r>
       <w:r>
         <w:rPr>
@@ -5742,9 +6593,7 @@
       </w:r>
       <w:r>
         <w:rPr>
-          <w:rFonts w:ascii="Cambria Math" w:hAnsi="Cambria Math"/>
-          <w:i/>
-          <w:color w:val="1A1A1A"/>
+          <w:rFonts w:ascii="Times New Roman" w:hAnsi="Times New Roman"/>
           <w:sz w:val="22"/>
         </w:rPr>
         <w:t>C = 20</w:t>
@@ -5776,9 +6625,7 @@
       </w:r>
       <w:r>
         <w:rPr>
-          <w:rFonts w:ascii="Cambria Math" w:hAnsi="Cambria Math"/>
-          <w:i/>
-          <w:color w:val="1A1A1A"/>
+          <w:rFonts w:ascii="Times New Roman" w:hAnsi="Times New Roman"/>
           <w:sz w:val="22"/>
         </w:rPr>
         <w:t>N = 1</w:t>
@@ -5795,9 +6642,7 @@
       </w:r>
       <w:r>
         <w:rPr>
-          <w:rFonts w:ascii="Cambria Math" w:hAnsi="Cambria Math"/>
-          <w:i/>
-          <w:color w:val="1A1A1A"/>
+          <w:rFonts w:ascii="Times New Roman" w:hAnsi="Times New Roman"/>
           <w:sz w:val="22"/>
         </w:rPr>
         <w:t>N = 5</w:t>
@@ -5814,9 +6659,7 @@
       </w:r>
       <w:r>
         <w:rPr>
-          <w:rFonts w:ascii="Cambria Math" w:hAnsi="Cambria Math"/>
-          <w:i/>
-          <w:color w:val="1A1A1A"/>
+          <w:rFonts w:ascii="Times New Roman" w:hAnsi="Times New Roman"/>
           <w:sz w:val="22"/>
         </w:rPr>
         <w:t>C = 1 \dots 20</w:t>
@@ -5839,11 +6682,100 @@
       </w:pPr>
       <w:r>
         <w:rPr>
-          <w:rFonts w:ascii="Cambria Math" w:hAnsi="Cambria Math"/>
+          <w:rFonts w:ascii="Times New Roman" w:hAnsi="Times New Roman"/>
+          <w:sz w:val="22"/>
+        </w:rPr>
+        <w:t>Throughput</w:t>
+      </w:r>
+      <w:r>
+        <w:rPr>
+          <w:rFonts w:ascii="Times New Roman" w:hAnsi="Times New Roman"/>
+          <w:sz w:val="22"/>
+        </w:rPr>
+        <w:t xml:space="preserve"> = \frac{</w:t>
+      </w:r>
+      <w:r>
+        <w:rPr>
+          <w:rFonts w:ascii="Times New Roman" w:hAnsi="Times New Roman"/>
           <w:i/>
           <w:sz w:val="22"/>
         </w:rPr>
-        <w:t>\text{Throughput} = \frac{N_{\text{successful}}}{\Delta t}, \quad \text{SuccessRate} = \left(\frac{N_{\text{successful}}}{N_{\text{total}}}\right) \times 100\%</w:t>
+        <w:t>N</w:t>
+      </w:r>
+      <w:r>
+        <w:rPr>
+          <w:rFonts w:ascii="Times New Roman" w:hAnsi="Times New Roman"/>
+          <w:sz w:val="22"/>
+          <w:vertAlign w:val="subscript"/>
+        </w:rPr>
+        <w:t>successful</w:t>
+      </w:r>
+      <w:r>
+        <w:rPr>
+          <w:rFonts w:ascii="Times New Roman" w:hAnsi="Times New Roman"/>
+          <w:sz w:val="22"/>
+        </w:rPr>
+        <w:t xml:space="preserve">}{Δ t},     </w:t>
+      </w:r>
+      <w:r>
+        <w:rPr>
+          <w:rFonts w:ascii="Times New Roman" w:hAnsi="Times New Roman"/>
+          <w:sz w:val="22"/>
+        </w:rPr>
+        <w:t>SuccessRate</w:t>
+      </w:r>
+      <w:r>
+        <w:rPr>
+          <w:rFonts w:ascii="Times New Roman" w:hAnsi="Times New Roman"/>
+          <w:sz w:val="22"/>
+        </w:rPr>
+        <w:t xml:space="preserve"> = ≤ft(\frac{</w:t>
+      </w:r>
+      <w:r>
+        <w:rPr>
+          <w:rFonts w:ascii="Times New Roman" w:hAnsi="Times New Roman"/>
+          <w:i/>
+          <w:sz w:val="22"/>
+        </w:rPr>
+        <w:t>N</w:t>
+      </w:r>
+      <w:r>
+        <w:rPr>
+          <w:rFonts w:ascii="Times New Roman" w:hAnsi="Times New Roman"/>
+          <w:sz w:val="22"/>
+          <w:vertAlign w:val="subscript"/>
+        </w:rPr>
+        <w:t>successful</w:t>
+      </w:r>
+      <w:r>
+        <w:rPr>
+          <w:rFonts w:ascii="Times New Roman" w:hAnsi="Times New Roman"/>
+          <w:sz w:val="22"/>
+        </w:rPr>
+        <w:t>}{</w:t>
+      </w:r>
+      <w:r>
+        <w:rPr>
+          <w:rFonts w:ascii="Times New Roman" w:hAnsi="Times New Roman"/>
+          <w:i/>
+          <w:sz w:val="22"/>
+        </w:rPr>
+        <w:t>N</w:t>
+      </w:r>
+      <w:r>
+        <w:rPr>
+          <w:rFonts w:ascii="Times New Roman" w:hAnsi="Times New Roman"/>
+          <w:sz w:val="22"/>
+          <w:vertAlign w:val="subscript"/>
+        </w:rPr>
+        <w:t>total</w:t>
+      </w:r>
+      <w:r>
+        <w:rPr>
+          <w:rFonts w:ascii="Times New Roman" w:hAnsi="Times New Roman"/>
+          <w:sz w:val="22"/>
+        </w:rPr>
+        <w:t>}) × 100%</w:t>
       </w:r>
     </w:p>
     <w:p>
@@ -5964,9 +6896,7 @@
       </w:r>
       <w:r>
         <w:rPr>
-          <w:rFonts w:ascii="Cambria Math" w:hAnsi="Cambria Math"/>
-          <w:i/>
-          <w:color w:val="1A1A1A"/>
+          <w:rFonts w:ascii="Times New Roman" w:hAnsi="Times New Roman"/>
           <w:sz w:val="22"/>
         </w:rPr>
         <w:t>K=3</w:t>
@@ -5983,9 +6913,7 @@
       </w:r>
       <w:r>
         <w:rPr>
-          <w:rFonts w:ascii="Cambria Math" w:hAnsi="Cambria Math"/>
-          <w:i/>
-          <w:color w:val="1A1A1A"/>
+          <w:rFonts w:ascii="Times New Roman" w:hAnsi="Times New Roman"/>
           <w:sz w:val="22"/>
         </w:rPr>
         <w:t>T=0.2</w:t>
@@ -6002,9 +6930,7 @@
       </w:r>
       <w:r>
         <w:rPr>
-          <w:rFonts w:ascii="Cambria Math" w:hAnsi="Cambria Math"/>
-          <w:i/>
-          <w:color w:val="1A1A1A"/>
+          <w:rFonts w:ascii="Times New Roman" w:hAnsi="Times New Roman"/>
           <w:sz w:val="22"/>
         </w:rPr>
         <w:t>p=0.9</w:t>
@@ -6021,12 +6947,26 @@
       </w:r>
       <w:r>
         <w:rPr>
-          <w:rFonts w:ascii="Cambria Math" w:hAnsi="Cambria Math"/>
+          <w:rFonts w:ascii="Times New Roman" w:hAnsi="Times New Roman"/>
           <w:i/>
-          <w:color w:val="1A1A1A"/>
-          <w:sz w:val="22"/>
-        </w:rPr>
-        <w:t>N_{\text{ctx}}=4{,}096</w:t>
+          <w:sz w:val="22"/>
+        </w:rPr>
+        <w:t>N</w:t>
+      </w:r>
+      <w:r>
+        <w:rPr>
+          <w:rFonts w:ascii="Times New Roman" w:hAnsi="Times New Roman"/>
+          <w:sz w:val="22"/>
+          <w:vertAlign w:val="subscript"/>
+        </w:rPr>
+        <w:t>ctx</w:t>
+      </w:r>
+      <w:r>
+        <w:rPr>
+          <w:rFonts w:ascii="Times New Roman" w:hAnsi="Times New Roman"/>
+          <w:sz w:val="22"/>
+        </w:rPr>
+        <w:t>=4{,}096</w:t>
       </w:r>
       <w:r>
         <w:rPr>
@@ -6040,12 +6980,26 @@
       </w:r>
       <w:r>
         <w:rPr>
-          <w:rFonts w:ascii="Cambria Math" w:hAnsi="Cambria Math"/>
+          <w:rFonts w:ascii="Times New Roman" w:hAnsi="Times New Roman"/>
           <w:i/>
-          <w:color w:val="1A1A1A"/>
-          <w:sz w:val="22"/>
-        </w:rPr>
-        <w:t>N_{\text{out}}=2{,}048</w:t>
+          <w:sz w:val="22"/>
+        </w:rPr>
+        <w:t>N</w:t>
+      </w:r>
+      <w:r>
+        <w:rPr>
+          <w:rFonts w:ascii="Times New Roman" w:hAnsi="Times New Roman"/>
+          <w:sz w:val="22"/>
+          <w:vertAlign w:val="subscript"/>
+        </w:rPr>
+        <w:t>out</w:t>
+      </w:r>
+      <w:r>
+        <w:rPr>
+          <w:rFonts w:ascii="Times New Roman" w:hAnsi="Times New Roman"/>
+          <w:sz w:val="22"/>
+        </w:rPr>
+        <w:t>=2{,}048</w:t>
       </w:r>
       <w:r>
         <w:rPr>
@@ -6089,12 +7043,19 @@
       </w:r>
       <w:r>
         <w:rPr>
-          <w:rFonts w:ascii="Cambria Math" w:hAnsi="Cambria Math"/>
+          <w:rFonts w:ascii="Times New Roman" w:hAnsi="Times New Roman"/>
           <w:i/>
-          <w:color w:val="1A1A1A"/>
-          <w:sz w:val="22"/>
-        </w:rPr>
-        <w:t>T_{\text{KB}}</w:t>
+          <w:sz w:val="22"/>
+        </w:rPr>
+        <w:t>T</w:t>
+      </w:r>
+      <w:r>
+        <w:rPr>
+          <w:rFonts w:ascii="Times New Roman" w:hAnsi="Times New Roman"/>
+          <w:sz w:val="22"/>
+          <w:vertAlign w:val="subscript"/>
+        </w:rPr>
+        <w:t>KB</w:t>
       </w:r>
       <w:r>
         <w:rPr>
@@ -6108,12 +7069,10 @@
       </w:r>
       <w:r>
         <w:rPr>
-          <w:rFonts w:ascii="Cambria Math" w:hAnsi="Cambria Math"/>
-          <w:i/>
-          <w:color w:val="1A1A1A"/>
-          <w:sz w:val="22"/>
-        </w:rPr>
-        <w:t>\kappa</w:t>
+          <w:rFonts w:ascii="Times New Roman" w:hAnsi="Times New Roman"/>
+          <w:sz w:val="22"/>
+        </w:rPr>
+        <w:t>κ</w:t>
       </w:r>
       <w:r>
         <w:rPr>
@@ -6127,12 +7086,17 @@
       </w:r>
       <w:r>
         <w:rPr>
-          <w:rFonts w:ascii="Cambria Math" w:hAnsi="Cambria Math"/>
-          <w:i/>
-          <w:color w:val="1A1A1A"/>
-          <w:sz w:val="22"/>
-        </w:rPr>
-        <w:t>\text{ICC}(2,k)</w:t>
+          <w:rFonts w:ascii="Times New Roman" w:hAnsi="Times New Roman"/>
+          <w:sz w:val="22"/>
+        </w:rPr>
+        <w:t>ICC</w:t>
+      </w:r>
+      <w:r>
+        <w:rPr>
+          <w:rFonts w:ascii="Times New Roman" w:hAnsi="Times New Roman"/>
+          <w:sz w:val="22"/>
+        </w:rPr>
+        <w:t>(2,k)</w:t>
       </w:r>
       <w:r>
         <w:rPr>
@@ -6222,12 +7186,10 @@
       </w:r>
       <w:r>
         <w:rPr>
-          <w:rFonts w:ascii="Cambria Math" w:hAnsi="Cambria Math"/>
-          <w:i/>
-          <w:color w:val="1A1A1A"/>
-          <w:sz w:val="22"/>
-        </w:rPr>
-        <w:t>\ge 90\%</w:t>
+          <w:rFonts w:ascii="Times New Roman" w:hAnsi="Times New Roman"/>
+          <w:sz w:val="22"/>
+        </w:rPr>
+        <w:t>≥ 90%</w:t>
       </w:r>
       <w:r>
         <w:rPr>
@@ -6267,12 +7229,33 @@
       </w:r>
       <w:r>
         <w:rPr>
-          <w:rFonts w:ascii="Cambria Math" w:hAnsi="Cambria Math"/>
+          <w:rFonts w:ascii="Times New Roman" w:hAnsi="Times New Roman"/>
           <w:i/>
-          <w:color w:val="1A1A1A"/>
-          <w:sz w:val="22"/>
-        </w:rPr>
-        <w:t>T_{\text{E2E}} \le 3.0\text{ s}</w:t>
+          <w:sz w:val="22"/>
+        </w:rPr>
+        <w:t>T</w:t>
+      </w:r>
+      <w:r>
+        <w:rPr>
+          <w:rFonts w:ascii="Times New Roman" w:hAnsi="Times New Roman"/>
+          <w:sz w:val="22"/>
+          <w:vertAlign w:val="subscript"/>
+        </w:rPr>
+        <w:t>E2E</w:t>
+      </w:r>
+      <w:r>
+        <w:rPr>
+          <w:rFonts w:ascii="Times New Roman" w:hAnsi="Times New Roman"/>
+          <w:sz w:val="22"/>
+        </w:rPr>
+        <w:t xml:space="preserve"> ≤ 3.0</w:t>
+      </w:r>
+      <w:r>
+        <w:rPr>
+          <w:rFonts w:ascii="Times New Roman" w:hAnsi="Times New Roman"/>
+          <w:sz w:val="22"/>
+        </w:rPr>
+        <w:t xml:space="preserve"> s</w:t>
       </w:r>
       <w:r>
         <w:rPr>
@@ -6312,12 +7295,10 @@
       </w:r>
       <w:r>
         <w:rPr>
-          <w:rFonts w:ascii="Cambria Math" w:hAnsi="Cambria Math"/>
-          <w:i/>
-          <w:color w:val="1A1A1A"/>
-          <w:sz w:val="22"/>
-        </w:rPr>
-        <w:t>100\%</w:t>
+          <w:rFonts w:ascii="Times New Roman" w:hAnsi="Times New Roman"/>
+          <w:sz w:val="22"/>
+        </w:rPr>
+        <w:t>100%</w:t>
       </w:r>
       <w:r>
         <w:rPr>
@@ -6331,12 +7312,10 @@
       </w:r>
       <w:r>
         <w:rPr>
-          <w:rFonts w:ascii="Cambria Math" w:hAnsi="Cambria Math"/>
-          <w:i/>
-          <w:color w:val="1A1A1A"/>
-          <w:sz w:val="22"/>
-        </w:rPr>
-        <w:t>C \le 10</w:t>
+          <w:rFonts w:ascii="Times New Roman" w:hAnsi="Times New Roman"/>
+          <w:sz w:val="22"/>
+        </w:rPr>
+        <w:t>C ≤ 10</w:t>
       </w:r>
       <w:r>
         <w:rPr>
@@ -7753,9 +8732,7 @@
       </w:r>
       <w:r>
         <w:rPr>
-          <w:rFonts w:ascii="Cambria Math" w:hAnsi="Cambria Math"/>
-          <w:i/>
-          <w:color w:val="1A1A1A"/>
+          <w:rFonts w:ascii="Times New Roman" w:hAnsi="Times New Roman"/>
           <w:sz w:val="22"/>
         </w:rPr>
         <w:t>TC = 2</w:t>
@@ -7806,12 +8783,24 @@
       </w:r>
       <w:r>
         <w:rPr>
-          <w:rFonts w:ascii="Cambria Math" w:hAnsi="Cambria Math"/>
-          <w:i/>
-          <w:color w:val="1A1A1A"/>
-          <w:sz w:val="22"/>
-        </w:rPr>
-        <w:t>TC = 1\text{--}2</w:t>
+          <w:rFonts w:ascii="Times New Roman" w:hAnsi="Times New Roman"/>
+          <w:sz w:val="22"/>
+        </w:rPr>
+        <w:t>TC = 1</w:t>
+      </w:r>
+      <w:r>
+        <w:rPr>
+          <w:rFonts w:ascii="Times New Roman" w:hAnsi="Times New Roman"/>
+          <w:sz w:val="22"/>
+        </w:rPr>
+        <w:t>--</w:t>
+      </w:r>
+      <w:r>
+        <w:rPr>
+          <w:rFonts w:ascii="Times New Roman" w:hAnsi="Times New Roman"/>
+          <w:sz w:val="22"/>
+        </w:rPr>
+        <w:t>2</w:t>
       </w:r>
       <w:r>
         <w:rPr>
@@ -7841,12 +8830,24 @@
       </w:r>
       <w:r>
         <w:rPr>
-          <w:rFonts w:ascii="Cambria Math" w:hAnsi="Cambria Math"/>
-          <w:i/>
-          <w:color w:val="1A1A1A"/>
-          <w:sz w:val="22"/>
-        </w:rPr>
-        <w:t>TC = 1\text{--}2</w:t>
+          <w:rFonts w:ascii="Times New Roman" w:hAnsi="Times New Roman"/>
+          <w:sz w:val="22"/>
+        </w:rPr>
+        <w:t>TC = 1</w:t>
+      </w:r>
+      <w:r>
+        <w:rPr>
+          <w:rFonts w:ascii="Times New Roman" w:hAnsi="Times New Roman"/>
+          <w:sz w:val="22"/>
+        </w:rPr>
+        <w:t>--</w:t>
+      </w:r>
+      <w:r>
+        <w:rPr>
+          <w:rFonts w:ascii="Times New Roman" w:hAnsi="Times New Roman"/>
+          <w:sz w:val="22"/>
+        </w:rPr>
+        <w:t>2</w:t>
       </w:r>
       <w:r>
         <w:rPr>
@@ -7876,9 +8877,7 @@
       </w:r>
       <w:r>
         <w:rPr>
-          <w:rFonts w:ascii="Cambria Math" w:hAnsi="Cambria Math"/>
-          <w:i/>
-          <w:color w:val="1A1A1A"/>
+          <w:rFonts w:ascii="Times New Roman" w:hAnsi="Times New Roman"/>
           <w:sz w:val="22"/>
         </w:rPr>
         <w:t>CE = 1</w:t>
@@ -7910,12 +8909,17 @@
       </w:r>
       <w:r>
         <w:rPr>
-          <w:rFonts w:ascii="Cambria Math" w:hAnsi="Cambria Math"/>
-          <w:i/>
-          <w:color w:val="1A1A1A"/>
-          <w:sz w:val="22"/>
-        </w:rPr>
-        <w:t>\text{ICC}(2,k)</w:t>
+          <w:rFonts w:ascii="Times New Roman" w:hAnsi="Times New Roman"/>
+          <w:sz w:val="22"/>
+        </w:rPr>
+        <w:t>ICC</w:t>
+      </w:r>
+      <w:r>
+        <w:rPr>
+          <w:rFonts w:ascii="Times New Roman" w:hAnsi="Times New Roman"/>
+          <w:sz w:val="22"/>
+        </w:rPr>
+        <w:t>(2,k)</w:t>
       </w:r>
       <w:r>
         <w:rPr>
@@ -7929,12 +8933,10 @@
       </w:r>
       <w:r>
         <w:rPr>
-          <w:rFonts w:ascii="Cambria Math" w:hAnsi="Cambria Math"/>
-          <w:i/>
-          <w:color w:val="1A1A1A"/>
-          <w:sz w:val="22"/>
-        </w:rPr>
-        <w:t>\kappa = 0.610</w:t>
+          <w:rFonts w:ascii="Times New Roman" w:hAnsi="Times New Roman"/>
+          <w:sz w:val="22"/>
+        </w:rPr>
+        <w:t>κ = 0.610</w:t>
       </w:r>
       <w:r>
         <w:rPr>
@@ -7948,12 +8950,17 @@
       </w:r>
       <w:r>
         <w:rPr>
-          <w:rFonts w:ascii="Cambria Math" w:hAnsi="Cambria Math"/>
-          <w:i/>
-          <w:color w:val="1A1A1A"/>
-          <w:sz w:val="22"/>
-        </w:rPr>
-        <w:t>\text{ICC} = 0.830</w:t>
+          <w:rFonts w:ascii="Times New Roman" w:hAnsi="Times New Roman"/>
+          <w:sz w:val="22"/>
+        </w:rPr>
+        <w:t>ICC</w:t>
+      </w:r>
+      <w:r>
+        <w:rPr>
+          <w:rFonts w:ascii="Times New Roman" w:hAnsi="Times New Roman"/>
+          <w:sz w:val="22"/>
+        </w:rPr>
+        <w:t xml:space="preserve"> = 0.830</w:t>
       </w:r>
       <w:r>
         <w:rPr>
@@ -7967,12 +8974,17 @@
       </w:r>
       <w:r>
         <w:rPr>
-          <w:rFonts w:ascii="Cambria Math" w:hAnsi="Cambria Math"/>
-          <w:i/>
-          <w:color w:val="1A1A1A"/>
-          <w:sz w:val="22"/>
-        </w:rPr>
-        <w:t>\text{ICC} = 0.764</w:t>
+          <w:rFonts w:ascii="Times New Roman" w:hAnsi="Times New Roman"/>
+          <w:sz w:val="22"/>
+        </w:rPr>
+        <w:t>ICC</w:t>
+      </w:r>
+      <w:r>
+        <w:rPr>
+          <w:rFonts w:ascii="Times New Roman" w:hAnsi="Times New Roman"/>
+          <w:sz w:val="22"/>
+        </w:rPr>
+        <w:t xml:space="preserve"> = 0.764</w:t>
       </w:r>
       <w:r>
         <w:rPr>
@@ -7986,12 +8998,17 @@
       </w:r>
       <w:r>
         <w:rPr>
-          <w:rFonts w:ascii="Cambria Math" w:hAnsi="Cambria Math"/>
-          <w:i/>
-          <w:color w:val="1A1A1A"/>
-          <w:sz w:val="22"/>
-        </w:rPr>
-        <w:t>\text{ICC} = 0.872</w:t>
+          <w:rFonts w:ascii="Times New Roman" w:hAnsi="Times New Roman"/>
+          <w:sz w:val="22"/>
+        </w:rPr>
+        <w:t>ICC</w:t>
+      </w:r>
+      <w:r>
+        <w:rPr>
+          <w:rFonts w:ascii="Times New Roman" w:hAnsi="Times New Roman"/>
+          <w:sz w:val="22"/>
+        </w:rPr>
+        <w:t xml:space="preserve"> = 0.872</w:t>
       </w:r>
       <w:r>
         <w:rPr>
@@ -8005,12 +9022,17 @@
       </w:r>
       <w:r>
         <w:rPr>
-          <w:rFonts w:ascii="Cambria Math" w:hAnsi="Cambria Math"/>
-          <w:i/>
-          <w:color w:val="1A1A1A"/>
-          <w:sz w:val="22"/>
-        </w:rPr>
-        <w:t>\text{ICC} = 0.946</w:t>
+          <w:rFonts w:ascii="Times New Roman" w:hAnsi="Times New Roman"/>
+          <w:sz w:val="22"/>
+        </w:rPr>
+        <w:t>ICC</w:t>
+      </w:r>
+      <w:r>
+        <w:rPr>
+          <w:rFonts w:ascii="Times New Roman" w:hAnsi="Times New Roman"/>
+          <w:sz w:val="22"/>
+        </w:rPr>
+        <w:t xml:space="preserve"> = 0.946</w:t>
       </w:r>
       <w:r>
         <w:rPr>
@@ -9226,12 +10248,21 @@
             <w:r/>
             <w:r>
               <w:rPr>
-                <w:rFonts w:ascii="Cambria Math" w:hAnsi="Cambria Math"/>
+                <w:rFonts w:ascii="Times New Roman" w:hAnsi="Times New Roman"/>
+                <w:b/>
                 <w:i/>
-                <w:color w:val="1A1A1A"/>
                 <w:sz w:val="19"/>
               </w:rPr>
-              <w:t>T_{KB}</w:t>
+              <w:t>T</w:t>
+            </w:r>
+            <w:r>
+              <w:rPr>
+                <w:rFonts w:ascii="Times New Roman" w:hAnsi="Times New Roman"/>
+                <w:b/>
+                <w:sz w:val="19"/>
+                <w:vertAlign w:val="subscript"/>
+              </w:rPr>
+              <w:t>KB</w:t>
             </w:r>
             <w:r>
               <w:rPr>
@@ -9264,12 +10295,21 @@
             <w:r/>
             <w:r>
               <w:rPr>
-                <w:rFonts w:ascii="Cambria Math" w:hAnsi="Cambria Math"/>
+                <w:rFonts w:ascii="Times New Roman" w:hAnsi="Times New Roman"/>
+                <w:b/>
                 <w:i/>
-                <w:color w:val="1A1A1A"/>
                 <w:sz w:val="19"/>
               </w:rPr>
-              <w:t>T_{GEN}</w:t>
+              <w:t>T</w:t>
+            </w:r>
+            <w:r>
+              <w:rPr>
+                <w:rFonts w:ascii="Times New Roman" w:hAnsi="Times New Roman"/>
+                <w:b/>
+                <w:sz w:val="19"/>
+                <w:vertAlign w:val="subscript"/>
+              </w:rPr>
+              <w:t>GEN</w:t>
             </w:r>
             <w:r>
               <w:rPr>
@@ -9302,12 +10342,21 @@
             <w:r/>
             <w:r>
               <w:rPr>
-                <w:rFonts w:ascii="Cambria Math" w:hAnsi="Cambria Math"/>
+                <w:rFonts w:ascii="Times New Roman" w:hAnsi="Times New Roman"/>
+                <w:b/>
                 <w:i/>
-                <w:color w:val="1A1A1A"/>
                 <w:sz w:val="19"/>
               </w:rPr>
-              <w:t>T_{E2E}</w:t>
+              <w:t>T</w:t>
+            </w:r>
+            <w:r>
+              <w:rPr>
+                <w:rFonts w:ascii="Times New Roman" w:hAnsi="Times New Roman"/>
+                <w:b/>
+                <w:sz w:val="19"/>
+                <w:vertAlign w:val="subscript"/>
+              </w:rPr>
+              <w:t>E2E</w:t>
             </w:r>
             <w:r>
               <w:rPr>
@@ -10132,12 +11181,33 @@
       </w:r>
       <w:r>
         <w:rPr>
-          <w:rFonts w:ascii="Cambria Math" w:hAnsi="Cambria Math"/>
+          <w:rFonts w:ascii="Times New Roman" w:hAnsi="Times New Roman"/>
           <w:i/>
-          <w:color w:val="1A1A1A"/>
-          <w:sz w:val="22"/>
-        </w:rPr>
-        <w:t>T_{\text{KB}} = 0.0\text{ ms}</w:t>
+          <w:sz w:val="22"/>
+        </w:rPr>
+        <w:t>T</w:t>
+      </w:r>
+      <w:r>
+        <w:rPr>
+          <w:rFonts w:ascii="Times New Roman" w:hAnsi="Times New Roman"/>
+          <w:sz w:val="22"/>
+          <w:vertAlign w:val="subscript"/>
+        </w:rPr>
+        <w:t>KB</w:t>
+      </w:r>
+      <w:r>
+        <w:rPr>
+          <w:rFonts w:ascii="Times New Roman" w:hAnsi="Times New Roman"/>
+          <w:sz w:val="22"/>
+        </w:rPr>
+        <w:t xml:space="preserve"> = 0.0</w:t>
+      </w:r>
+      <w:r>
+        <w:rPr>
+          <w:rFonts w:ascii="Times New Roman" w:hAnsi="Times New Roman"/>
+          <w:sz w:val="22"/>
+        </w:rPr>
+        <w:t xml:space="preserve"> ms</w:t>
       </w:r>
       <w:r>
         <w:rPr>
@@ -10151,12 +11221,33 @@
       </w:r>
       <w:r>
         <w:rPr>
-          <w:rFonts w:ascii="Cambria Math" w:hAnsi="Cambria Math"/>
+          <w:rFonts w:ascii="Times New Roman" w:hAnsi="Times New Roman"/>
           <w:i/>
-          <w:color w:val="1A1A1A"/>
-          <w:sz w:val="22"/>
-        </w:rPr>
-        <w:t>T_{\text{E2E}} = 1419.3\text{ ms}</w:t>
+          <w:sz w:val="22"/>
+        </w:rPr>
+        <w:t>T</w:t>
+      </w:r>
+      <w:r>
+        <w:rPr>
+          <w:rFonts w:ascii="Times New Roman" w:hAnsi="Times New Roman"/>
+          <w:sz w:val="22"/>
+          <w:vertAlign w:val="subscript"/>
+        </w:rPr>
+        <w:t>E2E</w:t>
+      </w:r>
+      <w:r>
+        <w:rPr>
+          <w:rFonts w:ascii="Times New Roman" w:hAnsi="Times New Roman"/>
+          <w:sz w:val="22"/>
+        </w:rPr>
+        <w:t xml:space="preserve"> = 1419.3</w:t>
+      </w:r>
+      <w:r>
+        <w:rPr>
+          <w:rFonts w:ascii="Times New Roman" w:hAnsi="Times New Roman"/>
+          <w:sz w:val="22"/>
+        </w:rPr>
+        <w:t xml:space="preserve"> ms</w:t>
       </w:r>
       <w:r>
         <w:rPr>
@@ -10196,12 +11287,33 @@
       </w:r>
       <w:r>
         <w:rPr>
-          <w:rFonts w:ascii="Cambria Math" w:hAnsi="Cambria Math"/>
+          <w:rFonts w:ascii="Times New Roman" w:hAnsi="Times New Roman"/>
           <w:i/>
-          <w:color w:val="1A1A1A"/>
-          <w:sz w:val="22"/>
-        </w:rPr>
-        <w:t>T_{\text{KB}} = 0.0\text{ ms}</w:t>
+          <w:sz w:val="22"/>
+        </w:rPr>
+        <w:t>T</w:t>
+      </w:r>
+      <w:r>
+        <w:rPr>
+          <w:rFonts w:ascii="Times New Roman" w:hAnsi="Times New Roman"/>
+          <w:sz w:val="22"/>
+          <w:vertAlign w:val="subscript"/>
+        </w:rPr>
+        <w:t>KB</w:t>
+      </w:r>
+      <w:r>
+        <w:rPr>
+          <w:rFonts w:ascii="Times New Roman" w:hAnsi="Times New Roman"/>
+          <w:sz w:val="22"/>
+        </w:rPr>
+        <w:t xml:space="preserve"> = 0.0</w:t>
+      </w:r>
+      <w:r>
+        <w:rPr>
+          <w:rFonts w:ascii="Times New Roman" w:hAnsi="Times New Roman"/>
+          <w:sz w:val="22"/>
+        </w:rPr>
+        <w:t xml:space="preserve"> ms</w:t>
       </w:r>
       <w:r>
         <w:rPr>
@@ -10215,12 +11327,33 @@
       </w:r>
       <w:r>
         <w:rPr>
-          <w:rFonts w:ascii="Cambria Math" w:hAnsi="Cambria Math"/>
+          <w:rFonts w:ascii="Times New Roman" w:hAnsi="Times New Roman"/>
           <w:i/>
-          <w:color w:val="1A1A1A"/>
-          <w:sz w:val="22"/>
-        </w:rPr>
-        <w:t>T_{\text{E2E}} = 1375.7\text{ ms}</w:t>
+          <w:sz w:val="22"/>
+        </w:rPr>
+        <w:t>T</w:t>
+      </w:r>
+      <w:r>
+        <w:rPr>
+          <w:rFonts w:ascii="Times New Roman" w:hAnsi="Times New Roman"/>
+          <w:sz w:val="22"/>
+          <w:vertAlign w:val="subscript"/>
+        </w:rPr>
+        <w:t>E2E</w:t>
+      </w:r>
+      <w:r>
+        <w:rPr>
+          <w:rFonts w:ascii="Times New Roman" w:hAnsi="Times New Roman"/>
+          <w:sz w:val="22"/>
+        </w:rPr>
+        <w:t xml:space="preserve"> = 1375.7</w:t>
+      </w:r>
+      <w:r>
+        <w:rPr>
+          <w:rFonts w:ascii="Times New Roman" w:hAnsi="Times New Roman"/>
+          <w:sz w:val="22"/>
+        </w:rPr>
+        <w:t xml:space="preserve"> ms</w:t>
       </w:r>
       <w:r>
         <w:rPr>
@@ -10260,12 +11393,33 @@
       </w:r>
       <w:r>
         <w:rPr>
-          <w:rFonts w:ascii="Cambria Math" w:hAnsi="Cambria Math"/>
+          <w:rFonts w:ascii="Times New Roman" w:hAnsi="Times New Roman"/>
           <w:i/>
-          <w:color w:val="1A1A1A"/>
-          <w:sz w:val="22"/>
-        </w:rPr>
-        <w:t>T_{\text{KB}} = 53.7\text{ ms}</w:t>
+          <w:sz w:val="22"/>
+        </w:rPr>
+        <w:t>T</w:t>
+      </w:r>
+      <w:r>
+        <w:rPr>
+          <w:rFonts w:ascii="Times New Roman" w:hAnsi="Times New Roman"/>
+          <w:sz w:val="22"/>
+          <w:vertAlign w:val="subscript"/>
+        </w:rPr>
+        <w:t>KB</w:t>
+      </w:r>
+      <w:r>
+        <w:rPr>
+          <w:rFonts w:ascii="Times New Roman" w:hAnsi="Times New Roman"/>
+          <w:sz w:val="22"/>
+        </w:rPr>
+        <w:t xml:space="preserve"> = 53.7</w:t>
+      </w:r>
+      <w:r>
+        <w:rPr>
+          <w:rFonts w:ascii="Times New Roman" w:hAnsi="Times New Roman"/>
+          <w:sz w:val="22"/>
+        </w:rPr>
+        <w:t xml:space="preserve"> ms</w:t>
       </w:r>
       <w:r>
         <w:rPr>
@@ -10279,12 +11433,17 @@
       </w:r>
       <w:r>
         <w:rPr>
-          <w:rFonts w:ascii="Cambria Math" w:hAnsi="Cambria Math"/>
-          <w:i/>
-          <w:color w:val="1A1A1A"/>
-          <w:sz w:val="22"/>
-        </w:rPr>
-        <w:t>1551.0\text{ ms}</w:t>
+          <w:rFonts w:ascii="Times New Roman" w:hAnsi="Times New Roman"/>
+          <w:sz w:val="22"/>
+        </w:rPr>
+        <w:t>1551.0</w:t>
+      </w:r>
+      <w:r>
+        <w:rPr>
+          <w:rFonts w:ascii="Times New Roman" w:hAnsi="Times New Roman"/>
+          <w:sz w:val="22"/>
+        </w:rPr>
+        <w:t xml:space="preserve"> ms</w:t>
       </w:r>
       <w:r>
         <w:rPr>
@@ -10324,12 +11483,33 @@
       </w:r>
       <w:r>
         <w:rPr>
-          <w:rFonts w:ascii="Cambria Math" w:hAnsi="Cambria Math"/>
+          <w:rFonts w:ascii="Times New Roman" w:hAnsi="Times New Roman"/>
           <w:i/>
-          <w:color w:val="1A1A1A"/>
-          <w:sz w:val="22"/>
-        </w:rPr>
-        <w:t>T_{\text{KB}} = 0.1\text{ ms}</w:t>
+          <w:sz w:val="22"/>
+        </w:rPr>
+        <w:t>T</w:t>
+      </w:r>
+      <w:r>
+        <w:rPr>
+          <w:rFonts w:ascii="Times New Roman" w:hAnsi="Times New Roman"/>
+          <w:sz w:val="22"/>
+          <w:vertAlign w:val="subscript"/>
+        </w:rPr>
+        <w:t>KB</w:t>
+      </w:r>
+      <w:r>
+        <w:rPr>
+          <w:rFonts w:ascii="Times New Roman" w:hAnsi="Times New Roman"/>
+          <w:sz w:val="22"/>
+        </w:rPr>
+        <w:t xml:space="preserve"> = 0.1</w:t>
+      </w:r>
+      <w:r>
+        <w:rPr>
+          <w:rFonts w:ascii="Times New Roman" w:hAnsi="Times New Roman"/>
+          <w:sz w:val="22"/>
+        </w:rPr>
+        <w:t xml:space="preserve"> ms</w:t>
       </w:r>
       <w:r>
         <w:rPr>
@@ -10343,12 +11523,17 @@
       </w:r>
       <w:r>
         <w:rPr>
-          <w:rFonts w:ascii="Cambria Math" w:hAnsi="Cambria Math"/>
-          <w:i/>
-          <w:color w:val="1A1A1A"/>
-          <w:sz w:val="22"/>
-        </w:rPr>
-        <w:t>\text{Top-}K = 3</w:t>
+          <w:rFonts w:ascii="Times New Roman" w:hAnsi="Times New Roman"/>
+          <w:sz w:val="22"/>
+        </w:rPr>
+        <w:t>Top-</w:t>
+      </w:r>
+      <w:r>
+        <w:rPr>
+          <w:rFonts w:ascii="Times New Roman" w:hAnsi="Times New Roman"/>
+          <w:sz w:val="22"/>
+        </w:rPr>
+        <w:t>K = 3</w:t>
       </w:r>
       <w:r>
         <w:rPr>
@@ -10362,12 +11547,17 @@
       </w:r>
       <w:r>
         <w:rPr>
-          <w:rFonts w:ascii="Cambria Math" w:hAnsi="Cambria Math"/>
-          <w:i/>
-          <w:color w:val="1A1A1A"/>
-          <w:sz w:val="22"/>
-        </w:rPr>
-        <w:t>1462.7\text{ ms}</w:t>
+          <w:rFonts w:ascii="Times New Roman" w:hAnsi="Times New Roman"/>
+          <w:sz w:val="22"/>
+        </w:rPr>
+        <w:t>1462.7</w:t>
+      </w:r>
+      <w:r>
+        <w:rPr>
+          <w:rFonts w:ascii="Times New Roman" w:hAnsi="Times New Roman"/>
+          <w:sz w:val="22"/>
+        </w:rPr>
+        <w:t xml:space="preserve"> ms</w:t>
       </w:r>
       <w:r>
         <w:rPr>
@@ -10381,12 +11571,10 @@
       </w:r>
       <w:r>
         <w:rPr>
-          <w:rFonts w:ascii="Cambria Math" w:hAnsi="Cambria Math"/>
-          <w:i/>
-          <w:color w:val="1A1A1A"/>
-          <w:sz w:val="22"/>
-        </w:rPr>
-        <w:t>1.06\times</w:t>
+          <w:rFonts w:ascii="Times New Roman" w:hAnsi="Times New Roman"/>
+          <w:sz w:val="22"/>
+        </w:rPr>
+        <w:t>1.06×</w:t>
       </w:r>
       <w:r>
         <w:rPr>
@@ -10605,12 +11793,42 @@
             </w:r>
             <w:r>
               <w:rPr>
-                <w:rFonts w:ascii="Cambria Math" w:hAnsi="Cambria Math"/>
+                <w:rFonts w:ascii="Times New Roman" w:hAnsi="Times New Roman"/>
                 <w:i/>
-                <w:color w:val="1A1A1A"/>
                 <w:sz w:val="18"/>
               </w:rPr>
-              <w:t>T_{hash} + T_{lookup}</w:t>
+              <w:t>T</w:t>
+            </w:r>
+            <w:r>
+              <w:rPr>
+                <w:rFonts w:ascii="Times New Roman" w:hAnsi="Times New Roman"/>
+                <w:sz w:val="18"/>
+                <w:vertAlign w:val="subscript"/>
+              </w:rPr>
+              <w:t>hash</w:t>
+            </w:r>
+            <w:r>
+              <w:rPr>
+                <w:rFonts w:ascii="Times New Roman" w:hAnsi="Times New Roman"/>
+                <w:sz w:val="18"/>
+              </w:rPr>
+              <w:t xml:space="preserve"> + </w:t>
+            </w:r>
+            <w:r>
+              <w:rPr>
+                <w:rFonts w:ascii="Times New Roman" w:hAnsi="Times New Roman"/>
+                <w:i/>
+                <w:sz w:val="18"/>
+              </w:rPr>
+              <w:t>T</w:t>
+            </w:r>
+            <w:r>
+              <w:rPr>
+                <w:rFonts w:ascii="Times New Roman" w:hAnsi="Times New Roman"/>
+                <w:sz w:val="18"/>
+                <w:vertAlign w:val="subscript"/>
+              </w:rPr>
+              <w:t>lookup</w:t>
             </w:r>
             <w:r>
               <w:rPr>
@@ -10771,12 +11989,19 @@
             </w:r>
             <w:r>
               <w:rPr>
-                <w:rFonts w:ascii="Cambria Math" w:hAnsi="Cambria Math"/>
+                <w:rFonts w:ascii="Times New Roman" w:hAnsi="Times New Roman"/>
                 <w:i/>
-                <w:color w:val="1A1A1A"/>
                 <w:sz w:val="18"/>
               </w:rPr>
-              <w:t>T_{embed}</w:t>
+              <w:t>T</w:t>
+            </w:r>
+            <w:r>
+              <w:rPr>
+                <w:rFonts w:ascii="Times New Roman" w:hAnsi="Times New Roman"/>
+                <w:sz w:val="18"/>
+                <w:vertAlign w:val="subscript"/>
+              </w:rPr>
+              <w:t>embed</w:t>
             </w:r>
             <w:r>
               <w:rPr>
@@ -10937,12 +12162,19 @@
             </w:r>
             <w:r>
               <w:rPr>
-                <w:rFonts w:ascii="Cambria Math" w:hAnsi="Cambria Math"/>
+                <w:rFonts w:ascii="Times New Roman" w:hAnsi="Times New Roman"/>
                 <w:i/>
-                <w:color w:val="1A1A1A"/>
                 <w:sz w:val="18"/>
               </w:rPr>
-              <w:t>T_{index}</w:t>
+              <w:t>T</w:t>
+            </w:r>
+            <w:r>
+              <w:rPr>
+                <w:rFonts w:ascii="Times New Roman" w:hAnsi="Times New Roman"/>
+                <w:sz w:val="18"/>
+                <w:vertAlign w:val="subscript"/>
+              </w:rPr>
+              <w:t>index</w:t>
             </w:r>
             <w:r>
               <w:rPr>
@@ -11099,7 +12331,35 @@
                 <w:color w:val="1A1A1A"/>
                 <w:sz w:val="18"/>
               </w:rPr>
-              <w:t>Total KB Maintenance ($T_{KB}$)</w:t>
+              <w:t>Total KB Maintenance (</w:t>
+            </w:r>
+            <w:r>
+              <w:rPr>
+                <w:rFonts w:ascii="Times New Roman" w:hAnsi="Times New Roman"/>
+                <w:b/>
+                <w:i/>
+                <w:sz w:val="18"/>
+              </w:rPr>
+              <w:t>T</w:t>
+            </w:r>
+            <w:r>
+              <w:rPr>
+                <w:rFonts w:ascii="Times New Roman" w:hAnsi="Times New Roman"/>
+                <w:b/>
+                <w:sz w:val="18"/>
+                <w:vertAlign w:val="subscript"/>
+              </w:rPr>
+              <w:t>KB</w:t>
+            </w:r>
+            <w:r>
+              <w:rPr>
+                <w:rFonts w:ascii="Times New Roman" w:hAnsi="Times New Roman"/>
+                <w:b/>
+                <w:i w:val="0"/>
+                <w:color w:val="1A1A1A"/>
+                <w:sz w:val="18"/>
+              </w:rPr>
+              <w:t>)</w:t>
             </w:r>
           </w:p>
         </w:tc>
@@ -11397,12 +12657,19 @@
             </w:r>
             <w:r>
               <w:rPr>
-                <w:rFonts w:ascii="Cambria Math" w:hAnsi="Cambria Math"/>
+                <w:rFonts w:ascii="Times New Roman" w:hAnsi="Times New Roman"/>
                 <w:i/>
-                <w:color w:val="1A1A1A"/>
                 <w:sz w:val="18"/>
               </w:rPr>
-              <w:t>T_{LLM}</w:t>
+              <w:t>T</w:t>
+            </w:r>
+            <w:r>
+              <w:rPr>
+                <w:rFonts w:ascii="Times New Roman" w:hAnsi="Times New Roman"/>
+                <w:sz w:val="18"/>
+                <w:vertAlign w:val="subscript"/>
+              </w:rPr>
+              <w:t>LLM</w:t>
             </w:r>
             <w:r>
               <w:rPr>
@@ -11563,12 +12830,19 @@
             </w:r>
             <w:r>
               <w:rPr>
-                <w:rFonts w:ascii="Cambria Math" w:hAnsi="Cambria Math"/>
+                <w:rFonts w:ascii="Times New Roman" w:hAnsi="Times New Roman"/>
                 <w:i/>
-                <w:color w:val="1A1A1A"/>
                 <w:sz w:val="18"/>
               </w:rPr>
-              <w:t>T_{validation}</w:t>
+              <w:t>T</w:t>
+            </w:r>
+            <w:r>
+              <w:rPr>
+                <w:rFonts w:ascii="Times New Roman" w:hAnsi="Times New Roman"/>
+                <w:sz w:val="18"/>
+                <w:vertAlign w:val="subscript"/>
+              </w:rPr>
+              <w:t>validation</w:t>
             </w:r>
             <w:r>
               <w:rPr>
@@ -11725,7 +12999,35 @@
                 <w:color w:val="1A1A1A"/>
                 <w:sz w:val="18"/>
               </w:rPr>
-              <w:t>Total End-to-End ($T_{E2E}$)</w:t>
+              <w:t>Total End-to-End (</w:t>
+            </w:r>
+            <w:r>
+              <w:rPr>
+                <w:rFonts w:ascii="Times New Roman" w:hAnsi="Times New Roman"/>
+                <w:b/>
+                <w:i/>
+                <w:sz w:val="18"/>
+              </w:rPr>
+              <w:t>T</w:t>
+            </w:r>
+            <w:r>
+              <w:rPr>
+                <w:rFonts w:ascii="Times New Roman" w:hAnsi="Times New Roman"/>
+                <w:b/>
+                <w:sz w:val="18"/>
+                <w:vertAlign w:val="subscript"/>
+              </w:rPr>
+              <w:t>E2E</w:t>
+            </w:r>
+            <w:r>
+              <w:rPr>
+                <w:rFonts w:ascii="Times New Roman" w:hAnsi="Times New Roman"/>
+                <w:b/>
+                <w:i w:val="0"/>
+                <w:color w:val="1A1A1A"/>
+                <w:sz w:val="18"/>
+              </w:rPr>
+              <w:t>)</w:t>
             </w:r>
           </w:p>
         </w:tc>
@@ -11928,12 +13230,33 @@
       </w:r>
       <w:r>
         <w:rPr>
-          <w:rFonts w:ascii="Cambria Math" w:hAnsi="Cambria Math"/>
+          <w:rFonts w:ascii="Times New Roman" w:hAnsi="Times New Roman"/>
           <w:i/>
-          <w:color w:val="1A1A1A"/>
-          <w:sz w:val="22"/>
-        </w:rPr>
-        <w:t>T_{\text{LLM}} \approx 1.46\text{ s}</w:t>
+          <w:sz w:val="22"/>
+        </w:rPr>
+        <w:t>T</w:t>
+      </w:r>
+      <w:r>
+        <w:rPr>
+          <w:rFonts w:ascii="Times New Roman" w:hAnsi="Times New Roman"/>
+          <w:sz w:val="22"/>
+          <w:vertAlign w:val="subscript"/>
+        </w:rPr>
+        <w:t>LLM</w:t>
+      </w:r>
+      <w:r>
+        <w:rPr>
+          <w:rFonts w:ascii="Times New Roman" w:hAnsi="Times New Roman"/>
+          <w:sz w:val="22"/>
+        </w:rPr>
+        <w:t xml:space="preserve"> ≈ 1.46</w:t>
+      </w:r>
+      <w:r>
+        <w:rPr>
+          <w:rFonts w:ascii="Times New Roman" w:hAnsi="Times New Roman"/>
+          <w:sz w:val="22"/>
+        </w:rPr>
+        <w:t xml:space="preserve"> s</w:t>
       </w:r>
       <w:r>
         <w:rPr>
@@ -11947,9 +13270,7 @@
       </w:r>
       <w:r>
         <w:rPr>
-          <w:rFonts w:ascii="Cambria Math" w:hAnsi="Cambria Math"/>
-          <w:i/>
-          <w:color w:val="1A1A1A"/>
+          <w:rFonts w:ascii="Times New Roman" w:hAnsi="Times New Roman"/>
           <w:sz w:val="22"/>
         </w:rPr>
         <w:t>1497.3 / 1551.0</w:t>
@@ -12106,12 +13427,21 @@
             <w:r/>
             <w:r>
               <w:rPr>
-                <w:rFonts w:ascii="Cambria Math" w:hAnsi="Cambria Math"/>
+                <w:rFonts w:ascii="Times New Roman" w:hAnsi="Times New Roman"/>
+                <w:b/>
                 <w:i/>
-                <w:color w:val="1A1A1A"/>
                 <w:sz w:val="19"/>
               </w:rPr>
-              <w:t>U_0</w:t>
+              <w:t>U</w:t>
+            </w:r>
+            <w:r>
+              <w:rPr>
+                <w:rFonts w:ascii="Times New Roman" w:hAnsi="Times New Roman"/>
+                <w:b/>
+                <w:sz w:val="19"/>
+                <w:vertAlign w:val="subscript"/>
+              </w:rPr>
+              <w:t>0</w:t>
             </w:r>
             <w:r>
               <w:rPr>
@@ -12144,12 +13474,21 @@
             <w:r/>
             <w:r>
               <w:rPr>
-                <w:rFonts w:ascii="Cambria Math" w:hAnsi="Cambria Math"/>
+                <w:rFonts w:ascii="Times New Roman" w:hAnsi="Times New Roman"/>
+                <w:b/>
                 <w:i/>
-                <w:color w:val="1A1A1A"/>
                 <w:sz w:val="19"/>
               </w:rPr>
-              <w:t>U_{10}</w:t>
+              <w:t>U</w:t>
+            </w:r>
+            <w:r>
+              <w:rPr>
+                <w:rFonts w:ascii="Times New Roman" w:hAnsi="Times New Roman"/>
+                <w:b/>
+                <w:sz w:val="19"/>
+                <w:vertAlign w:val="subscript"/>
+              </w:rPr>
+              <w:t>10</w:t>
             </w:r>
             <w:r>
               <w:rPr>
@@ -12182,12 +13521,21 @@
             <w:r/>
             <w:r>
               <w:rPr>
-                <w:rFonts w:ascii="Cambria Math" w:hAnsi="Cambria Math"/>
+                <w:rFonts w:ascii="Times New Roman" w:hAnsi="Times New Roman"/>
+                <w:b/>
                 <w:i/>
-                <w:color w:val="1A1A1A"/>
                 <w:sz w:val="19"/>
               </w:rPr>
-              <w:t>U_{25}</w:t>
+              <w:t>U</w:t>
+            </w:r>
+            <w:r>
+              <w:rPr>
+                <w:rFonts w:ascii="Times New Roman" w:hAnsi="Times New Roman"/>
+                <w:b/>
+                <w:sz w:val="19"/>
+                <w:vertAlign w:val="subscript"/>
+              </w:rPr>
+              <w:t>25</w:t>
             </w:r>
             <w:r>
               <w:rPr>
@@ -12220,12 +13568,21 @@
             <w:r/>
             <w:r>
               <w:rPr>
-                <w:rFonts w:ascii="Cambria Math" w:hAnsi="Cambria Math"/>
+                <w:rFonts w:ascii="Times New Roman" w:hAnsi="Times New Roman"/>
+                <w:b/>
                 <w:i/>
-                <w:color w:val="1A1A1A"/>
                 <w:sz w:val="19"/>
               </w:rPr>
-              <w:t>U_{50}</w:t>
+              <w:t>U</w:t>
+            </w:r>
+            <w:r>
+              <w:rPr>
+                <w:rFonts w:ascii="Times New Roman" w:hAnsi="Times New Roman"/>
+                <w:b/>
+                <w:sz w:val="19"/>
+                <w:vertAlign w:val="subscript"/>
+              </w:rPr>
+              <w:t>50</w:t>
             </w:r>
             <w:r>
               <w:rPr>
@@ -12258,12 +13615,21 @@
             <w:r/>
             <w:r>
               <w:rPr>
-                <w:rFonts w:ascii="Cambria Math" w:hAnsi="Cambria Math"/>
+                <w:rFonts w:ascii="Times New Roman" w:hAnsi="Times New Roman"/>
+                <w:b/>
                 <w:i/>
-                <w:color w:val="1A1A1A"/>
                 <w:sz w:val="19"/>
               </w:rPr>
-              <w:t>U_{100}</w:t>
+              <w:t>U</w:t>
+            </w:r>
+            <w:r>
+              <w:rPr>
+                <w:rFonts w:ascii="Times New Roman" w:hAnsi="Times New Roman"/>
+                <w:b/>
+                <w:sz w:val="19"/>
+                <w:vertAlign w:val="subscript"/>
+              </w:rPr>
+              <w:t>100</w:t>
             </w:r>
             <w:r>
               <w:rPr>
@@ -12306,12 +13672,47 @@
             </w:r>
             <w:r>
               <w:rPr>
-                <w:rFonts w:ascii="Cambria Math" w:hAnsi="Cambria Math"/>
+                <w:rFonts w:ascii="Times New Roman" w:hAnsi="Times New Roman"/>
+                <w:b/>
                 <w:i/>
-                <w:color w:val="1A1A1A"/>
                 <w:sz w:val="19"/>
               </w:rPr>
-              <w:t>U_{100} / U_0</w:t>
+              <w:t>U</w:t>
+            </w:r>
+            <w:r>
+              <w:rPr>
+                <w:rFonts w:ascii="Times New Roman" w:hAnsi="Times New Roman"/>
+                <w:b/>
+                <w:sz w:val="19"/>
+                <w:vertAlign w:val="subscript"/>
+              </w:rPr>
+              <w:t>100</w:t>
+            </w:r>
+            <w:r>
+              <w:rPr>
+                <w:rFonts w:ascii="Times New Roman" w:hAnsi="Times New Roman"/>
+                <w:b/>
+                <w:sz w:val="19"/>
+              </w:rPr>
+              <w:t xml:space="preserve"> / </w:t>
+            </w:r>
+            <w:r>
+              <w:rPr>
+                <w:rFonts w:ascii="Times New Roman" w:hAnsi="Times New Roman"/>
+                <w:b/>
+                <w:i/>
+                <w:sz w:val="19"/>
+              </w:rPr>
+              <w:t>U</w:t>
+            </w:r>
+            <w:r>
+              <w:rPr>
+                <w:rFonts w:ascii="Times New Roman" w:hAnsi="Times New Roman"/>
+                <w:b/>
+                <w:sz w:val="19"/>
+                <w:vertAlign w:val="subscript"/>
+              </w:rPr>
+              <w:t>0</w:t>
             </w:r>
             <w:r>
               <w:rPr>
@@ -13314,12 +14715,10 @@
       </w:r>
       <w:r>
         <w:rPr>
-          <w:rFonts w:ascii="Cambria Math" w:hAnsi="Cambria Math"/>
-          <w:i/>
-          <w:color w:val="1A1A1A"/>
-          <w:sz w:val="22"/>
-        </w:rPr>
-        <w:t>C \in \{1, 2, 5, 10, 20\}</w:t>
+          <w:rFonts w:ascii="Times New Roman" w:hAnsi="Times New Roman"/>
+          <w:sz w:val="22"/>
+        </w:rPr>
+        <w:t>C ∈ {1, 2, 5, 10, 20}</w:t>
       </w:r>
       <w:r>
         <w:rPr>
@@ -13395,9 +14794,9 @@
             </w:r>
             <w:r>
               <w:rPr>
-                <w:rFonts w:ascii="Cambria Math" w:hAnsi="Cambria Math"/>
+                <w:rFonts w:ascii="Times New Roman" w:hAnsi="Times New Roman"/>
+                <w:b/>
                 <w:i/>
-                <w:color w:val="1A1A1A"/>
                 <w:sz w:val="19"/>
               </w:rPr>
               <w:t>C</w:t>
@@ -13443,9 +14842,8 @@
             </w:r>
             <w:r>
               <w:rPr>
-                <w:rFonts w:ascii="Cambria Math" w:hAnsi="Cambria Math"/>
-                <w:i/>
-                <w:color w:val="1A1A1A"/>
+                <w:rFonts w:ascii="Times New Roman" w:hAnsi="Times New Roman"/>
+                <w:b/>
                 <w:sz w:val="19"/>
               </w:rPr>
               <w:t>Q/s</w:t>
@@ -13491,12 +14889,19 @@
             </w:r>
             <w:r>
               <w:rPr>
-                <w:rFonts w:ascii="Cambria Math" w:hAnsi="Cambria Math"/>
-                <w:i/>
-                <w:color w:val="1A1A1A"/>
+                <w:rFonts w:ascii="Times New Roman" w:hAnsi="Times New Roman"/>
+                <w:b/>
                 <w:sz w:val="19"/>
               </w:rPr>
-              <w:t>Q/\text{min}</w:t>
+              <w:t>Q/</w:t>
+            </w:r>
+            <w:r>
+              <w:rPr>
+                <w:rFonts w:ascii="Times New Roman" w:hAnsi="Times New Roman"/>
+                <w:b/>
+                <w:sz w:val="19"/>
+              </w:rPr>
+              <w:t>min</w:t>
             </w:r>
             <w:r>
               <w:rPr>
@@ -15974,12 +17379,19 @@
       </w:r>
       <w:r>
         <w:rPr>
-          <w:rFonts w:ascii="Cambria Math" w:hAnsi="Cambria Math"/>
+          <w:rFonts w:ascii="Times New Roman" w:hAnsi="Times New Roman"/>
           <w:i/>
-          <w:color w:val="1A1A1A"/>
-          <w:sz w:val="22"/>
-        </w:rPr>
-        <w:t>T_{\text{KB}}</w:t>
+          <w:sz w:val="22"/>
+        </w:rPr>
+        <w:t>T</w:t>
+      </w:r>
+      <w:r>
+        <w:rPr>
+          <w:rFonts w:ascii="Times New Roman" w:hAnsi="Times New Roman"/>
+          <w:sz w:val="22"/>
+          <w:vertAlign w:val="subscript"/>
+        </w:rPr>
+        <w:t>KB</w:t>
       </w:r>
       <w:r>
         <w:rPr>
@@ -16013,12 +17425,33 @@
       </w:r>
       <w:r>
         <w:rPr>
-          <w:rFonts w:ascii="Cambria Math" w:hAnsi="Cambria Math"/>
+          <w:rFonts w:ascii="Times New Roman" w:hAnsi="Times New Roman"/>
           <w:i/>
-          <w:color w:val="1A1A1A"/>
-          <w:sz w:val="22"/>
-        </w:rPr>
-        <w:t>T_{\text{LLM}} \approx 1.46\text{ s}</w:t>
+          <w:sz w:val="22"/>
+        </w:rPr>
+        <w:t>T</w:t>
+      </w:r>
+      <w:r>
+        <w:rPr>
+          <w:rFonts w:ascii="Times New Roman" w:hAnsi="Times New Roman"/>
+          <w:sz w:val="22"/>
+          <w:vertAlign w:val="subscript"/>
+        </w:rPr>
+        <w:t>LLM</w:t>
+      </w:r>
+      <w:r>
+        <w:rPr>
+          <w:rFonts w:ascii="Times New Roman" w:hAnsi="Times New Roman"/>
+          <w:sz w:val="22"/>
+        </w:rPr>
+        <w:t xml:space="preserve"> ≈ 1.46</w:t>
+      </w:r>
+      <w:r>
+        <w:rPr>
+          <w:rFonts w:ascii="Times New Roman" w:hAnsi="Times New Roman"/>
+          <w:sz w:val="22"/>
+        </w:rPr>
+        <w:t xml:space="preserve"> s</w:t>
       </w:r>
       <w:r>
         <w:rPr>
@@ -16112,12 +17545,19 @@
       </w:r>
       <w:r>
         <w:rPr>
-          <w:rFonts w:ascii="Cambria Math" w:hAnsi="Cambria Math"/>
+          <w:rFonts w:ascii="Times New Roman" w:hAnsi="Times New Roman"/>
           <w:i/>
-          <w:color w:val="1A1A1A"/>
-          <w:sz w:val="22"/>
-        </w:rPr>
-        <w:t>T_{\text{LLM}}</w:t>
+          <w:sz w:val="22"/>
+        </w:rPr>
+        <w:t>T</w:t>
+      </w:r>
+      <w:r>
+        <w:rPr>
+          <w:rFonts w:ascii="Times New Roman" w:hAnsi="Times New Roman"/>
+          <w:sz w:val="22"/>
+          <w:vertAlign w:val="subscript"/>
+        </w:rPr>
+        <w:t>LLM</w:t>
       </w:r>
       <w:r>
         <w:rPr>
@@ -16181,12 +17621,17 @@
       </w:r>
       <w:r>
         <w:rPr>
-          <w:rFonts w:ascii="Cambria Math" w:hAnsi="Cambria Math"/>
-          <w:i/>
-          <w:color w:val="1A1A1A"/>
-          <w:sz w:val="22"/>
-        </w:rPr>
-        <w:t>\text{Top-}K = 3</w:t>
+          <w:rFonts w:ascii="Times New Roman" w:hAnsi="Times New Roman"/>
+          <w:sz w:val="22"/>
+        </w:rPr>
+        <w:t>Top-</w:t>
+      </w:r>
+      <w:r>
+        <w:rPr>
+          <w:rFonts w:ascii="Times New Roman" w:hAnsi="Times New Roman"/>
+          <w:sz w:val="22"/>
+        </w:rPr>
+        <w:t>K = 3</w:t>
       </w:r>
       <w:r>
         <w:rPr>
@@ -16266,9 +17711,7 @@
       </w:r>
       <w:r>
         <w:rPr>
-          <w:rFonts w:ascii="Cambria Math" w:hAnsi="Cambria Math"/>
-          <w:i/>
-          <w:color w:val="1A1A1A"/>
+          <w:rFonts w:ascii="Times New Roman" w:hAnsi="Times New Roman"/>
           <w:sz w:val="22"/>
         </w:rPr>
         <w:t>C = 1</w:t>
@@ -16285,9 +17728,7 @@
       </w:r>
       <w:r>
         <w:rPr>
-          <w:rFonts w:ascii="Cambria Math" w:hAnsi="Cambria Math"/>
-          <w:i/>
-          <w:color w:val="1A1A1A"/>
+          <w:rFonts w:ascii="Times New Roman" w:hAnsi="Times New Roman"/>
           <w:sz w:val="22"/>
         </w:rPr>
         <w:t>20</w:t>
@@ -16339,12 +17780,10 @@
       </w:r>
       <w:r>
         <w:rPr>
-          <w:rFonts w:ascii="Cambria Math" w:hAnsi="Cambria Math"/>
-          <w:i/>
-          <w:color w:val="1A1A1A"/>
-          <w:sz w:val="22"/>
-        </w:rPr>
-        <w:t>C \in \{1, 2, 5\}</w:t>
+          <w:rFonts w:ascii="Times New Roman" w:hAnsi="Times New Roman"/>
+          <w:sz w:val="22"/>
+        </w:rPr>
+        <w:t>C ∈ {1, 2, 5}</w:t>
       </w:r>
       <w:r>
         <w:rPr>
@@ -16364,7 +17803,33 @@
           <w:color w:val="1A1A1A"/>
           <w:sz w:val="22"/>
         </w:rPr>
-        <w:t>1.36s and 3.56s (P95 $\le 5.91\text{ s}$)</w:t>
+        <w:t xml:space="preserve">1.36s and 3.56s (P95 </w:t>
+      </w:r>
+      <w:r>
+        <w:rPr>
+          <w:rFonts w:ascii="Times New Roman" w:hAnsi="Times New Roman"/>
+          <w:b/>
+          <w:sz w:val="22"/>
+        </w:rPr>
+        <w:t>≤ 5.91</w:t>
+      </w:r>
+      <w:r>
+        <w:rPr>
+          <w:rFonts w:ascii="Times New Roman" w:hAnsi="Times New Roman"/>
+          <w:b/>
+          <w:sz w:val="22"/>
+        </w:rPr>
+        <w:t xml:space="preserve"> s</w:t>
+      </w:r>
+      <w:r>
+        <w:rPr>
+          <w:rFonts w:ascii="Times New Roman" w:hAnsi="Times New Roman"/>
+          <w:b/>
+          <w:i w:val="0"/>
+          <w:color w:val="1A1A1A"/>
+          <w:sz w:val="22"/>
+        </w:rPr>
+        <w:t>)</w:t>
       </w:r>
       <w:r>
         <w:rPr>
@@ -16378,9 +17843,7 @@
       </w:r>
       <w:r>
         <w:rPr>
-          <w:rFonts w:ascii="Cambria Math" w:hAnsi="Cambria Math"/>
-          <w:i/>
-          <w:color w:val="1A1A1A"/>
+          <w:rFonts w:ascii="Times New Roman" w:hAnsi="Times New Roman"/>
           <w:sz w:val="22"/>
         </w:rPr>
         <w:t>C = 10</w:t>
@@ -16397,9 +17860,7 @@
       </w:r>
       <w:r>
         <w:rPr>
-          <w:rFonts w:ascii="Cambria Math" w:hAnsi="Cambria Math"/>
-          <w:i/>
-          <w:color w:val="1A1A1A"/>
+          <w:rFonts w:ascii="Times New Roman" w:hAnsi="Times New Roman"/>
           <w:sz w:val="22"/>
         </w:rPr>
         <w:t>C = 20</w:t>
@@ -16416,12 +17877,24 @@
       </w:r>
       <w:r>
         <w:rPr>
-          <w:rFonts w:ascii="Cambria Math" w:hAnsi="Cambria Math"/>
-          <w:i/>
-          <w:color w:val="1A1A1A"/>
-          <w:sz w:val="22"/>
-        </w:rPr>
-        <w:t>81.0\%\text{--}88.3\%</w:t>
+          <w:rFonts w:ascii="Times New Roman" w:hAnsi="Times New Roman"/>
+          <w:sz w:val="22"/>
+        </w:rPr>
+        <w:t>81.0%</w:t>
+      </w:r>
+      <w:r>
+        <w:rPr>
+          <w:rFonts w:ascii="Times New Roman" w:hAnsi="Times New Roman"/>
+          <w:sz w:val="22"/>
+        </w:rPr>
+        <w:t>--</w:t>
+      </w:r>
+      <w:r>
+        <w:rPr>
+          <w:rFonts w:ascii="Times New Roman" w:hAnsi="Times New Roman"/>
+          <w:sz w:val="22"/>
+        </w:rPr>
+        <w:t>88.3%</w:t>
       </w:r>
       <w:r>
         <w:rPr>
@@ -16441,7 +17914,25 @@
           <w:color w:val="1A1A1A"/>
           <w:sz w:val="22"/>
         </w:rPr>
-        <w:t>6.76s at $C = 10$ (P95 = 12.75s)</w:t>
+        <w:t xml:space="preserve">6.76s at </w:t>
+      </w:r>
+      <w:r>
+        <w:rPr>
+          <w:rFonts w:ascii="Times New Roman" w:hAnsi="Times New Roman"/>
+          <w:b/>
+          <w:sz w:val="22"/>
+        </w:rPr>
+        <w:t>C = 10</w:t>
+      </w:r>
+      <w:r>
+        <w:rPr>
+          <w:rFonts w:ascii="Times New Roman" w:hAnsi="Times New Roman"/>
+          <w:b/>
+          <w:i w:val="0"/>
+          <w:color w:val="1A1A1A"/>
+          <w:sz w:val="22"/>
+        </w:rPr>
+        <w:t xml:space="preserve"> (P95 = 12.75s)</w:t>
       </w:r>
       <w:r>
         <w:rPr>
@@ -16461,7 +17952,25 @@
           <w:color w:val="1A1A1A"/>
           <w:sz w:val="22"/>
         </w:rPr>
-        <w:t>13.95s at $C = 20$ (P95 = 25.00s)</w:t>
+        <w:t xml:space="preserve">13.95s at </w:t>
+      </w:r>
+      <w:r>
+        <w:rPr>
+          <w:rFonts w:ascii="Times New Roman" w:hAnsi="Times New Roman"/>
+          <w:b/>
+          <w:sz w:val="22"/>
+        </w:rPr>
+        <w:t>C = 20</w:t>
+      </w:r>
+      <w:r>
+        <w:rPr>
+          <w:rFonts w:ascii="Times New Roman" w:hAnsi="Times New Roman"/>
+          <w:b/>
+          <w:i w:val="0"/>
+          <w:color w:val="1A1A1A"/>
+          <w:sz w:val="22"/>
+        </w:rPr>
+        <w:t xml:space="preserve"> (P95 = 25.00s)</w:t>
       </w:r>
       <w:r>
         <w:rPr>
@@ -16526,9 +18035,7 @@
       </w:r>
       <w:r>
         <w:rPr>
-          <w:rFonts w:ascii="Cambria Math" w:hAnsi="Cambria Math"/>
-          <w:i/>
-          <w:color w:val="1A1A1A"/>
+          <w:rFonts w:ascii="Times New Roman" w:hAnsi="Times New Roman"/>
           <w:sz w:val="22"/>
         </w:rPr>
         <w:t>N = 1</w:t>
@@ -16565,12 +18072,33 @@
       </w:r>
       <w:r>
         <w:rPr>
-          <w:rFonts w:ascii="Cambria Math" w:hAnsi="Cambria Math"/>
+          <w:rFonts w:ascii="Times New Roman" w:hAnsi="Times New Roman"/>
           <w:i/>
-          <w:color w:val="1A1A1A"/>
-          <w:sz w:val="22"/>
-        </w:rPr>
-        <w:t>T_{\text{E2E}} = 1.46\text{ s}</w:t>
+          <w:sz w:val="22"/>
+        </w:rPr>
+        <w:t>T</w:t>
+      </w:r>
+      <w:r>
+        <w:rPr>
+          <w:rFonts w:ascii="Times New Roman" w:hAnsi="Times New Roman"/>
+          <w:sz w:val="22"/>
+          <w:vertAlign w:val="subscript"/>
+        </w:rPr>
+        <w:t>E2E</w:t>
+      </w:r>
+      <w:r>
+        <w:rPr>
+          <w:rFonts w:ascii="Times New Roman" w:hAnsi="Times New Roman"/>
+          <w:sz w:val="22"/>
+        </w:rPr>
+        <w:t xml:space="preserve"> = 1.46</w:t>
+      </w:r>
+      <w:r>
+        <w:rPr>
+          <w:rFonts w:ascii="Times New Roman" w:hAnsi="Times New Roman"/>
+          <w:sz w:val="22"/>
+        </w:rPr>
+        <w:t xml:space="preserve"> s</w:t>
       </w:r>
       <w:r>
         <w:rPr>
@@ -16590,7 +18118,25 @@
           <w:color w:val="1A1A1A"/>
           <w:sz w:val="22"/>
         </w:rPr>
-        <w:t>standardized batches of 5 MCQs ($N = 5$)</w:t>
+        <w:t>standardized batches of 5 MCQs (</w:t>
+      </w:r>
+      <w:r>
+        <w:rPr>
+          <w:rFonts w:ascii="Times New Roman" w:hAnsi="Times New Roman"/>
+          <w:b/>
+          <w:sz w:val="22"/>
+        </w:rPr>
+        <w:t>N = 5</w:t>
+      </w:r>
+      <w:r>
+        <w:rPr>
+          <w:rFonts w:ascii="Times New Roman" w:hAnsi="Times New Roman"/>
+          <w:b/>
+          <w:i w:val="0"/>
+          <w:color w:val="1A1A1A"/>
+          <w:sz w:val="22"/>
+        </w:rPr>
+        <w:t>)</w:t>
       </w:r>
       <w:r>
         <w:rPr>
@@ -16610,7 +18156,15 @@
           <w:color w:val="1A1A1A"/>
           <w:sz w:val="22"/>
         </w:rPr>
-        <w:t>0.73 Q/s (43.8 questions/min) at $C = 1$</w:t>
+        <w:t xml:space="preserve">0.73 Q/s (43.8 questions/min) at </w:t>
+      </w:r>
+      <w:r>
+        <w:rPr>
+          <w:rFonts w:ascii="Times New Roman" w:hAnsi="Times New Roman"/>
+          <w:b/>
+          <w:sz w:val="22"/>
+        </w:rPr>
+        <w:t>C = 1</w:t>
       </w:r>
       <w:r>
         <w:rPr>
@@ -16630,7 +18184,15 @@
           <w:color w:val="1A1A1A"/>
           <w:sz w:val="22"/>
         </w:rPr>
-        <w:t>0.82 Q/s (49.2 questions/min) at $C = 5$</w:t>
+        <w:t xml:space="preserve">0.82 Q/s (49.2 questions/min) at </w:t>
+      </w:r>
+      <w:r>
+        <w:rPr>
+          <w:rFonts w:ascii="Times New Roman" w:hAnsi="Times New Roman"/>
+          <w:b/>
+          <w:sz w:val="22"/>
+        </w:rPr>
+        <w:t>C = 5</w:t>
       </w:r>
       <w:r>
         <w:rPr>
@@ -16737,9 +18299,7 @@
       </w:r>
       <w:r>
         <w:rPr>
-          <w:rFonts w:ascii="Cambria Math" w:hAnsi="Cambria Math"/>
-          <w:i/>
-          <w:color w:val="1A1A1A"/>
+          <w:rFonts w:ascii="Times New Roman" w:hAnsi="Times New Roman"/>
           <w:sz w:val="22"/>
         </w:rPr>
         <w:t>C = 5</w:t>
@@ -17011,12 +18571,10 @@
             <w:r/>
             <w:r>
               <w:rPr>
-                <w:rFonts w:ascii="Cambria Math" w:hAnsi="Cambria Math"/>
-                <w:i/>
-                <w:color w:val="1A1A1A"/>
+                <w:rFonts w:ascii="Times New Roman" w:hAnsi="Times New Roman"/>
                 <w:sz w:val="18"/>
               </w:rPr>
-              <w:t>\ge 90.0\%</w:t>
+              <w:t>≥ 90.0%</w:t>
             </w:r>
             <w:r>
               <w:rPr>
@@ -17187,12 +18745,33 @@
             </w:r>
             <w:r>
               <w:rPr>
-                <w:rFonts w:ascii="Cambria Math" w:hAnsi="Cambria Math"/>
+                <w:rFonts w:ascii="Times New Roman" w:hAnsi="Times New Roman"/>
                 <w:i/>
-                <w:color w:val="1A1A1A"/>
                 <w:sz w:val="18"/>
               </w:rPr>
-              <w:t>T_{\text{E2E}} \le 3.0\text{ s}</w:t>
+              <w:t>T</w:t>
+            </w:r>
+            <w:r>
+              <w:rPr>
+                <w:rFonts w:ascii="Times New Roman" w:hAnsi="Times New Roman"/>
+                <w:sz w:val="18"/>
+                <w:vertAlign w:val="subscript"/>
+              </w:rPr>
+              <w:t>E2E</w:t>
+            </w:r>
+            <w:r>
+              <w:rPr>
+                <w:rFonts w:ascii="Times New Roman" w:hAnsi="Times New Roman"/>
+                <w:sz w:val="18"/>
+              </w:rPr>
+              <w:t xml:space="preserve"> ≤ 3.0</w:t>
+            </w:r>
+            <w:r>
+              <w:rPr>
+                <w:rFonts w:ascii="Times New Roman" w:hAnsi="Times New Roman"/>
+                <w:sz w:val="18"/>
+              </w:rPr>
+              <w:t xml:space="preserve"> s</w:t>
             </w:r>
             <w:r>
               <w:rPr>
@@ -17235,12 +18814,33 @@
             </w:r>
             <w:r>
               <w:rPr>
-                <w:rFonts w:ascii="Cambria Math" w:hAnsi="Cambria Math"/>
+                <w:rFonts w:ascii="Times New Roman" w:hAnsi="Times New Roman"/>
                 <w:i/>
-                <w:color w:val="1A1A1A"/>
                 <w:sz w:val="18"/>
               </w:rPr>
-              <w:t>T_{\text{E2E}} = 1462.7\text{ ms}</w:t>
+              <w:t>T</w:t>
+            </w:r>
+            <w:r>
+              <w:rPr>
+                <w:rFonts w:ascii="Times New Roman" w:hAnsi="Times New Roman"/>
+                <w:sz w:val="18"/>
+                <w:vertAlign w:val="subscript"/>
+              </w:rPr>
+              <w:t>E2E</w:t>
+            </w:r>
+            <w:r>
+              <w:rPr>
+                <w:rFonts w:ascii="Times New Roman" w:hAnsi="Times New Roman"/>
+                <w:sz w:val="18"/>
+              </w:rPr>
+              <w:t xml:space="preserve"> = 1462.7</w:t>
+            </w:r>
+            <w:r>
+              <w:rPr>
+                <w:rFonts w:ascii="Times New Roman" w:hAnsi="Times New Roman"/>
+                <w:sz w:val="18"/>
+              </w:rPr>
+              <w:t xml:space="preserve"> ms</w:t>
             </w:r>
             <w:r>
               <w:rPr>
@@ -17372,12 +18972,10 @@
             <w:r/>
             <w:r>
               <w:rPr>
-                <w:rFonts w:ascii="Cambria Math" w:hAnsi="Cambria Math"/>
-                <w:i/>
-                <w:color w:val="1A1A1A"/>
+                <w:rFonts w:ascii="Times New Roman" w:hAnsi="Times New Roman"/>
                 <w:sz w:val="18"/>
               </w:rPr>
-              <w:t>100\%</w:t>
+              <w:t>100%</w:t>
             </w:r>
             <w:r>
               <w:rPr>
@@ -17391,12 +18989,10 @@
             </w:r>
             <w:r>
               <w:rPr>
-                <w:rFonts w:ascii="Cambria Math" w:hAnsi="Cambria Math"/>
-                <w:i/>
-                <w:color w:val="1A1A1A"/>
+                <w:rFonts w:ascii="Times New Roman" w:hAnsi="Times New Roman"/>
                 <w:sz w:val="18"/>
               </w:rPr>
-              <w:t>C \le 10</w:t>
+              <w:t>C ≤ 10</w:t>
             </w:r>
             <w:r>
               <w:rPr>
@@ -17439,9 +19035,7 @@
             </w:r>
             <w:r>
               <w:rPr>
-                <w:rFonts w:ascii="Cambria Math" w:hAnsi="Cambria Math"/>
-                <w:i/>
-                <w:color w:val="1A1A1A"/>
+                <w:rFonts w:ascii="Times New Roman" w:hAnsi="Times New Roman"/>
                 <w:sz w:val="18"/>
               </w:rPr>
               <w:t>C = 20</w:t>
@@ -17576,12 +19170,17 @@
             </w:r>
             <w:r>
               <w:rPr>
-                <w:rFonts w:ascii="Cambria Math" w:hAnsi="Cambria Math"/>
-                <w:i/>
-                <w:color w:val="1A1A1A"/>
+                <w:rFonts w:ascii="Times New Roman" w:hAnsi="Times New Roman"/>
                 <w:sz w:val="18"/>
               </w:rPr>
-              <w:t>&lt; 24.0\text{ GB}</w:t>
+              <w:t>&lt; 24.0</w:t>
+            </w:r>
+            <w:r>
+              <w:rPr>
+                <w:rFonts w:ascii="Times New Roman" w:hAnsi="Times New Roman"/>
+                <w:sz w:val="18"/>
+              </w:rPr>
+              <w:t xml:space="preserve"> GB</w:t>
             </w:r>
             <w:r>
               <w:rPr>
@@ -17940,12 +19539,17 @@
       </w:r>
       <w:r>
         <w:rPr>
-          <w:rFonts w:ascii="Cambria Math" w:hAnsi="Cambria Math"/>
-          <w:i/>
-          <w:color w:val="1A1A1A"/>
-          <w:sz w:val="22"/>
-        </w:rPr>
-        <w:t>\text{ICC} = 0.981</w:t>
+          <w:rFonts w:ascii="Times New Roman" w:hAnsi="Times New Roman"/>
+          <w:sz w:val="22"/>
+        </w:rPr>
+        <w:t>ICC</w:t>
+      </w:r>
+      <w:r>
+        <w:rPr>
+          <w:rFonts w:ascii="Times New Roman" w:hAnsi="Times New Roman"/>
+          <w:sz w:val="22"/>
+        </w:rPr>
+        <w:t xml:space="preserve"> = 0.981</w:t>
       </w:r>
       <w:r>
         <w:rPr>
@@ -17959,12 +19563,17 @@
       </w:r>
       <w:r>
         <w:rPr>
-          <w:rFonts w:ascii="Cambria Math" w:hAnsi="Cambria Math"/>
-          <w:i/>
-          <w:color w:val="1A1A1A"/>
-          <w:sz w:val="22"/>
-        </w:rPr>
-        <w:t>\text{ICC} = 0.981</w:t>
+          <w:rFonts w:ascii="Times New Roman" w:hAnsi="Times New Roman"/>
+          <w:sz w:val="22"/>
+        </w:rPr>
+        <w:t>ICC</w:t>
+      </w:r>
+      <w:r>
+        <w:rPr>
+          <w:rFonts w:ascii="Times New Roman" w:hAnsi="Times New Roman"/>
+          <w:sz w:val="22"/>
+        </w:rPr>
+        <w:t xml:space="preserve"> = 0.981</w:t>
       </w:r>
       <w:r>
         <w:rPr>
@@ -17978,12 +19587,10 @@
       </w:r>
       <w:r>
         <w:rPr>
-          <w:rFonts w:ascii="Cambria Math" w:hAnsi="Cambria Math"/>
-          <w:i/>
-          <w:color w:val="1A1A1A"/>
-          <w:sz w:val="22"/>
-        </w:rPr>
-        <w:t>\kappa = 0.610</w:t>
+          <w:rFonts w:ascii="Times New Roman" w:hAnsi="Times New Roman"/>
+          <w:sz w:val="22"/>
+        </w:rPr>
+        <w:t>κ = 0.610</w:t>
       </w:r>
       <w:r>
         <w:rPr>
@@ -18028,9 +19635,7 @@
       </w:r>
       <w:r>
         <w:rPr>
-          <w:rFonts w:ascii="Cambria Math" w:hAnsi="Cambria Math"/>
-          <w:i/>
-          <w:color w:val="1A1A1A"/>
+          <w:rFonts w:ascii="Times New Roman" w:hAnsi="Times New Roman"/>
           <w:sz w:val="22"/>
         </w:rPr>
         <w:t>C=1 \dots 20</w:t>
@@ -18047,12 +19652,42 @@
       </w:r>
       <w:r>
         <w:rPr>
-          <w:rFonts w:ascii="Cambria Math" w:hAnsi="Cambria Math"/>
+          <w:rFonts w:ascii="Times New Roman" w:hAnsi="Times New Roman"/>
           <w:i/>
-          <w:color w:val="1A1A1A"/>
-          <w:sz w:val="22"/>
-        </w:rPr>
-        <w:t>U_0 \dots U_{100}</w:t>
+          <w:sz w:val="22"/>
+        </w:rPr>
+        <w:t>U</w:t>
+      </w:r>
+      <w:r>
+        <w:rPr>
+          <w:rFonts w:ascii="Times New Roman" w:hAnsi="Times New Roman"/>
+          <w:sz w:val="22"/>
+          <w:vertAlign w:val="subscript"/>
+        </w:rPr>
+        <w:t>0</w:t>
+      </w:r>
+      <w:r>
+        <w:rPr>
+          <w:rFonts w:ascii="Times New Roman" w:hAnsi="Times New Roman"/>
+          <w:sz w:val="22"/>
+        </w:rPr>
+        <w:t xml:space="preserve"> \dots </w:t>
+      </w:r>
+      <w:r>
+        <w:rPr>
+          <w:rFonts w:ascii="Times New Roman" w:hAnsi="Times New Roman"/>
+          <w:i/>
+          <w:sz w:val="22"/>
+        </w:rPr>
+        <w:t>U</w:t>
+      </w:r>
+      <w:r>
+        <w:rPr>
+          <w:rFonts w:ascii="Times New Roman" w:hAnsi="Times New Roman"/>
+          <w:sz w:val="22"/>
+          <w:vertAlign w:val="subscript"/>
+        </w:rPr>
+        <w:t>100</w:t>
       </w:r>
       <w:r>
         <w:rPr>
@@ -18304,12 +19939,17 @@
       </w:r>
       <w:r>
         <w:rPr>
-          <w:rFonts w:ascii="Cambria Math" w:hAnsi="Cambria Math"/>
-          <w:i/>
-          <w:color w:val="1A1A1A"/>
-          <w:sz w:val="22"/>
-        </w:rPr>
-        <w:t>\text{Top-}K = 3</w:t>
+          <w:rFonts w:ascii="Times New Roman" w:hAnsi="Times New Roman"/>
+          <w:sz w:val="22"/>
+        </w:rPr>
+        <w:t>Top-</w:t>
+      </w:r>
+      <w:r>
+        <w:rPr>
+          <w:rFonts w:ascii="Times New Roman" w:hAnsi="Times New Roman"/>
+          <w:sz w:val="22"/>
+        </w:rPr>
+        <w:t>K = 3</w:t>
       </w:r>
       <w:r>
         <w:rPr>
@@ -18379,9 +20019,7 @@
       </w:r>
       <w:r>
         <w:rPr>
-          <w:rFonts w:ascii="Cambria Math" w:hAnsi="Cambria Math"/>
-          <w:i/>
-          <w:color w:val="1A1A1A"/>
+          <w:rFonts w:ascii="Times New Roman" w:hAnsi="Times New Roman"/>
           <w:sz w:val="22"/>
         </w:rPr>
         <w:t>C = 20</w:t>
@@ -18404,7 +20042,43 @@
           <w:color w:val="1A1A1A"/>
           <w:sz w:val="22"/>
         </w:rPr>
-        <w:t>1.36s ($C=1$) to 3.56s ($C=5$)</w:t>
+        <w:t>1.36s (</w:t>
+      </w:r>
+      <w:r>
+        <w:rPr>
+          <w:rFonts w:ascii="Times New Roman" w:hAnsi="Times New Roman"/>
+          <w:b/>
+          <w:sz w:val="22"/>
+        </w:rPr>
+        <w:t>C=1</w:t>
+      </w:r>
+      <w:r>
+        <w:rPr>
+          <w:rFonts w:ascii="Times New Roman" w:hAnsi="Times New Roman"/>
+          <w:b/>
+          <w:i w:val="0"/>
+          <w:color w:val="1A1A1A"/>
+          <w:sz w:val="22"/>
+        </w:rPr>
+        <w:t>) to 3.56s (</w:t>
+      </w:r>
+      <w:r>
+        <w:rPr>
+          <w:rFonts w:ascii="Times New Roman" w:hAnsi="Times New Roman"/>
+          <w:b/>
+          <w:sz w:val="22"/>
+        </w:rPr>
+        <w:t>C=5</w:t>
+      </w:r>
+      <w:r>
+        <w:rPr>
+          <w:rFonts w:ascii="Times New Roman" w:hAnsi="Times New Roman"/>
+          <w:b/>
+          <w:i w:val="0"/>
+          <w:color w:val="1A1A1A"/>
+          <w:sz w:val="22"/>
+        </w:rPr>
+        <w:t>)</w:t>
       </w:r>
       <w:r>
         <w:rPr>

</xml_diff>

<commit_message>
docs(paper): convert docx, html, and pdf to APA 7th edition referencing style
</commit_message>
<xml_diff>
--- a/experiment/papers/paper.docx
+++ b/experiment/papers/paper.docx
@@ -75,7 +75,7 @@
     </w:p>
     <w:p>
       <w:pPr>
-        <w:spacing w:before="0" w:after="120" w:line="276" w:lineRule="auto"/>
+        <w:spacing w:line="276" w:lineRule="auto" w:before="0" w:after="120"/>
       </w:pPr>
       <w:r>
         <w:rPr>
@@ -332,7 +332,7 @@
     </w:p>
     <w:p>
       <w:pPr>
-        <w:spacing w:before="0" w:after="120" w:line="276" w:lineRule="auto"/>
+        <w:spacing w:line="276" w:lineRule="auto" w:before="0" w:after="120"/>
       </w:pPr>
       <w:r>
         <w:rPr>
@@ -373,7 +373,7 @@
     </w:p>
     <w:p>
       <w:pPr>
-        <w:spacing w:before="0" w:after="120" w:line="276" w:lineRule="auto"/>
+        <w:spacing w:line="276" w:lineRule="auto" w:before="0" w:after="120"/>
       </w:pPr>
       <w:r>
         <w:rPr>
@@ -388,7 +388,7 @@
     </w:p>
     <w:p>
       <w:pPr>
-        <w:spacing w:before="0" w:after="120" w:line="276" w:lineRule="auto"/>
+        <w:spacing w:line="276" w:lineRule="auto" w:before="0" w:after="120"/>
       </w:pPr>
       <w:r>
         <w:rPr>
@@ -398,12 +398,12 @@
           <w:color w:val="1A1A1A"/>
           <w:sz w:val="22"/>
         </w:rPr>
-        <w:t>Recent research has already established the feasibility of automatic MCQ generation with LLMs [1]. RAG further enables a generative model to condition its output on external evidence [2], making it attractive for course-specific assessment because instructor-provided learning materials can be retrieved and supplied as context. A recent systematic survey of educational RAG identifies indexing, retrieval, and generation as core stages and highlights computational cost and dynamic knowledge updating as continuing challenges [3].</w:t>
+        <w:t>Recent research has already established the feasibility of automatic MCQ generation with LLMs (Mucciaccia et al., 2025). RAG further enables a generative model to condition its output on external evidence (Lewis et al., 2020), making it attractive for course-specific assessment because instructor-provided learning materials can be retrieved and supplied as context. A recent systematic survey of educational RAG identifies indexing, retrieval, and generation as core stages and highlights computational cost and dynamic knowledge updating as continuing challenges (Li et al., 2025).</w:t>
       </w:r>
     </w:p>
     <w:p>
       <w:pPr>
-        <w:spacing w:before="0" w:after="120" w:line="276" w:lineRule="auto"/>
+        <w:spacing w:line="276" w:lineRule="auto" w:before="0" w:after="120"/>
       </w:pPr>
       <w:r>
         <w:rPr>
@@ -413,12 +413,12 @@
           <w:color w:val="1A1A1A"/>
           <w:sz w:val="22"/>
         </w:rPr>
-        <w:t>The literature has also moved beyond proof-of-concept question generation. Pradeesh et al. [4] investigated RAG-based MCQ generation from PDF materials through a learning-management system. Lee [14] developed and evaluated a generative AI and RAG tutor within higher education curricula, demonstrating pedagogical potential alongside operational constraints. Lohr et al. [5] studied course-specific computer-science learning-object generation and showed that generated questions may still require substantial human intervention. Olibo [6] evaluated a large set of retrieval configurations and multiple instruction-tuned LLMs for Java-programming MCQ generation. Shintani [7] presented an API-free, self-hosted lecture-to-quiz pipeline with deterministic quality control. Tran et al. [8] developed a locally deployed, course-specific RAG assistant that included quiz generation, while Shen et al. [9] evaluated on-premise educational RAG on consumer-grade GPU hardware.</w:t>
+        <w:t>The literature has also moved beyond proof-of-concept question generation. Pradeesh et al. (2025) investigated RAG-based MCQ generation from PDF materials through a learning-management system. Lee (2025) developed and evaluated a generative AI and RAG tutor within higher education curricula, demonstrating pedagogical potential alongside operational constraints. Lohr et al. (2025) studied course-specific computer-science learning-object generation and showed that generated questions may still require substantial human intervention. Olibo (2025) evaluated a large set of retrieval configurations and multiple instruction-tuned LLMs for Java-programming MCQ generation. Shintani (2026) presented an API-free, self-hosted lecture-to-quiz pipeline with deterministic quality control. Tran et al. (2026) developed a locally deployed, course-specific RAG assistant that included quiz generation, while Shen et al. (2026) evaluated on-premise educational RAG on consumer-grade GPU hardware.</w:t>
       </w:r>
     </w:p>
     <w:p>
       <w:pPr>
-        <w:spacing w:before="0" w:after="120" w:line="276" w:lineRule="auto"/>
+        <w:spacing w:line="276" w:lineRule="auto" w:before="0" w:after="120"/>
       </w:pPr>
       <w:r>
         <w:rPr>
@@ -433,7 +433,7 @@
     </w:p>
     <w:p>
       <w:pPr>
-        <w:spacing w:before="0" w:after="120" w:line="276" w:lineRule="auto"/>
+        <w:spacing w:line="276" w:lineRule="auto" w:before="0" w:after="120"/>
       </w:pPr>
       <w:r>
         <w:rPr>
@@ -461,7 +461,7 @@
           <w:color w:val="1A1A1A"/>
           <w:sz w:val="22"/>
         </w:rPr>
-        <w:t xml:space="preserve">), controlled retrieval context, local Qwen2.5-Coder-7B inference [16] (served via Ollama as </w:t>
+        <w:t xml:space="preserve">), controlled retrieval context, local Qwen2.5-Coder-7B inference (Hui et al., 2024) (served via Ollama as </w:t>
       </w:r>
       <w:r>
         <w:rPr>
@@ -479,7 +479,7 @@
           <w:color w:val="1A1A1A"/>
           <w:sz w:val="22"/>
         </w:rPr>
-        <w:t>), deterministic schema validation, bounded retry, and Moodle Question Bank integration [19]. Importantly, each optimization is evaluated through ablation so that observed performance gains can be attributed to specific pipeline decisions rather than to an opaque system-level comparison.</w:t>
+        <w:t>), deterministic schema validation, bounded retry, and Moodle Question Bank integration (Dougiamas &amp; Taylor, 2003). Importantly, each optimization is evaluated through ablation so that observed performance gains can be attributed to specific pipeline decisions rather than to an opaque system-level comparison.</w:t>
       </w:r>
     </w:p>
     <w:p>
@@ -500,7 +500,7 @@
     </w:p>
     <w:p>
       <w:pPr>
-        <w:spacing w:before="0" w:after="120" w:line="276" w:lineRule="auto"/>
+        <w:spacing w:line="276" w:lineRule="auto" w:before="0" w:after="120"/>
       </w:pPr>
       <w:r>
         <w:rPr>
@@ -579,7 +579,7 @@
     </w:p>
     <w:p>
       <w:pPr>
-        <w:spacing w:before="0" w:after="120" w:line="276" w:lineRule="auto"/>
+        <w:spacing w:line="276" w:lineRule="auto" w:before="0" w:after="120"/>
       </w:pPr>
       <w:r>
         <w:rPr>
@@ -626,7 +626,7 @@
     </w:p>
     <w:p>
       <w:pPr>
-        <w:spacing w:before="0" w:after="120" w:line="276" w:lineRule="auto"/>
+        <w:spacing w:line="276" w:lineRule="auto" w:before="0" w:after="120"/>
       </w:pPr>
       <w:r>
         <w:rPr>
@@ -636,12 +636,12 @@
           <w:color w:val="1A1A1A"/>
           <w:sz w:val="22"/>
         </w:rPr>
-        <w:t>Mucciaccia et al. [1] investigated automatic MCQ generation and evaluation with LLMs, establishing automated question generation as a substantive research direction. Lewis et al. [2] introduced RAG as a framework that combines parametric generation with retrieved external knowledge. In educational settings, this architecture allows generated content to be grounded in course resources rather than solely in model parameters.</w:t>
+        <w:t>Mucciaccia et al. (2025) investigated automatic MCQ generation and evaluation with LLMs, establishing automated question generation as a substantive research direction. Lewis et al. (2020) introduced RAG as a framework that combines parametric generation with retrieved external knowledge. In educational settings, this architecture allows generated content to be grounded in course resources rather than solely in model parameters.</w:t>
       </w:r>
     </w:p>
     <w:p>
       <w:pPr>
-        <w:spacing w:before="0" w:after="120" w:line="276" w:lineRule="auto"/>
+        <w:spacing w:line="276" w:lineRule="auto" w:before="0" w:after="120"/>
       </w:pPr>
       <w:r>
         <w:rPr>
@@ -651,7 +651,7 @@
           <w:color w:val="1A1A1A"/>
           <w:sz w:val="22"/>
         </w:rPr>
-        <w:t>Li et al. [3] systematically reviewed educational RAG and identified a broad range of applications spanning interactive learning, educational content generation and assessment, and larger-scale educational deployment. Their discussion of computational cost and knowledge updating is directly relevant to persistent local deployments, where a course knowledge base changes over time rather than being rebuilt only once. Similarly, Lee [14] emphasized that curriculum grounding and retrieval verification are essential to maintain academic integrity and prevent inaccurate instruction in educational RAG systems.</w:t>
+        <w:t>Li et al. (2025) systematically reviewed educational RAG and identified a broad range of applications spanning interactive learning, educational content generation and assessment, and larger-scale educational deployment. Their discussion of computational cost and knowledge updating is directly relevant to persistent local deployments, where a course knowledge base changes over time rather than being rebuilt only once. Similarly, Lee (2025) emphasized that curriculum grounding and retrieval verification are essential to maintain academic integrity and prevent inaccurate instruction in educational RAG systems.</w:t>
       </w:r>
     </w:p>
     <w:p>
@@ -672,7 +672,7 @@
     </w:p>
     <w:p>
       <w:pPr>
-        <w:spacing w:before="0" w:after="120" w:line="276" w:lineRule="auto"/>
+        <w:spacing w:line="276" w:lineRule="auto" w:before="0" w:after="120"/>
       </w:pPr>
       <w:r>
         <w:rPr>
@@ -682,12 +682,12 @@
           <w:color w:val="1A1A1A"/>
           <w:sz w:val="22"/>
         </w:rPr>
-        <w:t>Pradeesh et al. [4] investigated RAG-based MCQ generation from PDF source documents within the Ample LMS, demonstrating that document-grounded question generation and LMS integration already have precedent. Lohr et al. [5] examined course-specific semantically annotated learning objects in computer science and reported substantial need for expert intervention in generated questions. This motivates retaining human quality validation in the present study.</w:t>
+        <w:t>Pradeesh et al. (2025) investigated RAG-based MCQ generation from PDF source documents within the Ample LMS, demonstrating that document-grounded question generation and LMS integration already have precedent. Lohr et al. (2025) examined course-specific semantically annotated learning objects in computer science and reported substantial need for expert intervention in generated questions. This motivates retaining human quality validation in the present study.</w:t>
       </w:r>
     </w:p>
     <w:p>
       <w:pPr>
-        <w:spacing w:before="0" w:after="120" w:line="276" w:lineRule="auto"/>
+        <w:spacing w:line="276" w:lineRule="auto" w:before="0" w:after="120"/>
       </w:pPr>
       <w:r>
         <w:rPr>
@@ -697,7 +697,7 @@
           <w:color w:val="1A1A1A"/>
           <w:sz w:val="22"/>
         </w:rPr>
-        <w:t>Olibo [6] is particularly close to the present work in domain and task. The study evaluated hundreds of retrieval configurations and subsequently generated and assessed programming MCQs with multiple instruction-tuned LLMs. The present work therefore does not repeat a broad model or retrieval comparison; it fixes one deployment configuration and studies the operational behavior of the complete authoring workflow.</w:t>
+        <w:t>Olibo (2025) is particularly close to the present work in domain and task. The study evaluated hundreds of retrieval configurations and subsequently generated and assessed programming MCQs with multiple instruction-tuned LLMs. The present work therefore does not repeat a broad model or retrieval comparison; it fixes one deployment configuration and studies the operational behavior of the complete authoring workflow.</w:t>
       </w:r>
     </w:p>
     <w:p>
@@ -718,7 +718,7 @@
     </w:p>
     <w:p>
       <w:pPr>
-        <w:spacing w:before="0" w:after="120" w:line="276" w:lineRule="auto"/>
+        <w:spacing w:line="276" w:lineRule="auto" w:before="0" w:after="120"/>
       </w:pPr>
       <w:r>
         <w:rPr>
@@ -746,7 +746,7 @@
           <w:color w:val="1A1A1A"/>
           <w:sz w:val="22"/>
         </w:rPr>
-        <w:t xml:space="preserve"> or cloud LTI gateways) increasingly offer automated quiz drafting wizards. However, these tools rely almost universally on third-party commercial cloud APIs (e.g., OpenAI GPT-4o, Microsoft Azure, or Anthropic Claude). This architectural choice incurs recurring per-token subscription costs and creates substantial institutional data sovereignty, privacy, and compliance barriers (e.g., FERPA, GDPR) by transmitting unpublished university curricula and exam questions off-premises. Conversely, standalone self-hosted tools such as Shintani's Lecture-to-Quiz (L2Q) pipeline [7] achieve API-free local generation with deterministic quality control, but generate static CSV exports designed for Google Forms rather than integrating natively into an active learning management system. Furthermore, L2Q feeds unchunked slide text directly into the model without vector database retrieval (RAG), lacks incremental embedding caching, omits programming-specific Abstract Syntax Tree (AST) validation, and evaluates only unbatched sequential generation without hardware concurrency analysis. Other recent on-premise systems, such as Tran et al. [8] and Shen et al. [9], demonstrated local RAG assistants on consumer-grade GPU hardware, but focused primarily on conversational student Q&amp;A rather than structured, syntax-validated assessment generation and Question Bank persistence. These studies confirm that while local quiz generation and local educational RAG exist, persistent, resource-bounded, and course-integrated programming assessment workflows remain unaddressed.</w:t>
+        <w:t xml:space="preserve"> or cloud LTI gateways) increasingly offer automated quiz drafting wizards. However, these tools rely almost universally on third-party commercial cloud APIs (e.g., OpenAI GPT-4o, Microsoft Azure, or Anthropic Claude). This architectural choice incurs recurring per-token subscription costs and creates substantial institutional data sovereignty, privacy, and compliance barriers (e.g., FERPA, GDPR) by transmitting unpublished university curricula and exam questions off-premises. Conversely, standalone self-hosted tools such as Shintani's Lecture-to-Quiz (L2Q) pipeline (Shintani, 2026) achieve API-free local generation with deterministic quality control, but generate static CSV exports designed for Google Forms rather than integrating natively into an active learning management system. Furthermore, L2Q feeds unchunked slide text directly into the model without vector database retrieval (RAG), lacks incremental embedding caching, omits programming-specific Abstract Syntax Tree (AST) validation, and evaluates only unbatched sequential generation without hardware concurrency analysis. Other recent on-premise systems, such as Tran et al. (2026) and Shen et al. (2026), demonstrated local RAG assistants on consumer-grade GPU hardware, but focused primarily on conversational student Q&amp;A rather than structured, syntax-validated assessment generation and Question Bank persistence. These studies confirm that while local quiz generation and local educational RAG exist, persistent, resource-bounded, and course-integrated programming assessment workflows remain unaddressed.</w:t>
       </w:r>
     </w:p>
     <w:p>
@@ -767,7 +767,7 @@
     </w:p>
     <w:p>
       <w:pPr>
-        <w:spacing w:before="0" w:after="120" w:line="276" w:lineRule="auto"/>
+        <w:spacing w:line="276" w:lineRule="auto" w:before="0" w:after="120"/>
       </w:pPr>
       <w:r>
         <w:rPr>
@@ -777,12 +777,12 @@
           <w:color w:val="1A1A1A"/>
           <w:sz w:val="22"/>
         </w:rPr>
-        <w:t>Caching is also established in retrieval and RAG systems. CacheBlend [10] and TurboRAG [11] reduce LLM prefill cost by reusing precomputed key-value states for retrieved knowledge. Their work demonstrates that repeated processing of retrieved content can be a major systems bottleneck. The present study does not propose a new KV-cache algorithm. Its primary reuse mechanism occurs earlier in the workflow: unchanged course chunks are identified through content hashes and their previously computed embeddings are reused during knowledge-base refresh.</w:t>
+        <w:t>Caching is also established in retrieval and RAG systems. CacheBlend (Yao et al., 2025) and TurboRAG (Lu et al., 2025) reduce LLM prefill cost by reusing precomputed key-value states for retrieved knowledge. Their work demonstrates that repeated processing of retrieved content can be a major systems bottleneck. The present study does not propose a new KV-cache algorithm. Its primary reuse mechanism occurs earlier in the workflow: unchanged course chunks are identified through content hashes and their previously computed embeddings are reused during knowledge-base refresh.</w:t>
       </w:r>
     </w:p>
     <w:p>
       <w:pPr>
-        <w:spacing w:before="0" w:after="120" w:line="276" w:lineRule="auto"/>
+        <w:spacing w:line="276" w:lineRule="auto" w:before="0" w:after="120"/>
       </w:pPr>
       <w:r>
         <w:rPr>
@@ -813,7 +813,7 @@
     </w:p>
     <w:p>
       <w:pPr>
-        <w:spacing w:before="0" w:after="120" w:line="276" w:lineRule="auto"/>
+        <w:spacing w:line="276" w:lineRule="auto" w:before="0" w:after="120"/>
       </w:pPr>
       <w:r>
         <w:rPr>
@@ -844,7 +844,7 @@
     </w:p>
     <w:p>
       <w:pPr>
-        <w:spacing w:before="0" w:after="120" w:line="276" w:lineRule="auto"/>
+        <w:spacing w:line="276" w:lineRule="auto" w:before="0" w:after="120"/>
       </w:pPr>
       <w:r>
         <w:rPr>
@@ -859,7 +859,7 @@
     </w:p>
     <w:p>
       <w:pPr>
-        <w:spacing w:before="0" w:after="120" w:line="276" w:lineRule="auto"/>
+        <w:spacing w:line="276" w:lineRule="auto" w:before="0" w:after="120"/>
       </w:pPr>
       <w:r>
         <w:rPr>
@@ -874,7 +874,7 @@
     </w:p>
     <w:p>
       <w:pPr>
-        <w:spacing w:before="0" w:after="120" w:line="276" w:lineRule="auto"/>
+        <w:spacing w:line="276" w:lineRule="auto" w:before="0" w:after="120"/>
       </w:pPr>
       <w:r>
         <w:rPr>
@@ -989,7 +989,7 @@
     </w:p>
     <w:p>
       <w:pPr>
-        <w:spacing w:before="0" w:after="120" w:line="276" w:lineRule="auto"/>
+        <w:spacing w:line="276" w:lineRule="auto" w:before="0" w:after="120"/>
       </w:pPr>
       <w:r>
         <w:rPr>
@@ -1055,12 +1055,12 @@
           <w:color w:val="1A1A1A"/>
           <w:sz w:val="22"/>
         </w:rPr>
-        <w:t xml:space="preserve"> conforming to NIST FIPS PUB 180-4 [17]. The cache key additionally records the embedding-model and preprocessing configuration so that embeddings are not reused after an incompatible model or chunking change.</w:t>
+        <w:t xml:space="preserve"> conforming to NIST FIPS PUB 180-4 (NIST, 2015). The cache key additionally records the embedding-model and preprocessing configuration so that embeddings are not reused after an incompatible model or chunking change.</w:t>
       </w:r>
     </w:p>
     <w:p>
       <w:pPr>
-        <w:spacing w:before="0" w:after="120" w:line="276" w:lineRule="auto"/>
+        <w:spacing w:line="276" w:lineRule="auto" w:before="0" w:after="120"/>
       </w:pPr>
       <w:r>
         <w:rPr>
@@ -1075,7 +1075,7 @@
     </w:p>
     <w:p>
       <w:pPr>
-        <w:spacing w:before="0" w:after="120" w:line="276" w:lineRule="auto"/>
+        <w:spacing w:line="276" w:lineRule="auto" w:before="0" w:after="120"/>
       </w:pPr>
       <w:r>
         <w:rPr>
@@ -1394,7 +1394,7 @@
     </w:p>
     <w:p>
       <w:pPr>
-        <w:spacing w:before="0" w:after="120" w:line="276" w:lineRule="auto"/>
+        <w:spacing w:line="276" w:lineRule="auto" w:before="0" w:after="120"/>
       </w:pPr>
       <w:r>
         <w:rPr>
@@ -1509,7 +1509,7 @@
     </w:p>
     <w:p>
       <w:pPr>
-        <w:spacing w:before="0" w:after="120" w:line="276" w:lineRule="auto"/>
+        <w:spacing w:line="276" w:lineRule="auto" w:before="0" w:after="120"/>
       </w:pPr>
       <w:r>
         <w:rPr>
@@ -1519,7 +1519,7 @@
           <w:color w:val="1A1A1A"/>
           <w:sz w:val="22"/>
         </w:rPr>
-        <w:t>The system uses nomic-embed-text [15] (</w:t>
+        <w:t>The system uses nomic-embed-text (Nussbaum et al., 2024) (</w:t>
       </w:r>
       <w:r>
         <w:rPr>
@@ -1537,7 +1537,7 @@
           <w:color w:val="1A1A1A"/>
           <w:sz w:val="22"/>
         </w:rPr>
-        <w:t>, 768-dimensional dense vector embeddings with an 8,192-token context window) for document and query embeddings. Cosine similarity [18] ranks candidate chunks against the prompt vector representation:</w:t>
+        <w:t>, 768-dimensional dense vector embeddings with an 8,192-token context window) for document and query embeddings. Cosine similarity (Singhal, 2001) ranks candidate chunks against the prompt vector representation:</w:t>
       </w:r>
     </w:p>
     <w:p>
@@ -1649,7 +1649,7 @@
     </w:p>
     <w:p>
       <w:pPr>
-        <w:spacing w:before="0" w:after="120" w:line="276" w:lineRule="auto"/>
+        <w:spacing w:line="276" w:lineRule="auto" w:before="0" w:after="120"/>
       </w:pPr>
       <w:r>
         <w:rPr>
@@ -1699,7 +1699,7 @@
     </w:p>
     <w:p>
       <w:pPr>
-        <w:spacing w:before="0" w:after="120" w:line="276" w:lineRule="auto"/>
+        <w:spacing w:line="276" w:lineRule="auto" w:before="0" w:after="120"/>
       </w:pPr>
       <w:r>
         <w:rPr>
@@ -1818,7 +1818,7 @@
     </w:p>
     <w:p>
       <w:pPr>
-        <w:spacing w:before="0" w:after="120" w:line="276" w:lineRule="auto"/>
+        <w:spacing w:line="276" w:lineRule="auto" w:before="0" w:after="120"/>
       </w:pPr>
       <w:r>
         <w:rPr>
@@ -1865,7 +1865,7 @@
           <w:color w:val="1A1A1A"/>
           <w:sz w:val="22"/>
         </w:rPr>
-        <w:t xml:space="preserve"> model [16] (deployed via official Ollama tag </w:t>
+        <w:t xml:space="preserve"> model (Hui et al., 2024) (deployed via official Ollama tag </w:t>
       </w:r>
       <w:r>
         <w:rPr>
@@ -2032,7 +2032,7 @@
     </w:p>
     <w:p>
       <w:pPr>
-        <w:spacing w:before="0" w:after="120" w:line="276" w:lineRule="auto"/>
+        <w:spacing w:line="276" w:lineRule="auto" w:before="0" w:after="120"/>
       </w:pPr>
       <w:r>
         <w:rPr>
@@ -2266,7 +2266,7 @@
     </w:p>
     <w:p>
       <w:pPr>
-        <w:spacing w:before="0" w:after="120" w:line="276" w:lineRule="auto"/>
+        <w:spacing w:line="276" w:lineRule="auto" w:before="0" w:after="120"/>
       </w:pPr>
       <w:r>
         <w:rPr>
@@ -2429,7 +2429,7 @@
     </w:p>
     <w:p>
       <w:pPr>
-        <w:spacing w:before="0" w:after="120" w:line="276" w:lineRule="auto"/>
+        <w:spacing w:line="276" w:lineRule="auto" w:before="0" w:after="120"/>
       </w:pPr>
       <w:r>
         <w:rPr>
@@ -2533,7 +2533,7 @@
     </w:p>
     <w:p>
       <w:pPr>
-        <w:spacing w:before="0" w:after="120" w:line="276" w:lineRule="auto"/>
+        <w:spacing w:line="276" w:lineRule="auto" w:before="0" w:after="120"/>
       </w:pPr>
       <w:r>
         <w:rPr>
@@ -2597,7 +2597,7 @@
           <w:color w:val="1A1A1A"/>
           <w:sz w:val="22"/>
         </w:rPr>
-        <w:t>) [19]. This automated persistence allows the entire computational lifecycle - from course indexing to database storage - to be instrumented and measured as a unified, deterministic machine pipeline (</w:t>
+        <w:t>) (Dougiamas &amp; Taylor, 2003). This automated persistence allows the entire computational lifecycle - from course indexing to database storage - to be instrumented and measured as a unified, deterministic machine pipeline (</w:t>
       </w:r>
       <w:r>
         <w:rPr>
@@ -2630,7 +2630,7 @@
     </w:p>
     <w:p>
       <w:pPr>
-        <w:spacing w:before="0" w:after="120" w:line="276" w:lineRule="auto"/>
+        <w:spacing w:line="276" w:lineRule="auto" w:before="0" w:after="120"/>
       </w:pPr>
       <w:r>
         <w:rPr>
@@ -2640,7 +2640,7 @@
           <w:color w:val="1A1A1A"/>
           <w:sz w:val="22"/>
         </w:rPr>
-        <w:t>To preserve pedagogical authority, questions are inserted into a designated course review category. Instructors subsequently perform asynchronous review (acceptance, inline editing, or rejection) directly within the native Moodle Question Bank interface prior to publishing questions to active student quizzes [5]. Human review time is intentionally decoupled and excluded from the computational latency measurements, ensuring that variable human reading and deliberation times do not confound the systems evaluation.</w:t>
+        <w:t>To preserve pedagogical authority, questions are inserted into a designated course review category. Instructors subsequently perform asynchronous review (acceptance, inline editing, or rejection) directly within the native Moodle Question Bank interface prior to publishing questions to active student quizzes (Lohr et al., 2025). Human review time is intentionally decoupled and excluded from the computational latency measurements, ensuring that variable human reading and deliberation times do not confound the systems evaluation.</w:t>
       </w:r>
     </w:p>
     <w:p>
@@ -3145,7 +3145,7 @@
                 <w:color w:val="1A1A1A"/>
                 <w:sz w:val="18"/>
               </w:rPr>
-              <w:t>Moodle 4.3.11+ (Build: 20240419) [19]</w:t>
+              <w:t>Moodle 4.3.11+ (Build: 20240419) (Dougiamas &amp; Taylor, 2003)</w:t>
             </w:r>
           </w:p>
         </w:tc>
@@ -3301,7 +3301,7 @@
                 <w:color w:val="1A1A1A"/>
                 <w:sz w:val="18"/>
               </w:rPr>
-              <w:t>) [16]</w:t>
+              <w:t>) (Hui et al., 2024)</w:t>
             </w:r>
           </w:p>
         </w:tc>
@@ -3379,7 +3379,7 @@
                 <w:color w:val="1A1A1A"/>
                 <w:sz w:val="18"/>
               </w:rPr>
-              <w:t>) [15]</w:t>
+              <w:t>) (Nussbaum et al., 2024)</w:t>
             </w:r>
           </w:p>
         </w:tc>
@@ -3439,7 +3439,7 @@
                 <w:color w:val="1A1A1A"/>
                 <w:sz w:val="18"/>
               </w:rPr>
-              <w:t>In-memory normalized NumPy vector store with SHA-256 incremental hash cache [17] and cosine similarity [18]</w:t>
+              <w:t>In-memory normalized NumPy vector store with SHA-256 incremental hash cache (NIST, 2015) and cosine similarity (Singhal, 2001)</w:t>
             </w:r>
           </w:p>
         </w:tc>
@@ -3694,7 +3694,7 @@
     </w:p>
     <w:p>
       <w:pPr>
-        <w:spacing w:before="0" w:after="120" w:line="276" w:lineRule="auto"/>
+        <w:spacing w:line="276" w:lineRule="auto" w:before="0" w:after="120"/>
       </w:pPr>
       <w:r>
         <w:rPr>
@@ -3725,7 +3725,7 @@
     </w:p>
     <w:p>
       <w:pPr>
-        <w:spacing w:before="0" w:after="120" w:line="276" w:lineRule="auto"/>
+        <w:spacing w:line="276" w:lineRule="auto" w:before="0" w:after="120"/>
       </w:pPr>
       <w:r>
         <w:rPr>
@@ -3735,12 +3735,12 @@
           <w:color w:val="1A1A1A"/>
           <w:sz w:val="22"/>
         </w:rPr>
-        <w:t>Approximately 100 MCQs are generated across core Python programming curriculum modules represented in the course corpus. A balanced set spans fundamental cognitive levels according to Bloom's revised taxonomy [20] across core Python concepts: variables and data types, operators, conditionals, loops, functions, strings, lists, dictionaries, exceptions, and object-oriented programming. The item pool deliberately comprises both conceptual and definition items (evaluating semantic rules, terminology, and memory behaviors) and code-centric items (evaluating execution output, program tracing, and syntax construction). Topics absent from the actual course materials are excluded.</w:t>
+        <w:t>Approximately 100 MCQs are generated across core Python programming curriculum modules represented in the course corpus. A balanced set spans fundamental cognitive levels according to Bloom's revised taxonomy (Anderson &amp; Krathwohl, 2001) across core Python concepts: variables and data types, operators, conditionals, loops, functions, strings, lists, dictionaries, exceptions, and object-oriented programming. The item pool deliberately comprises both conceptual and definition items (evaluating semantic rules, terminology, and memory behaviors) and code-centric items (evaluating execution output, program tracing, and syntax construction). Topics absent from the actual course materials are excluded.</w:t>
       </w:r>
     </w:p>
     <w:p>
       <w:pPr>
-        <w:spacing w:before="0" w:after="120" w:line="276" w:lineRule="auto"/>
+        <w:spacing w:line="276" w:lineRule="auto" w:before="0" w:after="120"/>
       </w:pPr>
       <w:r>
         <w:rPr>
@@ -3770,7 +3770,7 @@
           <w:color w:val="1A1A1A"/>
           <w:sz w:val="22"/>
         </w:rPr>
-        <w:t xml:space="preserve"> protocol [22] alongside expert human calibration. State-of-the-art frontier models and calibrated human review are deployed as standardized, independent evaluators:</w:t>
+        <w:t xml:space="preserve"> protocol (Zheng et al., 2023) alongside expert human calibration. State-of-the-art frontier models and calibrated human review are deployed as standardized, independent evaluators:</w:t>
       </w:r>
     </w:p>
     <w:p>
@@ -4077,7 +4077,7 @@
     </w:p>
     <w:p>
       <w:pPr>
-        <w:spacing w:before="0" w:after="120" w:line="276" w:lineRule="auto"/>
+        <w:spacing w:line="276" w:lineRule="auto" w:before="0" w:after="120"/>
       </w:pPr>
       <w:r>
         <w:rPr>
@@ -4253,12 +4253,12 @@
           <w:color w:val="1A1A1A"/>
           <w:sz w:val="22"/>
         </w:rPr>
-        <w:t xml:space="preserve"> Extent to which question premises, code behavior, and distractor concepts are directly referenced or logically supported by the retrieved course slide chunks, evaluating the absence of factual hallucination against the course corpus [21].</w:t>
+        <w:t xml:space="preserve"> Extent to which question premises, code behavior, and distractor concepts are directly referenced or logically supported by the retrieved course slide chunks, evaluating the absence of factual hallucination against the course corpus (Ji et al., 2023).</w:t>
       </w:r>
     </w:p>
     <w:p>
       <w:pPr>
-        <w:spacing w:before="0" w:after="120" w:line="276" w:lineRule="auto"/>
+        <w:spacing w:line="276" w:lineRule="auto" w:before="0" w:after="120"/>
       </w:pPr>
       <w:r>
         <w:rPr>
@@ -4353,7 +4353,7 @@
     </w:p>
     <w:p>
       <w:pPr>
-        <w:spacing w:before="0" w:after="120" w:line="276" w:lineRule="auto"/>
+        <w:spacing w:line="276" w:lineRule="auto" w:before="0" w:after="120"/>
       </w:pPr>
       <w:r>
         <w:rPr>
@@ -4368,7 +4368,7 @@
     </w:p>
     <w:p>
       <w:pPr>
-        <w:spacing w:before="0" w:after="120" w:line="276" w:lineRule="auto"/>
+        <w:spacing w:line="276" w:lineRule="auto" w:before="0" w:after="120"/>
       </w:pPr>
       <w:r>
         <w:rPr>
@@ -4396,7 +4396,7 @@
           <w:color w:val="1A1A1A"/>
           <w:sz w:val="22"/>
         </w:rPr>
-        <w:t>) for categorical acceptance [12] and two-way random-effects Intraclass Correlation Coefficient (</w:t>
+        <w:t>) for categorical acceptance (Fleiss, 1971) and two-way random-effects Intraclass Correlation Coefficient (</w:t>
       </w:r>
       <w:r>
         <w:rPr>
@@ -4439,7 +4439,7 @@
           <w:color w:val="1A1A1A"/>
           <w:sz w:val="22"/>
         </w:rPr>
-        <w:t>) for average rater reliability following the clinical and psychometric guidelines of Koo and Li [13].</w:t>
+        <w:t>) for average rater reliability following the clinical and psychometric guidelines of Koo and Li (2016).</w:t>
       </w:r>
     </w:p>
     <w:p>
@@ -4460,7 +4460,7 @@
     </w:p>
     <w:p>
       <w:pPr>
-        <w:spacing w:before="0" w:after="120" w:line="276" w:lineRule="auto"/>
+        <w:spacing w:line="276" w:lineRule="auto" w:before="0" w:after="120"/>
       </w:pPr>
       <w:r>
         <w:rPr>
@@ -4470,7 +4470,7 @@
           <w:color w:val="1A1A1A"/>
           <w:sz w:val="22"/>
         </w:rPr>
-        <w:t>Ablation isolates the contribution of each architectural optimization while holding the local model, physical hardware, source corpus, prompt schema, and output constraints constant. Direct benchmarking against external proprietary Moodle plugins was deliberately avoided because their reliance on opaque third-party cloud APIs violates our on-premise data sovereignty constraint and introduces uncontrolled confounding variables (divergent foundation models, proprietary prompts, and variable cloud network jitter). Furthermore, standalone tools like L2Q [7] lack vector indexing and LMS database integration, rendering direct head-to-head runtime comparisons architecturally asymmetric. Instead, our four-way ablation strictly isolates the mechanical contribution of each subsystem—embedding caching, context bounding, and retrieval—under identical physical hardware (RTX 3090), a frozen local model (</w:t>
+        <w:t>Ablation isolates the contribution of each architectural optimization while holding the local model, physical hardware, source corpus, prompt schema, and output constraints constant. Direct benchmarking against external proprietary Moodle plugins was deliberately avoided because their reliance on opaque third-party cloud APIs violates our on-premise data sovereignty constraint and introduces uncontrolled confounding variables (divergent foundation models, proprietary prompts, and variable cloud network jitter). Furthermore, standalone tools like L2Q (Shintani, 2026) lack vector indexing and LMS database integration, rendering direct head-to-head runtime comparisons architecturally asymmetric. Instead, our four-way ablation strictly isolates the mechanical contribution of each subsystem—embedding caching, context bounding, and retrieval—under identical physical hardware (RTX 3090), a frozen local model (</w:t>
       </w:r>
       <w:r>
         <w:rPr>
@@ -5291,7 +5291,7 @@
     </w:p>
     <w:p>
       <w:pPr>
-        <w:spacing w:before="0" w:after="120" w:line="276" w:lineRule="auto"/>
+        <w:spacing w:line="276" w:lineRule="auto" w:before="0" w:after="120"/>
       </w:pPr>
       <w:r>
         <w:rPr>
@@ -5798,7 +5798,7 @@
     </w:p>
     <w:p>
       <w:pPr>
-        <w:spacing w:before="0" w:after="120" w:line="276" w:lineRule="auto"/>
+        <w:spacing w:line="276" w:lineRule="auto" w:before="0" w:after="120"/>
       </w:pPr>
       <w:r>
         <w:rPr>
@@ -5893,7 +5893,7 @@
     </w:p>
     <w:p>
       <w:pPr>
-        <w:spacing w:before="0" w:after="120" w:line="276" w:lineRule="auto"/>
+        <w:spacing w:line="276" w:lineRule="auto" w:before="0" w:after="120"/>
       </w:pPr>
       <w:r>
         <w:rPr>
@@ -6685,7 +6685,7 @@
     </w:p>
     <w:p>
       <w:pPr>
-        <w:spacing w:before="0" w:after="120" w:line="276" w:lineRule="auto"/>
+        <w:spacing w:line="276" w:lineRule="auto" w:before="0" w:after="120"/>
       </w:pPr>
       <w:r>
         <w:rPr>
@@ -6822,7 +6822,7 @@
     </w:p>
     <w:p>
       <w:pPr>
-        <w:spacing w:before="0" w:after="120" w:line="276" w:lineRule="auto"/>
+        <w:spacing w:line="276" w:lineRule="auto" w:before="0" w:after="120"/>
       </w:pPr>
       <w:r>
         <w:rPr>
@@ -6951,7 +6951,7 @@
     </w:p>
     <w:p>
       <w:pPr>
-        <w:spacing w:before="0" w:after="120" w:line="276" w:lineRule="auto"/>
+        <w:spacing w:line="276" w:lineRule="auto" w:before="0" w:after="120"/>
       </w:pPr>
       <w:r>
         <w:rPr>
@@ -7020,7 +7020,7 @@
     </w:p>
     <w:p>
       <w:pPr>
-        <w:spacing w:before="0" w:after="120" w:line="276" w:lineRule="auto"/>
+        <w:spacing w:line="276" w:lineRule="auto" w:before="0" w:after="120"/>
       </w:pPr>
       <w:r>
         <w:rPr>
@@ -7216,7 +7216,7 @@
     </w:p>
     <w:p>
       <w:pPr>
-        <w:spacing w:before="0" w:after="120" w:line="276" w:lineRule="auto"/>
+        <w:spacing w:line="276" w:lineRule="auto" w:before="0" w:after="120"/>
       </w:pPr>
       <w:r>
         <w:rPr>
@@ -7247,7 +7247,7 @@
     </w:p>
     <w:p>
       <w:pPr>
-        <w:spacing w:before="0" w:after="120" w:line="276" w:lineRule="auto"/>
+        <w:spacing w:line="276" w:lineRule="auto" w:before="0" w:after="120"/>
       </w:pPr>
       <w:r>
         <w:rPr>
@@ -7503,7 +7503,7 @@
     </w:p>
     <w:p>
       <w:pPr>
-        <w:spacing w:before="0" w:after="120" w:line="276" w:lineRule="auto"/>
+        <w:spacing w:line="276" w:lineRule="auto" w:before="0" w:after="120"/>
       </w:pPr>
       <w:r>
         <w:rPr>
@@ -7623,7 +7623,7 @@
     </w:p>
     <w:p>
       <w:pPr>
-        <w:spacing w:before="0" w:after="120" w:line="276" w:lineRule="auto"/>
+        <w:spacing w:line="276" w:lineRule="auto" w:before="0" w:after="120"/>
       </w:pPr>
       <w:r>
         <w:rPr>
@@ -7885,7 +7885,7 @@
     </w:p>
     <w:p>
       <w:pPr>
-        <w:spacing w:before="0" w:after="120" w:line="276" w:lineRule="auto"/>
+        <w:spacing w:line="276" w:lineRule="auto" w:before="0" w:after="120"/>
       </w:pPr>
       <w:r>
         <w:rPr>
@@ -7916,7 +7916,7 @@
     </w:p>
     <w:p>
       <w:pPr>
-        <w:spacing w:before="0" w:after="120" w:line="276" w:lineRule="auto"/>
+        <w:spacing w:line="276" w:lineRule="auto" w:before="0" w:after="120"/>
       </w:pPr>
       <w:r>
         <w:rPr>
@@ -9060,7 +9060,7 @@
     </w:p>
     <w:p>
       <w:pPr>
-        <w:spacing w:before="0" w:after="120" w:line="276" w:lineRule="auto"/>
+        <w:spacing w:line="276" w:lineRule="auto" w:before="0" w:after="120"/>
       </w:pPr>
       <w:r>
         <w:rPr>
@@ -9179,7 +9179,7 @@
     </w:p>
     <w:p>
       <w:pPr>
-        <w:spacing w:before="0" w:after="120" w:line="276" w:lineRule="auto"/>
+        <w:spacing w:line="276" w:lineRule="auto" w:before="0" w:after="120"/>
       </w:pPr>
       <w:r>
         <w:rPr>
@@ -9450,7 +9450,7 @@
     </w:p>
     <w:p>
       <w:pPr>
-        <w:spacing w:before="0" w:after="120" w:line="276" w:lineRule="auto"/>
+        <w:spacing w:line="276" w:lineRule="auto" w:before="0" w:after="120"/>
       </w:pPr>
       <w:r>
         <w:rPr>
@@ -10739,7 +10739,7 @@
     </w:p>
     <w:p>
       <w:pPr>
-        <w:spacing w:before="0" w:after="120" w:line="276" w:lineRule="auto"/>
+        <w:spacing w:line="276" w:lineRule="auto" w:before="0" w:after="120"/>
       </w:pPr>
       <w:r>
         <w:rPr>
@@ -11731,7 +11731,7 @@
     </w:p>
     <w:p>
       <w:pPr>
-        <w:spacing w:before="0" w:after="120" w:line="276" w:lineRule="auto"/>
+        <w:spacing w:line="276" w:lineRule="auto" w:before="0" w:after="120"/>
       </w:pPr>
       <w:r>
         <w:rPr>
@@ -13804,7 +13804,7 @@
     </w:p>
     <w:p>
       <w:pPr>
-        <w:spacing w:before="0" w:after="120" w:line="276" w:lineRule="auto"/>
+        <w:spacing w:line="276" w:lineRule="auto" w:before="0" w:after="120"/>
       </w:pPr>
       <w:r>
         <w:rPr>
@@ -13957,7 +13957,7 @@
     </w:p>
     <w:p>
       <w:pPr>
-        <w:spacing w:before="0" w:after="120" w:line="276" w:lineRule="auto"/>
+        <w:spacing w:line="276" w:lineRule="auto" w:before="0" w:after="120"/>
       </w:pPr>
       <w:r>
         <w:rPr>
@@ -15370,7 +15370,7 @@
     </w:p>
     <w:p>
       <w:pPr>
-        <w:spacing w:before="0" w:after="120" w:line="276" w:lineRule="auto"/>
+        <w:spacing w:line="276" w:lineRule="auto" w:before="0" w:after="120"/>
       </w:pPr>
       <w:r>
         <w:rPr>
@@ -15401,7 +15401,7 @@
     </w:p>
     <w:p>
       <w:pPr>
-        <w:spacing w:before="0" w:after="120" w:line="276" w:lineRule="auto"/>
+        <w:spacing w:line="276" w:lineRule="auto" w:before="0" w:after="120"/>
       </w:pPr>
       <w:r>
         <w:rPr>
@@ -18109,7 +18109,7 @@
     </w:p>
     <w:p>
       <w:pPr>
-        <w:spacing w:before="0" w:after="120" w:line="276" w:lineRule="auto"/>
+        <w:spacing w:line="276" w:lineRule="auto" w:before="0" w:after="120"/>
       </w:pPr>
       <w:r>
         <w:rPr>
@@ -18232,7 +18232,7 @@
     </w:p>
     <w:p>
       <w:pPr>
-        <w:spacing w:before="0" w:after="120" w:line="276" w:lineRule="auto"/>
+        <w:spacing w:line="276" w:lineRule="auto" w:before="0" w:after="120"/>
       </w:pPr>
       <w:r>
         <w:rPr>
@@ -18283,7 +18283,7 @@
     </w:p>
     <w:p>
       <w:pPr>
-        <w:spacing w:before="0" w:after="120" w:line="276" w:lineRule="auto"/>
+        <w:spacing w:line="276" w:lineRule="auto" w:before="0" w:after="120"/>
       </w:pPr>
       <w:r>
         <w:rPr>
@@ -18341,7 +18341,7 @@
           <w:color w:val="1A1A1A"/>
           <w:sz w:val="22"/>
         </w:rPr>
-        <w:t xml:space="preserve"> (specifically 99.9%) of the total end-to-end execution budget. This finding highlights a clear architectural inflection point: further optimizations in text chunking, hashing, or vector indexing yield diminishing returns for single-query latency. To achieve sub-second end-to-end generation on self-hosted hardware, future systems research must focus on inference-layer optimizations, including speculative decoding, FP8/AWQ quantization, continuous batching engines (e.g., vLLM), and precomputed KV-cache reuse mechanisms such as CacheBlend [10] and TurboRAG [11].</w:t>
+        <w:t xml:space="preserve"> (specifically 99.9%) of the total end-to-end execution budget. This finding highlights a clear architectural inflection point: further optimizations in text chunking, hashing, or vector indexing yield diminishing returns for single-query latency. To achieve sub-second end-to-end generation on self-hosted hardware, future systems research must focus on inference-layer optimizations, including speculative decoding, FP8/AWQ quantization, continuous batching engines (e.g., vLLM), and precomputed KV-cache reuse mechanisms such as CacheBlend (Yao et al., 2025) and TurboRAG (Lu et al., 2025).</w:t>
       </w:r>
     </w:p>
     <w:p>
@@ -18362,7 +18362,7 @@
     </w:p>
     <w:p>
       <w:pPr>
-        <w:spacing w:before="0" w:after="120" w:line="276" w:lineRule="auto"/>
+        <w:spacing w:line="276" w:lineRule="auto" w:before="0" w:after="120"/>
       </w:pPr>
       <w:r>
         <w:rPr>
@@ -18428,7 +18428,7 @@
     </w:p>
     <w:p>
       <w:pPr>
-        <w:spacing w:before="0" w:after="120" w:line="276" w:lineRule="auto"/>
+        <w:spacing w:line="276" w:lineRule="auto" w:before="0" w:after="120"/>
       </w:pPr>
       <w:r>
         <w:rPr>
@@ -18544,7 +18544,7 @@
     </w:p>
     <w:p>
       <w:pPr>
-        <w:spacing w:before="0" w:after="120" w:line="276" w:lineRule="auto"/>
+        <w:spacing w:line="276" w:lineRule="auto" w:before="0" w:after="120"/>
       </w:pPr>
       <w:r>
         <w:rPr>
@@ -18856,7 +18856,7 @@
     </w:p>
     <w:p>
       <w:pPr>
-        <w:spacing w:before="0" w:after="120" w:line="276" w:lineRule="auto"/>
+        <w:spacing w:line="276" w:lineRule="auto" w:before="0" w:after="120"/>
       </w:pPr>
       <w:r>
         <w:rPr>
@@ -19089,7 +19089,7 @@
     </w:p>
     <w:p>
       <w:pPr>
-        <w:spacing w:before="0" w:after="120" w:line="276" w:lineRule="auto"/>
+        <w:spacing w:line="276" w:lineRule="auto" w:before="0" w:after="120"/>
       </w:pPr>
       <w:r>
         <w:rPr>
@@ -19225,7 +19225,7 @@
     </w:p>
     <w:p>
       <w:pPr>
-        <w:spacing w:before="0" w:after="120" w:line="276" w:lineRule="auto"/>
+        <w:spacing w:line="276" w:lineRule="auto" w:before="0" w:after="120"/>
       </w:pPr>
       <w:r>
         <w:rPr>
@@ -20225,7 +20225,7 @@
     </w:p>
     <w:p>
       <w:pPr>
-        <w:spacing w:before="0" w:after="120" w:line="276" w:lineRule="auto"/>
+        <w:spacing w:line="276" w:lineRule="auto" w:before="0" w:after="120"/>
       </w:pPr>
       <w:r>
         <w:rPr>
@@ -20256,7 +20256,7 @@
     </w:p>
     <w:p>
       <w:pPr>
-        <w:spacing w:before="0" w:after="120" w:line="276" w:lineRule="auto"/>
+        <w:spacing w:line="276" w:lineRule="auto" w:before="0" w:after="120"/>
       </w:pPr>
       <w:r>
         <w:rPr>
@@ -20271,7 +20271,7 @@
     </w:p>
     <w:p>
       <w:pPr>
-        <w:spacing w:before="0" w:after="120" w:line="276" w:lineRule="auto"/>
+        <w:spacing w:line="276" w:lineRule="auto" w:before="0" w:after="120"/>
       </w:pPr>
       <w:r>
         <w:rPr>
@@ -20318,7 +20318,7 @@
     </w:p>
     <w:p>
       <w:pPr>
-        <w:spacing w:before="0" w:after="120" w:line="276" w:lineRule="auto"/>
+        <w:spacing w:line="276" w:lineRule="auto" w:before="0" w:after="120"/>
       </w:pPr>
       <w:r>
         <w:rPr>
@@ -20421,7 +20421,7 @@
     </w:p>
     <w:p>
       <w:pPr>
-        <w:spacing w:before="0" w:after="120" w:line="276" w:lineRule="auto"/>
+        <w:spacing w:line="276" w:lineRule="auto" w:before="0" w:after="120"/>
       </w:pPr>
       <w:r>
         <w:rPr>
@@ -20452,7 +20452,7 @@
     </w:p>
     <w:p>
       <w:pPr>
-        <w:spacing w:before="0" w:after="120" w:line="276" w:lineRule="auto"/>
+        <w:spacing w:line="276" w:lineRule="auto" w:before="0" w:after="120"/>
       </w:pPr>
       <w:r>
         <w:rPr>
@@ -20553,7 +20553,7 @@
     </w:p>
     <w:p>
       <w:pPr>
-        <w:spacing w:before="0" w:after="120" w:line="276" w:lineRule="auto"/>
+        <w:spacing w:line="276" w:lineRule="auto" w:before="0" w:after="120"/>
       </w:pPr>
       <w:r>
         <w:rPr>
@@ -20665,7 +20665,7 @@
     </w:p>
     <w:p>
       <w:pPr>
-        <w:spacing w:before="0" w:after="120" w:line="276" w:lineRule="auto"/>
+        <w:spacing w:line="276" w:lineRule="auto" w:before="0" w:after="120"/>
       </w:pPr>
       <w:r>
         <w:rPr>
@@ -20680,7 +20680,7 @@
     </w:p>
     <w:p>
       <w:pPr>
-        <w:spacing w:before="0" w:after="120" w:line="276" w:lineRule="auto"/>
+        <w:spacing w:line="276" w:lineRule="auto" w:before="0" w:after="120"/>
       </w:pPr>
       <w:r>
         <w:rPr>
@@ -20711,7 +20711,7 @@
     </w:p>
     <w:p>
       <w:pPr>
-        <w:spacing w:before="0" w:after="120" w:line="276" w:lineRule="auto"/>
+        <w:spacing w:line="276" w:lineRule="auto" w:before="0" w:after="120"/>
       </w:pPr>
       <w:r>
         <w:rPr>
@@ -20726,7 +20726,7 @@
     </w:p>
     <w:p>
       <w:pPr>
-        <w:spacing w:before="0" w:after="120" w:line="276" w:lineRule="auto"/>
+        <w:spacing w:line="276" w:lineRule="auto" w:before="0" w:after="120"/>
       </w:pPr>
       <w:r>
         <w:rPr>
@@ -21223,7 +21223,7 @@
     </w:p>
     <w:p>
       <w:pPr>
-        <w:spacing w:before="0" w:after="120" w:line="276" w:lineRule="auto"/>
+        <w:spacing w:line="276" w:lineRule="auto" w:before="0" w:after="120"/>
       </w:pPr>
       <w:r>
         <w:rPr>
@@ -21254,7 +21254,7 @@
     </w:p>
     <w:p>
       <w:pPr>
-        <w:spacing w:before="0" w:after="120" w:line="276" w:lineRule="auto"/>
+        <w:spacing w:line="276" w:lineRule="auto" w:before="0" w:after="120"/>
       </w:pPr>
       <w:r>
         <w:rPr>
@@ -21269,7 +21269,7 @@
     </w:p>
     <w:p>
       <w:pPr>
-        <w:spacing w:before="0" w:after="120" w:line="276" w:lineRule="auto"/>
+        <w:spacing w:line="276" w:lineRule="auto" w:before="0" w:after="120"/>
       </w:pPr>
       <w:r>
         <w:rPr>
@@ -21284,7 +21284,7 @@
     </w:p>
     <w:p>
       <w:pPr>
-        <w:spacing w:before="0" w:after="120" w:line="276" w:lineRule="auto"/>
+        <w:spacing w:line="276" w:lineRule="auto" w:before="0" w:after="120"/>
       </w:pPr>
       <w:r>
         <w:rPr>
@@ -21299,7 +21299,7 @@
     </w:p>
     <w:p>
       <w:pPr>
-        <w:spacing w:before="0" w:after="120" w:line="276" w:lineRule="auto"/>
+        <w:spacing w:line="276" w:lineRule="auto" w:before="0" w:after="120"/>
       </w:pPr>
       <w:r>
         <w:rPr>
@@ -21314,7 +21314,7 @@
     </w:p>
     <w:p>
       <w:pPr>
-        <w:spacing w:before="0" w:after="120" w:line="276" w:lineRule="auto"/>
+        <w:spacing w:line="276" w:lineRule="auto" w:before="0" w:after="120"/>
       </w:pPr>
       <w:r>
         <w:rPr>
@@ -21329,7 +21329,7 @@
     </w:p>
     <w:p>
       <w:pPr>
-        <w:spacing w:before="0" w:after="120" w:line="276" w:lineRule="auto"/>
+        <w:spacing w:line="276" w:lineRule="auto" w:before="0" w:after="120"/>
       </w:pPr>
       <w:r>
         <w:rPr>
@@ -21344,7 +21344,7 @@
     </w:p>
     <w:p>
       <w:pPr>
-        <w:spacing w:before="0" w:after="120" w:line="276" w:lineRule="auto"/>
+        <w:spacing w:line="276" w:lineRule="auto" w:before="0" w:after="120"/>
       </w:pPr>
       <w:r>
         <w:rPr>
@@ -21375,8 +21375,8 @@
     </w:p>
     <w:p>
       <w:pPr>
-        <w:spacing w:before="0" w:after="120" w:line="276" w:lineRule="auto"/>
-        <w:ind w:left="432" w:hanging="432"/>
+        <w:spacing w:line="276" w:lineRule="auto" w:before="40" w:after="80"/>
+        <w:ind w:left="576" w:hanging="576"/>
       </w:pPr>
       <w:r>
         <w:rPr>
@@ -21384,15 +21384,35 @@
           <w:b w:val="0"/>
           <w:i w:val="0"/>
           <w:color w:val="1A1A1A"/>
-          <w:sz w:val="19"/>
-        </w:rPr>
-        <w:t>[1] Mucciaccia, S. S., Paixão, T. M., Mutz, F. W., Badue, C. S., de Souza, A. F., &amp; Oliveira-Santos, T. (2025). Automatic multiple-choice question generation and evaluation systems based on LLM: A study case with university resolutions. Proceedings of the 31st International Conference on Computational Linguistics, 2246–2260.</w:t>
+          <w:sz w:val="20"/>
+        </w:rPr>
+        <w:t xml:space="preserve">Anderson, L. W., &amp; Krathwohl, D. R. (Eds.). (2001). </w:t>
+      </w:r>
+      <w:r>
+        <w:rPr>
+          <w:rFonts w:ascii="Times New Roman" w:hAnsi="Times New Roman"/>
+          <w:b w:val="0"/>
+          <w:i/>
+          <w:color w:val="1A1A1A"/>
+          <w:sz w:val="20"/>
+        </w:rPr>
+        <w:t>A taxonomy for learning, teaching, and assessing: A revision of Bloom's taxonomy of educational objectives</w:t>
+      </w:r>
+      <w:r>
+        <w:rPr>
+          <w:rFonts w:ascii="Times New Roman" w:hAnsi="Times New Roman"/>
+          <w:b w:val="0"/>
+          <w:i w:val="0"/>
+          <w:color w:val="1A1A1A"/>
+          <w:sz w:val="20"/>
+        </w:rPr>
+        <w:t>. Longman.</w:t>
       </w:r>
     </w:p>
     <w:p>
       <w:pPr>
-        <w:spacing w:before="0" w:after="120" w:line="276" w:lineRule="auto"/>
-        <w:ind w:left="432" w:hanging="432"/>
+        <w:spacing w:line="276" w:lineRule="auto" w:before="40" w:after="80"/>
+        <w:ind w:left="576" w:hanging="576"/>
       </w:pPr>
       <w:r>
         <w:rPr>
@@ -21400,15 +21420,35 @@
           <w:b w:val="0"/>
           <w:i w:val="0"/>
           <w:color w:val="1A1A1A"/>
-          <w:sz w:val="19"/>
-        </w:rPr>
-        <w:t>[2] Lewis, P., Perez, E., Piktus, A., Petroni, F., Karpukhin, V., Goyal, N., Küttler, H., Lewis, M., Yih, W.-t., Rocktäschel, T., Riedel, S., &amp; Kiela, D. (2020). Retrieval-augmented generation for knowledge-intensive NLP tasks. Advances in Neural Information Processing Systems, 33, 9459–9474.</w:t>
+          <w:sz w:val="20"/>
+        </w:rPr>
+        <w:t xml:space="preserve">Dougiamas, M., &amp; Taylor, P. C. (2003). Moodle: Using learning communities to create an open source course management system. </w:t>
+      </w:r>
+      <w:r>
+        <w:rPr>
+          <w:rFonts w:ascii="Times New Roman" w:hAnsi="Times New Roman"/>
+          <w:b w:val="0"/>
+          <w:i/>
+          <w:color w:val="1A1A1A"/>
+          <w:sz w:val="20"/>
+        </w:rPr>
+        <w:t>Proceedings of the ED-MEDIA 2003 Conference</w:t>
+      </w:r>
+      <w:r>
+        <w:rPr>
+          <w:rFonts w:ascii="Times New Roman" w:hAnsi="Times New Roman"/>
+          <w:b w:val="0"/>
+          <w:i w:val="0"/>
+          <w:color w:val="1A1A1A"/>
+          <w:sz w:val="20"/>
+        </w:rPr>
+        <w:t>, 171–178.</w:t>
       </w:r>
     </w:p>
     <w:p>
       <w:pPr>
-        <w:spacing w:before="0" w:after="120" w:line="276" w:lineRule="auto"/>
-        <w:ind w:left="432" w:hanging="432"/>
+        <w:spacing w:line="276" w:lineRule="auto" w:before="40" w:after="80"/>
+        <w:ind w:left="576" w:hanging="576"/>
       </w:pPr>
       <w:r>
         <w:rPr>
@@ -21416,15 +21456,35 @@
           <w:b w:val="0"/>
           <w:i w:val="0"/>
           <w:color w:val="1A1A1A"/>
-          <w:sz w:val="19"/>
-        </w:rPr>
-        <w:t>[3] Li, Z., Wang, Z., Wang, W., Hung, K., Xie, H., &amp; Wang, F. L. (2025). Retrieval-augmented generation for educational application: A systematic survey. Computers and Education: Artificial Intelligence, 8, 100417. https://doi.org/10.1016/j.caeai.2025.100417</w:t>
+          <w:sz w:val="20"/>
+        </w:rPr>
+        <w:t xml:space="preserve">Fleiss, J. L. (1971). Measuring nominal scale agreement among many raters. </w:t>
+      </w:r>
+      <w:r>
+        <w:rPr>
+          <w:rFonts w:ascii="Times New Roman" w:hAnsi="Times New Roman"/>
+          <w:b w:val="0"/>
+          <w:i/>
+          <w:color w:val="1A1A1A"/>
+          <w:sz w:val="20"/>
+        </w:rPr>
+        <w:t>Psychological Bulletin</w:t>
+      </w:r>
+      <w:r>
+        <w:rPr>
+          <w:rFonts w:ascii="Times New Roman" w:hAnsi="Times New Roman"/>
+          <w:b w:val="0"/>
+          <w:i w:val="0"/>
+          <w:color w:val="1A1A1A"/>
+          <w:sz w:val="20"/>
+        </w:rPr>
+        <w:t>, 76(5), 378–382. https://doi.org/10.1037/h0031619</w:t>
       </w:r>
     </w:p>
     <w:p>
       <w:pPr>
-        <w:spacing w:before="0" w:after="120" w:line="276" w:lineRule="auto"/>
-        <w:ind w:left="432" w:hanging="432"/>
+        <w:spacing w:line="276" w:lineRule="auto" w:before="40" w:after="80"/>
+        <w:ind w:left="576" w:hanging="576"/>
       </w:pPr>
       <w:r>
         <w:rPr>
@@ -21432,15 +21492,35 @@
           <w:b w:val="0"/>
           <w:i w:val="0"/>
           <w:color w:val="1A1A1A"/>
-          <w:sz w:val="19"/>
-        </w:rPr>
-        <w:t>[4] Pradeesh, N., Remya, T., Thushara, M. G., Krishna, K. A., &amp; Pranav, V. (2025). Retrieval-augmented generation for multiple-choice questions and answers generation. Procedia Computer Science, 259, 504–511. https://doi.org/10.1016/j.procs.2025.03.352</w:t>
+          <w:sz w:val="20"/>
+        </w:rPr>
+        <w:t xml:space="preserve">Hui, B., Yang, J., Cui, Z., Yang, X., Liu, D., Zhang, L., &amp; Lin, J. (2024). </w:t>
+      </w:r>
+      <w:r>
+        <w:rPr>
+          <w:rFonts w:ascii="Times New Roman" w:hAnsi="Times New Roman"/>
+          <w:b w:val="0"/>
+          <w:i/>
+          <w:color w:val="1A1A1A"/>
+          <w:sz w:val="20"/>
+        </w:rPr>
+        <w:t>Qwen2.5-Coder technical report</w:t>
+      </w:r>
+      <w:r>
+        <w:rPr>
+          <w:rFonts w:ascii="Times New Roman" w:hAnsi="Times New Roman"/>
+          <w:b w:val="0"/>
+          <w:i w:val="0"/>
+          <w:color w:val="1A1A1A"/>
+          <w:sz w:val="20"/>
+        </w:rPr>
+        <w:t>. arXiv preprint arXiv:2409.12186.</w:t>
       </w:r>
     </w:p>
     <w:p>
       <w:pPr>
-        <w:spacing w:before="0" w:after="120" w:line="276" w:lineRule="auto"/>
-        <w:ind w:left="432" w:hanging="432"/>
+        <w:spacing w:line="276" w:lineRule="auto" w:before="40" w:after="80"/>
+        <w:ind w:left="576" w:hanging="576"/>
       </w:pPr>
       <w:r>
         <w:rPr>
@@ -21448,15 +21528,35 @@
           <w:b w:val="0"/>
           <w:i w:val="0"/>
           <w:color w:val="1A1A1A"/>
-          <w:sz w:val="19"/>
-        </w:rPr>
-        <w:t>[5] Lohr, D., Berges, M., Chugh, A., Kohlhase, M., &amp; Müller, D. (2025). Leveraging large language models to generate course-specific semantically annotated learning objects. Journal of Computer Assisted Learning, 41(1), e13101. https://doi.org/10.1111/jcal.13101</w:t>
+          <w:sz w:val="20"/>
+        </w:rPr>
+        <w:t xml:space="preserve">Ji, Z., Lee, N., Frieske, R., Yu, T., Su, D., Xu, Y., Ishii, E., Yeung, Y. J., Del Luceno, A., &amp; Fung, P. (2023). Survey of hallucination in natural language generation. </w:t>
+      </w:r>
+      <w:r>
+        <w:rPr>
+          <w:rFonts w:ascii="Times New Roman" w:hAnsi="Times New Roman"/>
+          <w:b w:val="0"/>
+          <w:i/>
+          <w:color w:val="1A1A1A"/>
+          <w:sz w:val="20"/>
+        </w:rPr>
+        <w:t>ACM Computing Surveys</w:t>
+      </w:r>
+      <w:r>
+        <w:rPr>
+          <w:rFonts w:ascii="Times New Roman" w:hAnsi="Times New Roman"/>
+          <w:b w:val="0"/>
+          <w:i w:val="0"/>
+          <w:color w:val="1A1A1A"/>
+          <w:sz w:val="20"/>
+        </w:rPr>
+        <w:t>, 55(12), 1–38. https://doi.org/10.1145/3571730</w:t>
       </w:r>
     </w:p>
     <w:p>
       <w:pPr>
-        <w:spacing w:before="0" w:after="120" w:line="276" w:lineRule="auto"/>
-        <w:ind w:left="432" w:hanging="432"/>
+        <w:spacing w:line="276" w:lineRule="auto" w:before="40" w:after="80"/>
+        <w:ind w:left="576" w:hanging="576"/>
       </w:pPr>
       <w:r>
         <w:rPr>
@@ -21464,15 +21564,35 @@
           <w:b w:val="0"/>
           <w:i w:val="0"/>
           <w:color w:val="1A1A1A"/>
-          <w:sz w:val="19"/>
-        </w:rPr>
-        <w:t>[6] Olibo, E. (2025). Enhancing RAG-based MCQ generation for Java programming education: A modular evaluation of chunking, retrieval and LLM performance [Bachelor’s thesis, Kristianstad University].</w:t>
+          <w:sz w:val="20"/>
+        </w:rPr>
+        <w:t xml:space="preserve">Koo, T. K., &amp; Li, M. Y. (2016). A guideline of selecting and reporting intraclass correlation coefficients for reliability research. </w:t>
+      </w:r>
+      <w:r>
+        <w:rPr>
+          <w:rFonts w:ascii="Times New Roman" w:hAnsi="Times New Roman"/>
+          <w:b w:val="0"/>
+          <w:i/>
+          <w:color w:val="1A1A1A"/>
+          <w:sz w:val="20"/>
+        </w:rPr>
+        <w:t>Journal of Chiropractic Medicine</w:t>
+      </w:r>
+      <w:r>
+        <w:rPr>
+          <w:rFonts w:ascii="Times New Roman" w:hAnsi="Times New Roman"/>
+          <w:b w:val="0"/>
+          <w:i w:val="0"/>
+          <w:color w:val="1A1A1A"/>
+          <w:sz w:val="20"/>
+        </w:rPr>
+        <w:t>, 15(2), 155–163. https://doi.org/10.1016/j.jcm.2016.02.012</w:t>
       </w:r>
     </w:p>
     <w:p>
       <w:pPr>
-        <w:spacing w:before="0" w:after="120" w:line="276" w:lineRule="auto"/>
-        <w:ind w:left="432" w:hanging="432"/>
+        <w:spacing w:line="276" w:lineRule="auto" w:before="40" w:after="80"/>
+        <w:ind w:left="576" w:hanging="576"/>
       </w:pPr>
       <w:r>
         <w:rPr>
@@ -21480,15 +21600,35 @@
           <w:b w:val="0"/>
           <w:i w:val="0"/>
           <w:color w:val="1A1A1A"/>
-          <w:sz w:val="19"/>
-        </w:rPr>
-        <w:t>[7] Shintani, S. A. (2026). Self-hosted lecture-to-quiz: Local LLM MCQ generation with deterministic quality control. arXiv:2603.08729.</w:t>
+          <w:sz w:val="20"/>
+        </w:rPr>
+        <w:t xml:space="preserve">Lee, Y. (2025). Developing a computer-based tutor utilizing Generative Artificial Intelligence (GAI) and Retrieval-Augmented Generation (RAG). </w:t>
+      </w:r>
+      <w:r>
+        <w:rPr>
+          <w:rFonts w:ascii="Times New Roman" w:hAnsi="Times New Roman"/>
+          <w:b w:val="0"/>
+          <w:i/>
+          <w:color w:val="1A1A1A"/>
+          <w:sz w:val="20"/>
+        </w:rPr>
+        <w:t>Education and Information Technologies</w:t>
+      </w:r>
+      <w:r>
+        <w:rPr>
+          <w:rFonts w:ascii="Times New Roman" w:hAnsi="Times New Roman"/>
+          <w:b w:val="0"/>
+          <w:i w:val="0"/>
+          <w:color w:val="1A1A1A"/>
+          <w:sz w:val="20"/>
+        </w:rPr>
+        <w:t>, 30(6), 7841–7862. https://doi.org/10.1007/s10639-024-13129-5</w:t>
       </w:r>
     </w:p>
     <w:p>
       <w:pPr>
-        <w:spacing w:before="0" w:after="120" w:line="276" w:lineRule="auto"/>
-        <w:ind w:left="432" w:hanging="432"/>
+        <w:spacing w:line="276" w:lineRule="auto" w:before="40" w:after="80"/>
+        <w:ind w:left="576" w:hanging="576"/>
       </w:pPr>
       <w:r>
         <w:rPr>
@@ -21496,15 +21636,35 @@
           <w:b w:val="0"/>
           <w:i w:val="0"/>
           <w:color w:val="1A1A1A"/>
-          <w:sz w:val="19"/>
-        </w:rPr>
-        <w:t>[8] Tran, H. V., Nguyen, P. V., Vu, T. T. N., Luong, H. P., &amp; Le, D.-N. (2026). A course-specific agentic RAG chatbot for IT student support: Architecture, local deployment, and preliminary evaluation at Hai Phong University. Next-Generation Computing Systems and Technologies, 2(2), 21–34. https://doi.org/10.62762/NGCST.2026.601800</w:t>
+          <w:sz w:val="20"/>
+        </w:rPr>
+        <w:t xml:space="preserve">Lewis, P., Perez, E., Piktus, A., Petroni, F., Karpukhin, V., Goyal, N., Küttler, H., Lewis, M., Yih, W.-t., Rocktäschel, T., Riedel, S., &amp; Kiela, D. (2020). Retrieval-augmented generation for knowledge-intensive NLP tasks. </w:t>
+      </w:r>
+      <w:r>
+        <w:rPr>
+          <w:rFonts w:ascii="Times New Roman" w:hAnsi="Times New Roman"/>
+          <w:b w:val="0"/>
+          <w:i/>
+          <w:color w:val="1A1A1A"/>
+          <w:sz w:val="20"/>
+        </w:rPr>
+        <w:t>Advances in Neural Information Processing Systems</w:t>
+      </w:r>
+      <w:r>
+        <w:rPr>
+          <w:rFonts w:ascii="Times New Roman" w:hAnsi="Times New Roman"/>
+          <w:b w:val="0"/>
+          <w:i w:val="0"/>
+          <w:color w:val="1A1A1A"/>
+          <w:sz w:val="20"/>
+        </w:rPr>
+        <w:t>, 33, 9459–9474.</w:t>
       </w:r>
     </w:p>
     <w:p>
       <w:pPr>
-        <w:spacing w:before="0" w:after="120" w:line="276" w:lineRule="auto"/>
-        <w:ind w:left="432" w:hanging="432"/>
+        <w:spacing w:line="276" w:lineRule="auto" w:before="40" w:after="80"/>
+        <w:ind w:left="576" w:hanging="576"/>
       </w:pPr>
       <w:r>
         <w:rPr>
@@ -21512,15 +21672,35 @@
           <w:b w:val="0"/>
           <w:i w:val="0"/>
           <w:color w:val="1A1A1A"/>
-          <w:sz w:val="19"/>
-        </w:rPr>
-        <w:t>[9] Shen, X., Feng, L., Hua, S., Liu, D., Xie, Z., &amp; Liu, B. (2026). Towards sustainable AI knowledge-base assistants in computer science education: On-premise deployment and optimization with open educational resources. Frontiers in Psychology, 17, 1843444. https://doi.org/10.3389/fpsyg.2026.1843444</w:t>
+          <w:sz w:val="20"/>
+        </w:rPr>
+        <w:t xml:space="preserve">Li, Z., Wang, Z., Wang, W., Hung, K., Xie, H., &amp; Wang, F. L. (2025). Retrieval-augmented generation for educational application: A systematic survey. </w:t>
+      </w:r>
+      <w:r>
+        <w:rPr>
+          <w:rFonts w:ascii="Times New Roman" w:hAnsi="Times New Roman"/>
+          <w:b w:val="0"/>
+          <w:i/>
+          <w:color w:val="1A1A1A"/>
+          <w:sz w:val="20"/>
+        </w:rPr>
+        <w:t>Computers and Education: Artificial Intelligence</w:t>
+      </w:r>
+      <w:r>
+        <w:rPr>
+          <w:rFonts w:ascii="Times New Roman" w:hAnsi="Times New Roman"/>
+          <w:b w:val="0"/>
+          <w:i w:val="0"/>
+          <w:color w:val="1A1A1A"/>
+          <w:sz w:val="20"/>
+        </w:rPr>
+        <w:t>, 8, 100417. https://doi.org/10.1016/caeai.2025.100417</w:t>
       </w:r>
     </w:p>
     <w:p>
       <w:pPr>
-        <w:spacing w:before="0" w:after="120" w:line="276" w:lineRule="auto"/>
-        <w:ind w:left="432" w:hanging="432"/>
+        <w:spacing w:line="276" w:lineRule="auto" w:before="40" w:after="80"/>
+        <w:ind w:left="576" w:hanging="576"/>
       </w:pPr>
       <w:r>
         <w:rPr>
@@ -21528,15 +21708,35 @@
           <w:b w:val="0"/>
           <w:i w:val="0"/>
           <w:color w:val="1A1A1A"/>
-          <w:sz w:val="19"/>
-        </w:rPr>
-        <w:t>[10] Yao, J., Li, H., Liu, Y., Ray, S., Cheng, Y., Zhang, Q., Du, K., Lu, S., &amp; Jiang, J. (2025). CacheBlend: Fast large language model serving for RAG with cached knowledge fusion. Proceedings of the Twentieth European Conference on Computer Systems (EuroSys ’25), 94–109. https://doi.org/10.1145/3689031.3696098</w:t>
+          <w:sz w:val="20"/>
+        </w:rPr>
+        <w:t xml:space="preserve">Lohr, D., Berges, M., Chugh, A., Kohlhase, M., &amp; Müller, D. (2025). Leveraging large language models to generate course-specific semantically annotated learning objects. </w:t>
+      </w:r>
+      <w:r>
+        <w:rPr>
+          <w:rFonts w:ascii="Times New Roman" w:hAnsi="Times New Roman"/>
+          <w:b w:val="0"/>
+          <w:i/>
+          <w:color w:val="1A1A1A"/>
+          <w:sz w:val="20"/>
+        </w:rPr>
+        <w:t>Journal of Computer Assisted Learning</w:t>
+      </w:r>
+      <w:r>
+        <w:rPr>
+          <w:rFonts w:ascii="Times New Roman" w:hAnsi="Times New Roman"/>
+          <w:b w:val="0"/>
+          <w:i w:val="0"/>
+          <w:color w:val="1A1A1A"/>
+          <w:sz w:val="20"/>
+        </w:rPr>
+        <w:t>, 41(1), e13101. https://doi.org/10.1111/jcal.13101</w:t>
       </w:r>
     </w:p>
     <w:p>
       <w:pPr>
-        <w:spacing w:before="0" w:after="120" w:line="276" w:lineRule="auto"/>
-        <w:ind w:left="432" w:hanging="432"/>
+        <w:spacing w:line="276" w:lineRule="auto" w:before="40" w:after="80"/>
+        <w:ind w:left="576" w:hanging="576"/>
       </w:pPr>
       <w:r>
         <w:rPr>
@@ -21544,15 +21744,35 @@
           <w:b w:val="0"/>
           <w:i w:val="0"/>
           <w:color w:val="1A1A1A"/>
-          <w:sz w:val="19"/>
-        </w:rPr>
-        <w:t>[11] Lu, S., Wang, H., Rong, Y., Chen, Z., &amp; Tang, Y. (2025). TurboRAG: Accelerating retrieval-augmented generation with precomputed KV caches for chunked text. Proceedings of the 2025 Conference on Empirical Methods in Natural Language Processing, 6588–6601. https://doi.org/10.18653/v1/2025.emnlp-main.334</w:t>
+          <w:sz w:val="20"/>
+        </w:rPr>
+        <w:t xml:space="preserve">Lu, S., Wang, H., Rong, Y., Chen, Z., &amp; Tang, Y. (2025). TurboRAG: Accelerating retrieval-augmented generation with precomputed KV caches for chunked text. </w:t>
+      </w:r>
+      <w:r>
+        <w:rPr>
+          <w:rFonts w:ascii="Times New Roman" w:hAnsi="Times New Roman"/>
+          <w:b w:val="0"/>
+          <w:i/>
+          <w:color w:val="1A1A1A"/>
+          <w:sz w:val="20"/>
+        </w:rPr>
+        <w:t>Proceedings of the 2025 Conference on Empirical Methods in Natural Language Processing</w:t>
+      </w:r>
+      <w:r>
+        <w:rPr>
+          <w:rFonts w:ascii="Times New Roman" w:hAnsi="Times New Roman"/>
+          <w:b w:val="0"/>
+          <w:i w:val="0"/>
+          <w:color w:val="1A1A1A"/>
+          <w:sz w:val="20"/>
+        </w:rPr>
+        <w:t>, 6588–6601. https://doi.org/10.18653/v1/2025.emnlp-main.334</w:t>
       </w:r>
     </w:p>
     <w:p>
       <w:pPr>
-        <w:spacing w:before="0" w:after="120" w:line="276" w:lineRule="auto"/>
-        <w:ind w:left="432" w:hanging="432"/>
+        <w:spacing w:line="276" w:lineRule="auto" w:before="40" w:after="80"/>
+        <w:ind w:left="576" w:hanging="576"/>
       </w:pPr>
       <w:r>
         <w:rPr>
@@ -21560,15 +21780,35 @@
           <w:b w:val="0"/>
           <w:i w:val="0"/>
           <w:color w:val="1A1A1A"/>
-          <w:sz w:val="19"/>
-        </w:rPr>
-        <w:t>[12] Fleiss, J. L. (1971). Measuring nominal scale agreement among many raters. Psychological Bulletin, 76(5), 378–382. https://doi.org/10.1037/h0031619</w:t>
+          <w:sz w:val="20"/>
+        </w:rPr>
+        <w:t xml:space="preserve">Mucciaccia, S. S., Paixão, T. M., Mutz, F. W., Badue, C. S., de Souza, A. F., &amp; Oliveira-Santos, T. (2025). Automatic multiple-choice question generation and evaluation systems based on LLM: A study case with university resolutions. </w:t>
+      </w:r>
+      <w:r>
+        <w:rPr>
+          <w:rFonts w:ascii="Times New Roman" w:hAnsi="Times New Roman"/>
+          <w:b w:val="0"/>
+          <w:i/>
+          <w:color w:val="1A1A1A"/>
+          <w:sz w:val="20"/>
+        </w:rPr>
+        <w:t>Proceedings of the 31st International Conference on Computational Linguistics</w:t>
+      </w:r>
+      <w:r>
+        <w:rPr>
+          <w:rFonts w:ascii="Times New Roman" w:hAnsi="Times New Roman"/>
+          <w:b w:val="0"/>
+          <w:i w:val="0"/>
+          <w:color w:val="1A1A1A"/>
+          <w:sz w:val="20"/>
+        </w:rPr>
+        <w:t>, 2246–2260.</w:t>
       </w:r>
     </w:p>
     <w:p>
       <w:pPr>
-        <w:spacing w:before="0" w:after="120" w:line="276" w:lineRule="auto"/>
-        <w:ind w:left="432" w:hanging="432"/>
+        <w:spacing w:line="276" w:lineRule="auto" w:before="40" w:after="80"/>
+        <w:ind w:left="576" w:hanging="576"/>
       </w:pPr>
       <w:r>
         <w:rPr>
@@ -21576,15 +21816,35 @@
           <w:b w:val="0"/>
           <w:i w:val="0"/>
           <w:color w:val="1A1A1A"/>
-          <w:sz w:val="19"/>
-        </w:rPr>
-        <w:t>[13] Koo, T. K., &amp; Li, M. Y. (2016). A guideline of selecting and reporting intraclass correlation coefficients for reliability research. Journal of Chiropractic Medicine, 15(2), 155–163. https://doi.org/10.1016/j.jcm.2016.02.012</w:t>
+          <w:sz w:val="20"/>
+        </w:rPr>
+        <w:t xml:space="preserve">National Institute of Standards and Technology (NIST). (2015). </w:t>
+      </w:r>
+      <w:r>
+        <w:rPr>
+          <w:rFonts w:ascii="Times New Roman" w:hAnsi="Times New Roman"/>
+          <w:b w:val="0"/>
+          <w:i/>
+          <w:color w:val="1A1A1A"/>
+          <w:sz w:val="20"/>
+        </w:rPr>
+        <w:t>Secure Hash Standard (SHS)</w:t>
+      </w:r>
+      <w:r>
+        <w:rPr>
+          <w:rFonts w:ascii="Times New Roman" w:hAnsi="Times New Roman"/>
+          <w:b w:val="0"/>
+          <w:i w:val="0"/>
+          <w:color w:val="1A1A1A"/>
+          <w:sz w:val="20"/>
+        </w:rPr>
+        <w:t>. Federal Information Processing Standards Publication (FIPS PUB 180-4). https://doi.org/10.6028/NIST.FIPS.180-4</w:t>
       </w:r>
     </w:p>
     <w:p>
       <w:pPr>
-        <w:spacing w:before="0" w:after="120" w:line="276" w:lineRule="auto"/>
-        <w:ind w:left="432" w:hanging="432"/>
+        <w:spacing w:line="276" w:lineRule="auto" w:before="40" w:after="80"/>
+        <w:ind w:left="576" w:hanging="576"/>
       </w:pPr>
       <w:r>
         <w:rPr>
@@ -21592,15 +21852,35 @@
           <w:b w:val="0"/>
           <w:i w:val="0"/>
           <w:color w:val="1A1A1A"/>
-          <w:sz w:val="19"/>
-        </w:rPr>
-        <w:t>[14] Lee, Y. (2025). Developing a computer-based tutor utilizing Generative Artificial Intelligence (GAI) and Retrieval-Augmented Generation (RAG). Education and Information Technologies, 30(6), 7841–7862. https://doi.org/10.1007/s10639-024-13129-5</w:t>
+          <w:sz w:val="20"/>
+        </w:rPr>
+        <w:t xml:space="preserve">Nussbaum, Z., Morris, J. X., Dinh, B., &amp; Mostern, A. (2024). </w:t>
+      </w:r>
+      <w:r>
+        <w:rPr>
+          <w:rFonts w:ascii="Times New Roman" w:hAnsi="Times New Roman"/>
+          <w:b w:val="0"/>
+          <w:i/>
+          <w:color w:val="1A1A1A"/>
+          <w:sz w:val="20"/>
+        </w:rPr>
+        <w:t>Nomic Embed: Training a reproducible long-context text embedder</w:t>
+      </w:r>
+      <w:r>
+        <w:rPr>
+          <w:rFonts w:ascii="Times New Roman" w:hAnsi="Times New Roman"/>
+          <w:b w:val="0"/>
+          <w:i w:val="0"/>
+          <w:color w:val="1A1A1A"/>
+          <w:sz w:val="20"/>
+        </w:rPr>
+        <w:t>. arXiv preprint arXiv:2402.01613.</w:t>
       </w:r>
     </w:p>
     <w:p>
       <w:pPr>
-        <w:spacing w:before="0" w:after="120" w:line="276" w:lineRule="auto"/>
-        <w:ind w:left="432" w:hanging="432"/>
+        <w:spacing w:line="276" w:lineRule="auto" w:before="40" w:after="80"/>
+        <w:ind w:left="576" w:hanging="576"/>
       </w:pPr>
       <w:r>
         <w:rPr>
@@ -21608,15 +21888,35 @@
           <w:b w:val="0"/>
           <w:i w:val="0"/>
           <w:color w:val="1A1A1A"/>
-          <w:sz w:val="19"/>
-        </w:rPr>
-        <w:t>[15] Nussbaum, Z., Morris, J. X., Dinh, B., &amp; Mostern, A. (2024). Nomic Embed: Training a reproducible long-context text embedder. arXiv preprint arXiv:2402.01613.</w:t>
+          <w:sz w:val="20"/>
+        </w:rPr>
+        <w:t xml:space="preserve">Olibo, E. (2025). </w:t>
+      </w:r>
+      <w:r>
+        <w:rPr>
+          <w:rFonts w:ascii="Times New Roman" w:hAnsi="Times New Roman"/>
+          <w:b w:val="0"/>
+          <w:i/>
+          <w:color w:val="1A1A1A"/>
+          <w:sz w:val="20"/>
+        </w:rPr>
+        <w:t>Enhancing RAG-based MCQ generation for Java programming education: A modular evaluation of chunking, retrieval and LLM performance</w:t>
+      </w:r>
+      <w:r>
+        <w:rPr>
+          <w:rFonts w:ascii="Times New Roman" w:hAnsi="Times New Roman"/>
+          <w:b w:val="0"/>
+          <w:i w:val="0"/>
+          <w:color w:val="1A1A1A"/>
+          <w:sz w:val="20"/>
+        </w:rPr>
+        <w:t xml:space="preserve"> [Bachelor’s thesis, Kristianstad University].</w:t>
       </w:r>
     </w:p>
     <w:p>
       <w:pPr>
-        <w:spacing w:before="0" w:after="120" w:line="276" w:lineRule="auto"/>
-        <w:ind w:left="432" w:hanging="432"/>
+        <w:spacing w:line="276" w:lineRule="auto" w:before="40" w:after="80"/>
+        <w:ind w:left="576" w:hanging="576"/>
       </w:pPr>
       <w:r>
         <w:rPr>
@@ -21624,15 +21924,35 @@
           <w:b w:val="0"/>
           <w:i w:val="0"/>
           <w:color w:val="1A1A1A"/>
-          <w:sz w:val="19"/>
-        </w:rPr>
-        <w:t>[16] Hui, B., Yang, J., Cui, Z., Yang, X., Liu, D., Zhang, L., &amp; Lin, J. (2024). Qwen2.5-Coder technical report. arXiv preprint arXiv:2409.12186.</w:t>
+          <w:sz w:val="20"/>
+        </w:rPr>
+        <w:t xml:space="preserve">Pradeesh, N., Remya, T., Thushara, M. G., Krishna, K. A., &amp; Pranav, V. (2025). Retrieval-augmented generation for multiple-choice questions and answers generation. </w:t>
+      </w:r>
+      <w:r>
+        <w:rPr>
+          <w:rFonts w:ascii="Times New Roman" w:hAnsi="Times New Roman"/>
+          <w:b w:val="0"/>
+          <w:i/>
+          <w:color w:val="1A1A1A"/>
+          <w:sz w:val="20"/>
+        </w:rPr>
+        <w:t>Procedia Computer Science</w:t>
+      </w:r>
+      <w:r>
+        <w:rPr>
+          <w:rFonts w:ascii="Times New Roman" w:hAnsi="Times New Roman"/>
+          <w:b w:val="0"/>
+          <w:i w:val="0"/>
+          <w:color w:val="1A1A1A"/>
+          <w:sz w:val="20"/>
+        </w:rPr>
+        <w:t>, 259, 504–511. https://doi.org/10.1016/j.procs.2025.03.352</w:t>
       </w:r>
     </w:p>
     <w:p>
       <w:pPr>
-        <w:spacing w:before="0" w:after="120" w:line="276" w:lineRule="auto"/>
-        <w:ind w:left="432" w:hanging="432"/>
+        <w:spacing w:line="276" w:lineRule="auto" w:before="40" w:after="80"/>
+        <w:ind w:left="576" w:hanging="576"/>
       </w:pPr>
       <w:r>
         <w:rPr>
@@ -21640,15 +21960,35 @@
           <w:b w:val="0"/>
           <w:i w:val="0"/>
           <w:color w:val="1A1A1A"/>
-          <w:sz w:val="19"/>
-        </w:rPr>
-        <w:t>[17] National Institute of Standards and Technology (NIST). (2015). Secure Hash Standard (SHS). Federal Information Processing Standards Publication (FIPS PUB 180-4). https://doi.org/10.6028/NIST.FIPS.180-4</w:t>
+          <w:sz w:val="20"/>
+        </w:rPr>
+        <w:t xml:space="preserve">Shen, X., Feng, L., Hua, S., Liu, D., Xie, Z., &amp; Liu, B. (2026). Towards sustainable AI knowledge-base assistants in computer science education: On-premise deployment and optimization with open educational resources. </w:t>
+      </w:r>
+      <w:r>
+        <w:rPr>
+          <w:rFonts w:ascii="Times New Roman" w:hAnsi="Times New Roman"/>
+          <w:b w:val="0"/>
+          <w:i/>
+          <w:color w:val="1A1A1A"/>
+          <w:sz w:val="20"/>
+        </w:rPr>
+        <w:t>Frontiers in Psychology</w:t>
+      </w:r>
+      <w:r>
+        <w:rPr>
+          <w:rFonts w:ascii="Times New Roman" w:hAnsi="Times New Roman"/>
+          <w:b w:val="0"/>
+          <w:i w:val="0"/>
+          <w:color w:val="1A1A1A"/>
+          <w:sz w:val="20"/>
+        </w:rPr>
+        <w:t>, 17, 1843444. https://doi.org/10.3389/fpsyg.2026.1843444</w:t>
       </w:r>
     </w:p>
     <w:p>
       <w:pPr>
-        <w:spacing w:before="0" w:after="120" w:line="276" w:lineRule="auto"/>
-        <w:ind w:left="432" w:hanging="432"/>
+        <w:spacing w:line="276" w:lineRule="auto" w:before="40" w:after="80"/>
+        <w:ind w:left="576" w:hanging="576"/>
       </w:pPr>
       <w:r>
         <w:rPr>
@@ -21656,15 +21996,35 @@
           <w:b w:val="0"/>
           <w:i w:val="0"/>
           <w:color w:val="1A1A1A"/>
-          <w:sz w:val="19"/>
-        </w:rPr>
-        <w:t>[18] Singhal, A. (2001). Modern information retrieval: A brief overview. IEEE Data Engineering Bulletin, 24(4), 35–43.</w:t>
+          <w:sz w:val="20"/>
+        </w:rPr>
+        <w:t xml:space="preserve">Shintani, S. A. (2026). </w:t>
+      </w:r>
+      <w:r>
+        <w:rPr>
+          <w:rFonts w:ascii="Times New Roman" w:hAnsi="Times New Roman"/>
+          <w:b w:val="0"/>
+          <w:i/>
+          <w:color w:val="1A1A1A"/>
+          <w:sz w:val="20"/>
+        </w:rPr>
+        <w:t>Self-hosted lecture-to-quiz: Local LLM MCQ generation with deterministic quality control</w:t>
+      </w:r>
+      <w:r>
+        <w:rPr>
+          <w:rFonts w:ascii="Times New Roman" w:hAnsi="Times New Roman"/>
+          <w:b w:val="0"/>
+          <w:i w:val="0"/>
+          <w:color w:val="1A1A1A"/>
+          <w:sz w:val="20"/>
+        </w:rPr>
+        <w:t>. arXiv:2603.08729.</w:t>
       </w:r>
     </w:p>
     <w:p>
       <w:pPr>
-        <w:spacing w:before="0" w:after="120" w:line="276" w:lineRule="auto"/>
-        <w:ind w:left="432" w:hanging="432"/>
+        <w:spacing w:line="276" w:lineRule="auto" w:before="40" w:after="80"/>
+        <w:ind w:left="576" w:hanging="576"/>
       </w:pPr>
       <w:r>
         <w:rPr>
@@ -21672,15 +22032,35 @@
           <w:b w:val="0"/>
           <w:i w:val="0"/>
           <w:color w:val="1A1A1A"/>
-          <w:sz w:val="19"/>
-        </w:rPr>
-        <w:t>[19] Dougiamas, M., &amp; Taylor, P. C. (2003). Moodle: Using learning communities to create an open source course management system. Proceedings of the ED-MEDIA 2003 Conference, 171–178.</w:t>
+          <w:sz w:val="20"/>
+        </w:rPr>
+        <w:t xml:space="preserve">Singhal, A. (2001). Modern information retrieval: A brief overview. </w:t>
+      </w:r>
+      <w:r>
+        <w:rPr>
+          <w:rFonts w:ascii="Times New Roman" w:hAnsi="Times New Roman"/>
+          <w:b w:val="0"/>
+          <w:i/>
+          <w:color w:val="1A1A1A"/>
+          <w:sz w:val="20"/>
+        </w:rPr>
+        <w:t>IEEE Data Engineering Bulletin</w:t>
+      </w:r>
+      <w:r>
+        <w:rPr>
+          <w:rFonts w:ascii="Times New Roman" w:hAnsi="Times New Roman"/>
+          <w:b w:val="0"/>
+          <w:i w:val="0"/>
+          <w:color w:val="1A1A1A"/>
+          <w:sz w:val="20"/>
+        </w:rPr>
+        <w:t>, 24(4), 35–43.</w:t>
       </w:r>
     </w:p>
     <w:p>
       <w:pPr>
-        <w:spacing w:before="0" w:after="120" w:line="276" w:lineRule="auto"/>
-        <w:ind w:left="432" w:hanging="432"/>
+        <w:spacing w:line="276" w:lineRule="auto" w:before="40" w:after="80"/>
+        <w:ind w:left="576" w:hanging="576"/>
       </w:pPr>
       <w:r>
         <w:rPr>
@@ -21688,15 +22068,35 @@
           <w:b w:val="0"/>
           <w:i w:val="0"/>
           <w:color w:val="1A1A1A"/>
-          <w:sz w:val="19"/>
-        </w:rPr>
-        <w:t>[20] Anderson, L. W., &amp; Krathwohl, D. R. (Eds.). (2001). A taxonomy for learning, teaching, and assessing: A revision of Bloom's taxonomy of educational objectives. Longman.</w:t>
+          <w:sz w:val="20"/>
+        </w:rPr>
+        <w:t xml:space="preserve">Tran, H. V., Nguyen, P. V., Vu, T. T. N., Luong, H. P., &amp; Le, D.-N. (2026). A course-specific agentic RAG chatbot for IT student support: Architecture, local deployment, and preliminary evaluation at Hai Phong University. </w:t>
+      </w:r>
+      <w:r>
+        <w:rPr>
+          <w:rFonts w:ascii="Times New Roman" w:hAnsi="Times New Roman"/>
+          <w:b w:val="0"/>
+          <w:i/>
+          <w:color w:val="1A1A1A"/>
+          <w:sz w:val="20"/>
+        </w:rPr>
+        <w:t>Next-Generation Computing Systems and Technologies</w:t>
+      </w:r>
+      <w:r>
+        <w:rPr>
+          <w:rFonts w:ascii="Times New Roman" w:hAnsi="Times New Roman"/>
+          <w:b w:val="0"/>
+          <w:i w:val="0"/>
+          <w:color w:val="1A1A1A"/>
+          <w:sz w:val="20"/>
+        </w:rPr>
+        <w:t>, 2(2), 21–34. https://doi.org/10.62762/NGCST.2026.601800</w:t>
       </w:r>
     </w:p>
     <w:p>
       <w:pPr>
-        <w:spacing w:before="0" w:after="120" w:line="276" w:lineRule="auto"/>
-        <w:ind w:left="432" w:hanging="432"/>
+        <w:spacing w:line="276" w:lineRule="auto" w:before="40" w:after="80"/>
+        <w:ind w:left="576" w:hanging="576"/>
       </w:pPr>
       <w:r>
         <w:rPr>
@@ -21704,15 +22104,35 @@
           <w:b w:val="0"/>
           <w:i w:val="0"/>
           <w:color w:val="1A1A1A"/>
-          <w:sz w:val="19"/>
-        </w:rPr>
-        <w:t>[21] Ji, Z., Lee, N., Frieske, R., Yu, T., Su, D., Xu, Y., Ishii, E., Yeung, Y. J., Del Luceno, A., &amp; Fung, P. (2023). Survey of hallucination in natural language generation. ACM Computing Surveys, 55(12), 1–38. https://doi.org/10.1145/3571730</w:t>
+          <w:sz w:val="20"/>
+        </w:rPr>
+        <w:t xml:space="preserve">Yao, J., Li, H., Liu, Y., Ray, S., Cheng, Y., Zhang, Q., Du, K., Lu, S., &amp; Jiang, J. (2025). CacheBlend: Fast large language model serving for RAG with cached knowledge fusion. </w:t>
+      </w:r>
+      <w:r>
+        <w:rPr>
+          <w:rFonts w:ascii="Times New Roman" w:hAnsi="Times New Roman"/>
+          <w:b w:val="0"/>
+          <w:i/>
+          <w:color w:val="1A1A1A"/>
+          <w:sz w:val="20"/>
+        </w:rPr>
+        <w:t>Proceedings of the Twentieth European Conference on Computer Systems (EuroSys ’25)</w:t>
+      </w:r>
+      <w:r>
+        <w:rPr>
+          <w:rFonts w:ascii="Times New Roman" w:hAnsi="Times New Roman"/>
+          <w:b w:val="0"/>
+          <w:i w:val="0"/>
+          <w:color w:val="1A1A1A"/>
+          <w:sz w:val="20"/>
+        </w:rPr>
+        <w:t>, 94–109. https://doi.org/10.1145/3689031.3696098</w:t>
       </w:r>
     </w:p>
     <w:p>
       <w:pPr>
-        <w:spacing w:before="0" w:after="120" w:line="276" w:lineRule="auto"/>
-        <w:ind w:left="432" w:hanging="432"/>
+        <w:spacing w:line="276" w:lineRule="auto" w:before="40" w:after="80"/>
+        <w:ind w:left="576" w:hanging="576"/>
       </w:pPr>
       <w:r>
         <w:rPr>
@@ -21720,9 +22140,29 @@
           <w:b w:val="0"/>
           <w:i w:val="0"/>
           <w:color w:val="1A1A1A"/>
-          <w:sz w:val="19"/>
-        </w:rPr>
-        <w:t>[22] Zheng, L., Chiang, W.-L., Sheng, Y., Zhuang, S., Wu, Z., Zhuang, Y., Lin, Z., Li, Z., Li, D., Xing, E. P., Zhang, H., Gonzalez, J. E., &amp; Stoica, I. (2023). Judging LLM-as-a-Judge with MT-Bench and Chatbot Arena. Advances in Neural Information Processing Systems, 36, 46595–46623.</w:t>
+          <w:sz w:val="20"/>
+        </w:rPr>
+        <w:t xml:space="preserve">Zheng, L., Chiang, W.-L., Sheng, Y., Zhuang, S., Wu, Z., Zhuang, Y., Lin, Z., Li, Z., Li, D., Xing, E. P., Zhang, H., Gonzalez, J. E., &amp; Stoica, I. (2023). Judging LLM-as-a-Judge with MT-Bench and Chatbot Arena. </w:t>
+      </w:r>
+      <w:r>
+        <w:rPr>
+          <w:rFonts w:ascii="Times New Roman" w:hAnsi="Times New Roman"/>
+          <w:b w:val="0"/>
+          <w:i/>
+          <w:color w:val="1A1A1A"/>
+          <w:sz w:val="20"/>
+        </w:rPr>
+        <w:t>Advances in Neural Information Processing Systems</w:t>
+      </w:r>
+      <w:r>
+        <w:rPr>
+          <w:rFonts w:ascii="Times New Roman" w:hAnsi="Times New Roman"/>
+          <w:b w:val="0"/>
+          <w:i w:val="0"/>
+          <w:color w:val="1A1A1A"/>
+          <w:sz w:val="20"/>
+        </w:rPr>
+        <w:t>, 36, 46595–46623.</w:t>
       </w:r>
     </w:p>
     <w:sectPr>

</xml_diff>